<commit_message>
Functional Req almost complete
</commit_message>
<xml_diff>
--- a/Task1_Proposal_721242_Chukwudolue_T.docx
+++ b/Task1_Proposal_721242_Chukwudolue_T.docx
@@ -1709,7 +1709,21 @@
                 <w:rStyle w:val="Hyperlink"/>
                 <w:noProof/>
               </w:rPr>
-              <w:t>Functional Requirement</w:t>
+              <w:t>Functio</w:t>
+            </w:r>
+            <w:r>
+              <w:rPr>
+                <w:rStyle w:val="Hyperlink"/>
+                <w:noProof/>
+              </w:rPr>
+              <w:t>n</w:t>
+            </w:r>
+            <w:r>
+              <w:rPr>
+                <w:rStyle w:val="Hyperlink"/>
+                <w:noProof/>
+              </w:rPr>
+              <w:t>al Requirement</w:t>
             </w:r>
             <w:r>
               <w:rPr>
@@ -3915,6 +3929,54 @@
     </w:p>
     <w:p>
       <w:pPr>
+        <w:pStyle w:val="ListParagraph"/>
+        <w:numPr>
+          <w:ilvl w:val="0"/>
+          <w:numId w:val="2"/>
+        </w:numPr>
+        <w:rPr>
+          <w:sz w:val="24"/>
+          <w:szCs w:val="24"/>
+        </w:rPr>
+      </w:pPr>
+      <w:r>
+        <w:rPr>
+          <w:sz w:val="24"/>
+          <w:szCs w:val="24"/>
+        </w:rPr>
+        <w:t>Charles (Customer)- A new</w:t>
+      </w:r>
+      <w:r>
+        <w:rPr>
+          <w:sz w:val="24"/>
+          <w:szCs w:val="24"/>
+        </w:rPr>
+        <w:t xml:space="preserve"> elderly</w:t>
+      </w:r>
+      <w:r>
+        <w:rPr>
+          <w:sz w:val="24"/>
+          <w:szCs w:val="24"/>
+        </w:rPr>
+        <w:t xml:space="preserve"> user whom has never used GLH’s services before.</w:t>
+      </w:r>
+      <w:r>
+        <w:rPr>
+          <w:sz w:val="24"/>
+          <w:szCs w:val="24"/>
+        </w:rPr>
+        <w:t xml:space="preserve"> He was also diagnosed with hypermetropia (Long-sightedness). He cannot see objects that are near him easi</w:t>
+      </w:r>
+      <w:r>
+        <w:rPr>
+          <w:sz w:val="24"/>
+          <w:szCs w:val="24"/>
+        </w:rPr>
+        <w:t>ly.</w:t>
+      </w:r>
+    </w:p>
+    <w:p>
+      <w:pPr>
         <w:pStyle w:val="Heading1"/>
         <w:rPr>
           <w:b/>
@@ -3951,15 +4013,15 @@
         <w:tblLook w:val="04A0" w:firstRow="1" w:lastRow="0" w:firstColumn="1" w:lastColumn="0" w:noHBand="0" w:noVBand="1"/>
       </w:tblPr>
       <w:tblGrid>
-        <w:gridCol w:w="2254"/>
-        <w:gridCol w:w="2254"/>
-        <w:gridCol w:w="2254"/>
+        <w:gridCol w:w="1980"/>
+        <w:gridCol w:w="2268"/>
+        <w:gridCol w:w="2514"/>
         <w:gridCol w:w="2254"/>
       </w:tblGrid>
       <w:tr>
         <w:tc>
           <w:tcPr>
-            <w:tcW w:w="2254" w:type="dxa"/>
+            <w:tcW w:w="1980" w:type="dxa"/>
           </w:tcPr>
           <w:p>
             <w:pPr>
@@ -3978,7 +4040,7 @@
         </w:tc>
         <w:tc>
           <w:tcPr>
-            <w:tcW w:w="2254" w:type="dxa"/>
+            <w:tcW w:w="2268" w:type="dxa"/>
           </w:tcPr>
           <w:p>
             <w:pPr>
@@ -3997,7 +4059,7 @@
         </w:tc>
         <w:tc>
           <w:tcPr>
-            <w:tcW w:w="2254" w:type="dxa"/>
+            <w:tcW w:w="2514" w:type="dxa"/>
           </w:tcPr>
           <w:p>
             <w:pPr>
@@ -4037,7 +4099,7 @@
       <w:tr>
         <w:tc>
           <w:tcPr>
-            <w:tcW w:w="2254" w:type="dxa"/>
+            <w:tcW w:w="1980" w:type="dxa"/>
           </w:tcPr>
           <w:p>
             <w:r>
@@ -4047,13 +4109,17 @@
         </w:tc>
         <w:tc>
           <w:tcPr>
-            <w:tcW w:w="2254" w:type="dxa"/>
-          </w:tcPr>
-          <w:p/>
-        </w:tc>
-        <w:tc>
-          <w:tcPr>
-            <w:tcW w:w="2254" w:type="dxa"/>
+            <w:tcW w:w="2268" w:type="dxa"/>
+          </w:tcPr>
+          <w:p>
+            <w:r>
+              <w:t>As a new user (Charles), I want to be ale to register for an account so that I am able to create orders and manage my personal profile. It should be a redundant system which prevents me from re-entering Invalid Information.</w:t>
+            </w:r>
+          </w:p>
+        </w:tc>
+        <w:tc>
+          <w:tcPr>
+            <w:tcW w:w="2514" w:type="dxa"/>
           </w:tcPr>
           <w:p>
             <w:pPr>
@@ -4127,6 +4193,7 @@
                 <w:sz w:val="23"/>
                 <w:szCs w:val="23"/>
               </w:rPr>
+              <w:lastRenderedPageBreak/>
               <w:t xml:space="preserve">All required fields must be completed. </w:t>
             </w:r>
           </w:p>
@@ -4149,7 +4216,6 @@
                 <w:sz w:val="23"/>
                 <w:szCs w:val="23"/>
               </w:rPr>
-              <w:lastRenderedPageBreak/>
               <w:t xml:space="preserve">Password and confirm password must match. </w:t>
             </w:r>
           </w:p>
@@ -4225,13 +4291,18 @@
           <w:tcPr>
             <w:tcW w:w="2254" w:type="dxa"/>
           </w:tcPr>
-          <w:p/>
+          <w:p>
+            <w:r>
+              <w:lastRenderedPageBreak/>
+              <w:t xml:space="preserve">Account registration is the gateway to accessing all the features offered by GLH. </w:t>
+            </w:r>
+          </w:p>
         </w:tc>
       </w:tr>
       <w:tr>
         <w:tc>
           <w:tcPr>
-            <w:tcW w:w="2254" w:type="dxa"/>
+            <w:tcW w:w="1980" w:type="dxa"/>
           </w:tcPr>
           <w:p>
             <w:r>
@@ -4241,15 +4312,136 @@
         </w:tc>
         <w:tc>
           <w:tcPr>
-            <w:tcW w:w="2254" w:type="dxa"/>
-          </w:tcPr>
-          <w:p/>
-        </w:tc>
-        <w:tc>
-          <w:tcPr>
-            <w:tcW w:w="2254" w:type="dxa"/>
-          </w:tcPr>
-          <w:p/>
+            <w:tcW w:w="2268" w:type="dxa"/>
+          </w:tcPr>
+          <w:p>
+            <w:r>
+              <w:t xml:space="preserve">As a registered </w:t>
+            </w:r>
+            <w:r>
+              <w:t xml:space="preserve">Customer (James) I want to be able to log in to my account so that I can access my profile, create orders, access loyalty rewards and other services provided by the application. </w:t>
+            </w:r>
+          </w:p>
+          <w:p>
+            <w:r>
+              <w:t>As a registered producer (Daniel) I want to be able to Log in to my account and view my dashboard with which I can use to track inventory and manage orders made.</w:t>
+            </w:r>
+          </w:p>
+        </w:tc>
+        <w:tc>
+          <w:tcPr>
+            <w:tcW w:w="2514" w:type="dxa"/>
+          </w:tcPr>
+          <w:p>
+            <w:pPr>
+              <w:pStyle w:val="ListParagraph"/>
+              <w:numPr>
+                <w:ilvl w:val="0"/>
+                <w:numId w:val="5"/>
+              </w:numPr>
+              <w:ind w:right="54"/>
+            </w:pPr>
+            <w:r>
+              <w:t xml:space="preserve">The user should be able to interact with the Login button </w:t>
+            </w:r>
+          </w:p>
+          <w:p>
+            <w:pPr>
+              <w:pStyle w:val="ListParagraph"/>
+              <w:numPr>
+                <w:ilvl w:val="0"/>
+                <w:numId w:val="5"/>
+              </w:numPr>
+              <w:ind w:right="54"/>
+            </w:pPr>
+            <w:r>
+              <w:t xml:space="preserve">The system must allow registered users to log in with their email and password.  </w:t>
+            </w:r>
+          </w:p>
+          <w:p>
+            <w:pPr>
+              <w:pStyle w:val="ListParagraph"/>
+              <w:numPr>
+                <w:ilvl w:val="0"/>
+                <w:numId w:val="5"/>
+              </w:numPr>
+              <w:ind w:right="54"/>
+            </w:pPr>
+            <w:r>
+              <w:t xml:space="preserve">It must prevent access with incorrect credentials as well as display an error message.  </w:t>
+            </w:r>
+          </w:p>
+          <w:p>
+            <w:pPr>
+              <w:pStyle w:val="ListParagraph"/>
+              <w:numPr>
+                <w:ilvl w:val="0"/>
+                <w:numId w:val="5"/>
+              </w:numPr>
+              <w:ind w:right="54"/>
+            </w:pPr>
+            <w:r>
+              <w:t xml:space="preserve">There must be a forgot password function to reset credentials via email </w:t>
+            </w:r>
+          </w:p>
+          <w:p>
+            <w:pPr>
+              <w:pStyle w:val="ListParagraph"/>
+              <w:numPr>
+                <w:ilvl w:val="0"/>
+                <w:numId w:val="5"/>
+              </w:numPr>
+              <w:ind w:right="54"/>
+            </w:pPr>
+            <w:r>
+              <w:lastRenderedPageBreak/>
+              <w:t>Upon successful login, the user should be directed to the main home page.</w:t>
+            </w:r>
+          </w:p>
+          <w:p>
+            <w:pPr>
+              <w:pStyle w:val="ListParagraph"/>
+              <w:numPr>
+                <w:ilvl w:val="0"/>
+                <w:numId w:val="5"/>
+              </w:numPr>
+              <w:ind w:right="54"/>
+            </w:pPr>
+            <w:r>
+              <w:t>The page must comply with the Web</w:t>
+            </w:r>
+            <w:r>
+              <w:t xml:space="preserve"> </w:t>
+            </w:r>
+            <w:r>
+              <w:t>Accessibility</w:t>
+            </w:r>
+            <w:r>
+              <w:t xml:space="preserve"> </w:t>
+            </w:r>
+            <w:r>
+              <w:t>Guidelines</w:t>
+            </w:r>
+          </w:p>
+          <w:p>
+            <w:pPr>
+              <w:pStyle w:val="ListParagraph"/>
+              <w:numPr>
+                <w:ilvl w:val="0"/>
+                <w:numId w:val="5"/>
+              </w:numPr>
+              <w:ind w:right="54"/>
+            </w:pPr>
+            <w:r>
+              <w:t>(WCAG), e.g., Contrast, Text Size, Text-</w:t>
+            </w:r>
+            <w:r>
+              <w:t>to speech</w:t>
+            </w:r>
+            <w:r>
+              <w:t>.</w:t>
+            </w:r>
+          </w:p>
         </w:tc>
         <w:tc>
           <w:tcPr>
@@ -4261,25 +4453,97 @@
       <w:tr>
         <w:tc>
           <w:tcPr>
-            <w:tcW w:w="2254" w:type="dxa"/>
-          </w:tcPr>
-          <w:p>
-            <w:r>
-              <w:t xml:space="preserve">There should be an easily accessible order management system present </w:t>
-            </w:r>
-          </w:p>
-        </w:tc>
-        <w:tc>
-          <w:tcPr>
-            <w:tcW w:w="2254" w:type="dxa"/>
-          </w:tcPr>
-          <w:p/>
-        </w:tc>
-        <w:tc>
-          <w:tcPr>
-            <w:tcW w:w="2254" w:type="dxa"/>
-          </w:tcPr>
-          <w:p/>
+            <w:tcW w:w="1980" w:type="dxa"/>
+          </w:tcPr>
+          <w:p>
+            <w:r>
+              <w:t>There should be an easily accessible order management system present</w:t>
+            </w:r>
+            <w:r>
+              <w:t>.</w:t>
+            </w:r>
+          </w:p>
+        </w:tc>
+        <w:tc>
+          <w:tcPr>
+            <w:tcW w:w="2268" w:type="dxa"/>
+          </w:tcPr>
+          <w:p>
+            <w:r>
+              <w:t>As a customer whether new or returning (James &amp; Charles) I want to be able to create, edit or delete the orders I create</w:t>
+            </w:r>
+            <w:r>
+              <w:t xml:space="preserve"> as well as track the status of the order I created.</w:t>
+            </w:r>
+          </w:p>
+        </w:tc>
+        <w:tc>
+          <w:tcPr>
+            <w:tcW w:w="2514" w:type="dxa"/>
+          </w:tcPr>
+          <w:p>
+            <w:pPr>
+              <w:pStyle w:val="ListParagraph"/>
+              <w:numPr>
+                <w:ilvl w:val="0"/>
+                <w:numId w:val="7"/>
+              </w:numPr>
+            </w:pPr>
+            <w:r>
+              <w:t>The User should be able to create an order after clicking on the products they wish to buy</w:t>
+            </w:r>
+          </w:p>
+          <w:p>
+            <w:pPr>
+              <w:pStyle w:val="ListParagraph"/>
+              <w:numPr>
+                <w:ilvl w:val="0"/>
+                <w:numId w:val="7"/>
+              </w:numPr>
+            </w:pPr>
+            <w:r>
+              <w:t>They should be able to access their orders page within 2 clicks from any page on the website</w:t>
+            </w:r>
+          </w:p>
+          <w:p>
+            <w:pPr>
+              <w:pStyle w:val="ListParagraph"/>
+              <w:numPr>
+                <w:ilvl w:val="0"/>
+                <w:numId w:val="7"/>
+              </w:numPr>
+            </w:pPr>
+            <w:r>
+              <w:t>Clicking on an order should display a more detailed view of the order, showing more information.</w:t>
+            </w:r>
+          </w:p>
+          <w:p>
+            <w:pPr>
+              <w:pStyle w:val="ListParagraph"/>
+              <w:numPr>
+                <w:ilvl w:val="0"/>
+                <w:numId w:val="7"/>
+              </w:numPr>
+            </w:pPr>
+            <w:r>
+              <w:t>The user should be able to edit their order before it is confirmed.</w:t>
+            </w:r>
+          </w:p>
+          <w:p>
+            <w:pPr>
+              <w:pStyle w:val="ListParagraph"/>
+              <w:numPr>
+                <w:ilvl w:val="0"/>
+                <w:numId w:val="7"/>
+              </w:numPr>
+            </w:pPr>
+            <w:r>
+              <w:t>The user should be able to delete their order before it is confirmed</w:t>
+            </w:r>
+            <w:r>
+              <w:t>.</w:t>
+            </w:r>
+          </w:p>
         </w:tc>
         <w:tc>
           <w:tcPr>
@@ -4291,25 +4555,148 @@
       <w:tr>
         <w:tc>
           <w:tcPr>
-            <w:tcW w:w="2254" w:type="dxa"/>
-          </w:tcPr>
-          <w:p>
-            <w:r>
-              <w:t>There should be a section which provides information about producers, their methods and benefits of purchasing locally</w:t>
-            </w:r>
-          </w:p>
-        </w:tc>
-        <w:tc>
-          <w:tcPr>
-            <w:tcW w:w="2254" w:type="dxa"/>
-          </w:tcPr>
-          <w:p/>
-        </w:tc>
-        <w:tc>
-          <w:tcPr>
-            <w:tcW w:w="2254" w:type="dxa"/>
-          </w:tcPr>
-          <w:p/>
+            <w:tcW w:w="1980" w:type="dxa"/>
+          </w:tcPr>
+          <w:p>
+            <w:r>
+              <w:t xml:space="preserve">There should be a section which provides information about producers, their methods and </w:t>
+            </w:r>
+            <w:r>
+              <w:lastRenderedPageBreak/>
+              <w:t>benefits of purchasing locally</w:t>
+            </w:r>
+          </w:p>
+        </w:tc>
+        <w:tc>
+          <w:tcPr>
+            <w:tcW w:w="2268" w:type="dxa"/>
+          </w:tcPr>
+          <w:p>
+            <w:r>
+              <w:lastRenderedPageBreak/>
+              <w:t xml:space="preserve">As a health-conscious consumer (James) I want the application to give me information on where my food comes from and how it is processed so that I </w:t>
+            </w:r>
+            <w:r>
+              <w:lastRenderedPageBreak/>
+              <w:t>can make appropriate decisions towards my diet.</w:t>
+            </w:r>
+          </w:p>
+          <w:p>
+            <w:r>
+              <w:t>As a new customer (Charles) I want the application to give me relevant information on why it is beneficial to purchase locally made products as well as inform me on new products which I have no knowledge on.</w:t>
+            </w:r>
+          </w:p>
+        </w:tc>
+        <w:tc>
+          <w:tcPr>
+            <w:tcW w:w="2514" w:type="dxa"/>
+          </w:tcPr>
+          <w:p>
+            <w:pPr>
+              <w:pStyle w:val="ListParagraph"/>
+              <w:numPr>
+                <w:ilvl w:val="0"/>
+                <w:numId w:val="7"/>
+              </w:numPr>
+              <w:rPr>
+                <w:rFonts w:cstheme="minorHAnsi"/>
+              </w:rPr>
+            </w:pPr>
+            <w:r>
+              <w:rPr>
+                <w:rFonts w:cstheme="minorHAnsi"/>
+                <w:color w:val="0F1115"/>
+                <w:shd w:val="clear" w:color="auto" w:fill="FFFFFF"/>
+              </w:rPr>
+              <w:lastRenderedPageBreak/>
+              <w:t xml:space="preserve">The website must have a dedicated "Our Producers" or "Meet the Farmers" page accessible from </w:t>
+            </w:r>
+            <w:r>
+              <w:rPr>
+                <w:rFonts w:cstheme="minorHAnsi"/>
+                <w:color w:val="0F1115"/>
+                <w:shd w:val="clear" w:color="auto" w:fill="FFFFFF"/>
+              </w:rPr>
+              <w:lastRenderedPageBreak/>
+              <w:t>the main navigation menu.</w:t>
+            </w:r>
+          </w:p>
+          <w:p>
+            <w:pPr>
+              <w:pStyle w:val="ListParagraph"/>
+              <w:numPr>
+                <w:ilvl w:val="0"/>
+                <w:numId w:val="7"/>
+              </w:numPr>
+              <w:rPr>
+                <w:rFonts w:cstheme="minorHAnsi"/>
+              </w:rPr>
+            </w:pPr>
+            <w:r>
+              <w:rPr>
+                <w:rFonts w:cstheme="minorHAnsi"/>
+                <w:color w:val="0F1115"/>
+                <w:shd w:val="clear" w:color="auto" w:fill="FFFFFF"/>
+              </w:rPr>
+              <w:t>Each producer profile must contain a photo, and a description of their farming methods (e.g., Organic, Free-Range</w:t>
+            </w:r>
+            <w:r>
+              <w:rPr>
+                <w:rFonts w:cstheme="minorHAnsi"/>
+                <w:color w:val="0F1115"/>
+                <w:shd w:val="clear" w:color="auto" w:fill="FFFFFF"/>
+              </w:rPr>
+              <w:t xml:space="preserve"> or what part of farming they expertise in</w:t>
+            </w:r>
+            <w:r>
+              <w:rPr>
+                <w:rFonts w:cstheme="minorHAnsi"/>
+                <w:color w:val="0F1115"/>
+                <w:shd w:val="clear" w:color="auto" w:fill="FFFFFF"/>
+              </w:rPr>
+              <w:t>).</w:t>
+            </w:r>
+          </w:p>
+          <w:p>
+            <w:pPr>
+              <w:pStyle w:val="ListParagraph"/>
+              <w:numPr>
+                <w:ilvl w:val="0"/>
+                <w:numId w:val="7"/>
+              </w:numPr>
+              <w:rPr>
+                <w:rFonts w:cstheme="minorHAnsi"/>
+              </w:rPr>
+            </w:pPr>
+            <w:r>
+              <w:rPr>
+                <w:rFonts w:cstheme="minorHAnsi"/>
+                <w:color w:val="0F1115"/>
+                <w:shd w:val="clear" w:color="auto" w:fill="FFFFFF"/>
+              </w:rPr>
+              <w:t>The section must clearly list the benefits of buying locally (e.g., Lower Carbon Footprint, Fresher Produce).</w:t>
+            </w:r>
+          </w:p>
+          <w:p>
+            <w:pPr>
+              <w:pStyle w:val="ListParagraph"/>
+              <w:numPr>
+                <w:ilvl w:val="0"/>
+                <w:numId w:val="7"/>
+              </w:numPr>
+              <w:rPr>
+                <w:rFonts w:cstheme="minorHAnsi"/>
+              </w:rPr>
+            </w:pPr>
+            <w:r>
+              <w:rPr>
+                <w:rFonts w:cstheme="minorHAnsi"/>
+                <w:color w:val="0F1115"/>
+                <w:shd w:val="clear" w:color="auto" w:fill="FFFFFF"/>
+              </w:rPr>
+              <w:t>If a user clicks on a producer's name next to a product, they should be taken directly to that producer's profile page.</w:t>
+            </w:r>
+          </w:p>
         </w:tc>
         <w:tc>
           <w:tcPr>
@@ -4321,7 +4708,7 @@
       <w:tr>
         <w:tc>
           <w:tcPr>
-            <w:tcW w:w="2254" w:type="dxa"/>
+            <w:tcW w:w="1980" w:type="dxa"/>
           </w:tcPr>
           <w:p>
             <w:r>
@@ -4331,15 +4718,214 @@
         </w:tc>
         <w:tc>
           <w:tcPr>
-            <w:tcW w:w="2254" w:type="dxa"/>
-          </w:tcPr>
-          <w:p/>
-        </w:tc>
-        <w:tc>
-          <w:tcPr>
-            <w:tcW w:w="2254" w:type="dxa"/>
-          </w:tcPr>
-          <w:p/>
+            <w:tcW w:w="2268" w:type="dxa"/>
+          </w:tcPr>
+          <w:p>
+            <w:r>
+              <w:t>As a producer (Daniel), I want a private dashboard so that I can manage my inventory and see incoming order</w:t>
+            </w:r>
+            <w:r>
+              <w:t xml:space="preserve">s made by customers </w:t>
+            </w:r>
+          </w:p>
+        </w:tc>
+        <w:tc>
+          <w:tcPr>
+            <w:tcW w:w="2514" w:type="dxa"/>
+          </w:tcPr>
+          <w:p>
+            <w:pPr>
+              <w:pStyle w:val="ListParagraph"/>
+              <w:numPr>
+                <w:ilvl w:val="0"/>
+                <w:numId w:val="7"/>
+              </w:numPr>
+              <w:rPr>
+                <w:rFonts w:cstheme="minorHAnsi"/>
+              </w:rPr>
+            </w:pPr>
+            <w:r>
+              <w:rPr>
+                <w:rFonts w:cstheme="minorHAnsi"/>
+                <w:color w:val="0F1115"/>
+                <w:shd w:val="clear" w:color="auto" w:fill="FFFFFF"/>
+              </w:rPr>
+              <w:t>The login system must differentiate between 'Customer' and 'Producer' roles, redirecting producers to a specific dashboard URL that customers cannot access.</w:t>
+            </w:r>
+          </w:p>
+          <w:p>
+            <w:pPr>
+              <w:pStyle w:val="ListParagraph"/>
+              <w:numPr>
+                <w:ilvl w:val="0"/>
+                <w:numId w:val="7"/>
+              </w:numPr>
+              <w:rPr>
+                <w:rFonts w:cstheme="minorHAnsi"/>
+              </w:rPr>
+            </w:pPr>
+            <w:r>
+              <w:rPr>
+                <w:rFonts w:cstheme="minorHAnsi"/>
+                <w:color w:val="0F1115"/>
+                <w:shd w:val="clear" w:color="auto" w:fill="FFFFFF"/>
+              </w:rPr>
+              <w:t>The dashboard must display a real-time list of all incoming orders for that specific producer's products.</w:t>
+            </w:r>
+          </w:p>
+          <w:p>
+            <w:pPr>
+              <w:pStyle w:val="ListParagraph"/>
+              <w:numPr>
+                <w:ilvl w:val="0"/>
+                <w:numId w:val="7"/>
+              </w:numPr>
+              <w:rPr>
+                <w:rFonts w:cstheme="minorHAnsi"/>
+              </w:rPr>
+            </w:pPr>
+            <w:r>
+              <w:rPr>
+                <w:rFonts w:cstheme="minorHAnsi"/>
+                <w:color w:val="0F1115"/>
+                <w:shd w:val="clear" w:color="auto" w:fill="FFFFFF"/>
+              </w:rPr>
+              <w:lastRenderedPageBreak/>
+              <w:t>It must allow the producer to update stock quantities, mark items as "Out of Stock," or adjust prices which instantly update on the customer</w:t>
+            </w:r>
+            <w:r>
+              <w:rPr>
+                <w:rFonts w:cstheme="minorHAnsi"/>
+                <w:color w:val="0F1115"/>
+                <w:shd w:val="clear" w:color="auto" w:fill="FFFFFF"/>
+              </w:rPr>
+              <w:t>’s view</w:t>
+            </w:r>
+            <w:r>
+              <w:rPr>
+                <w:rFonts w:cstheme="minorHAnsi"/>
+                <w:color w:val="0F1115"/>
+                <w:shd w:val="clear" w:color="auto" w:fill="FFFFFF"/>
+              </w:rPr>
+              <w:t>.</w:t>
+            </w:r>
+          </w:p>
+          <w:p>
+            <w:pPr>
+              <w:pStyle w:val="ListParagraph"/>
+              <w:numPr>
+                <w:ilvl w:val="0"/>
+                <w:numId w:val="7"/>
+              </w:numPr>
+              <w:rPr>
+                <w:rFonts w:cstheme="minorHAnsi"/>
+              </w:rPr>
+            </w:pPr>
+            <w:r>
+              <w:rPr>
+                <w:rFonts w:cstheme="minorHAnsi"/>
+                <w:color w:val="0F1115"/>
+                <w:shd w:val="clear" w:color="auto" w:fill="FFFFFF"/>
+              </w:rPr>
+              <w:t xml:space="preserve">The dashboard must provide a simple interface to mark orders as </w:t>
+            </w:r>
+            <w:r>
+              <w:rPr>
+                <w:rFonts w:cstheme="minorHAnsi"/>
+                <w:color w:val="0F1115"/>
+                <w:shd w:val="clear" w:color="auto" w:fill="FFFFFF"/>
+              </w:rPr>
+              <w:t>“</w:t>
+            </w:r>
+            <w:r>
+              <w:rPr>
+                <w:rFonts w:cstheme="minorHAnsi"/>
+                <w:color w:val="0F1115"/>
+                <w:shd w:val="clear" w:color="auto" w:fill="FFFFFF"/>
+              </w:rPr>
+              <w:t>Confirmed,</w:t>
+            </w:r>
+            <w:r>
+              <w:rPr>
+                <w:rFonts w:cstheme="minorHAnsi"/>
+                <w:color w:val="0F1115"/>
+                <w:shd w:val="clear" w:color="auto" w:fill="FFFFFF"/>
+              </w:rPr>
+              <w:t>”</w:t>
+            </w:r>
+            <w:r>
+              <w:rPr>
+                <w:rFonts w:cstheme="minorHAnsi"/>
+                <w:color w:val="0F1115"/>
+                <w:shd w:val="clear" w:color="auto" w:fill="FFFFFF"/>
+              </w:rPr>
+              <w:t xml:space="preserve"> </w:t>
+            </w:r>
+            <w:r>
+              <w:rPr>
+                <w:rFonts w:cstheme="minorHAnsi"/>
+                <w:color w:val="0F1115"/>
+                <w:shd w:val="clear" w:color="auto" w:fill="FFFFFF"/>
+              </w:rPr>
+              <w:t>“</w:t>
+            </w:r>
+            <w:r>
+              <w:rPr>
+                <w:rFonts w:cstheme="minorHAnsi"/>
+                <w:color w:val="0F1115"/>
+                <w:shd w:val="clear" w:color="auto" w:fill="FFFFFF"/>
+              </w:rPr>
+              <w:t>Packed,</w:t>
+            </w:r>
+            <w:r>
+              <w:rPr>
+                <w:rFonts w:cstheme="minorHAnsi"/>
+                <w:color w:val="0F1115"/>
+                <w:shd w:val="clear" w:color="auto" w:fill="FFFFFF"/>
+              </w:rPr>
+              <w:t>”</w:t>
+            </w:r>
+            <w:r>
+              <w:rPr>
+                <w:rFonts w:cstheme="minorHAnsi"/>
+                <w:color w:val="0F1115"/>
+                <w:shd w:val="clear" w:color="auto" w:fill="FFFFFF"/>
+              </w:rPr>
+              <w:t xml:space="preserve"> or </w:t>
+            </w:r>
+            <w:r>
+              <w:rPr>
+                <w:rFonts w:cstheme="minorHAnsi"/>
+                <w:color w:val="0F1115"/>
+                <w:shd w:val="clear" w:color="auto" w:fill="FFFFFF"/>
+              </w:rPr>
+              <w:t>“</w:t>
+            </w:r>
+            <w:r>
+              <w:rPr>
+                <w:rFonts w:cstheme="minorHAnsi"/>
+                <w:color w:val="0F1115"/>
+                <w:shd w:val="clear" w:color="auto" w:fill="FFFFFF"/>
+              </w:rPr>
+              <w:t>Shipped,</w:t>
+            </w:r>
+            <w:r>
+              <w:rPr>
+                <w:rFonts w:cstheme="minorHAnsi"/>
+                <w:color w:val="0F1115"/>
+                <w:shd w:val="clear" w:color="auto" w:fill="FFFFFF"/>
+              </w:rPr>
+              <w:t>”</w:t>
+            </w:r>
+            <w:r>
+              <w:rPr>
+                <w:rFonts w:cstheme="minorHAnsi"/>
+                <w:color w:val="0F1115"/>
+                <w:shd w:val="clear" w:color="auto" w:fill="FFFFFF"/>
+              </w:rPr>
+              <w:t xml:space="preserve"> which updates the tracking status for the customer.</w:t>
+            </w:r>
+          </w:p>
         </w:tc>
         <w:tc>
           <w:tcPr>
@@ -4351,7 +4937,7 @@
       <w:tr>
         <w:tc>
           <w:tcPr>
-            <w:tcW w:w="2254" w:type="dxa"/>
+            <w:tcW w:w="1980" w:type="dxa"/>
           </w:tcPr>
           <w:p>
             <w:r>
@@ -4361,15 +4947,69 @@
         </w:tc>
         <w:tc>
           <w:tcPr>
-            <w:tcW w:w="2254" w:type="dxa"/>
-          </w:tcPr>
-          <w:p/>
-        </w:tc>
-        <w:tc>
-          <w:tcPr>
-            <w:tcW w:w="2254" w:type="dxa"/>
-          </w:tcPr>
-          <w:p/>
+            <w:tcW w:w="2268" w:type="dxa"/>
+          </w:tcPr>
+          <w:p>
+            <w:r>
+              <w:t>As a customer (James &amp; Charles), I want to be able to choose a delivery timeslot which is convenient to me and fits my schedule.</w:t>
+            </w:r>
+          </w:p>
+        </w:tc>
+        <w:tc>
+          <w:tcPr>
+            <w:tcW w:w="2514" w:type="dxa"/>
+          </w:tcPr>
+          <w:p>
+            <w:pPr>
+              <w:pStyle w:val="ListParagraph"/>
+              <w:numPr>
+                <w:ilvl w:val="0"/>
+                <w:numId w:val="8"/>
+              </w:numPr>
+            </w:pPr>
+            <w:r>
+              <w:t>At checkout, after selecting delivery, a mini calendar view must appear.</w:t>
+            </w:r>
+          </w:p>
+          <w:p>
+            <w:pPr>
+              <w:pStyle w:val="ListParagraph"/>
+              <w:numPr>
+                <w:ilvl w:val="0"/>
+                <w:numId w:val="8"/>
+              </w:numPr>
+            </w:pPr>
+            <w:r>
+              <w:t>The calendar must only show valid dates and reasonable times for deliveries.</w:t>
+            </w:r>
+          </w:p>
+          <w:p>
+            <w:pPr>
+              <w:pStyle w:val="ListParagraph"/>
+              <w:numPr>
+                <w:ilvl w:val="0"/>
+                <w:numId w:val="8"/>
+              </w:numPr>
+            </w:pPr>
+            <w:r>
+              <w:t>After selecting a date, the estimated delivery date must be displayed next to the order on the order page.</w:t>
+            </w:r>
+          </w:p>
+          <w:p>
+            <w:pPr>
+              <w:pStyle w:val="ListParagraph"/>
+              <w:numPr>
+                <w:ilvl w:val="0"/>
+                <w:numId w:val="8"/>
+              </w:numPr>
+            </w:pPr>
+            <w:r>
+              <w:t>The system must prevent double booking</w:t>
+            </w:r>
+            <w:r>
+              <w:t xml:space="preserve"> of delivery time slots.</w:t>
+            </w:r>
+          </w:p>
         </w:tc>
         <w:tc>
           <w:tcPr>
@@ -4381,26 +5021,95 @@
       <w:tr>
         <w:tc>
           <w:tcPr>
-            <w:tcW w:w="2254" w:type="dxa"/>
-          </w:tcPr>
-          <w:p>
+            <w:tcW w:w="1980" w:type="dxa"/>
+          </w:tcPr>
+          <w:p>
+            <w:r>
+              <w:t xml:space="preserve">The User should be able to track the status of their order </w:t>
+            </w:r>
+          </w:p>
+        </w:tc>
+        <w:tc>
+          <w:tcPr>
+            <w:tcW w:w="2268" w:type="dxa"/>
+          </w:tcPr>
+          <w:p>
+            <w:r>
+              <w:t>As a customer (James and Charles), I want to see the real time status of my order so that I may have a sound mind as well as know when to expect the order.</w:t>
+            </w:r>
+          </w:p>
+        </w:tc>
+        <w:tc>
+          <w:tcPr>
+            <w:tcW w:w="2514" w:type="dxa"/>
+          </w:tcPr>
+          <w:p>
+            <w:pPr>
+              <w:pStyle w:val="ListParagraph"/>
+              <w:numPr>
+                <w:ilvl w:val="0"/>
+                <w:numId w:val="7"/>
+              </w:numPr>
+            </w:pPr>
+            <w:r>
+              <w:t xml:space="preserve">The Orders page must display a visual status indicator in from of the purchased item </w:t>
+            </w:r>
+            <w:r>
+              <w:t>i.e., O</w:t>
+            </w:r>
+            <w:r>
+              <w:t xml:space="preserve">rder </w:t>
+            </w:r>
+            <w:r>
+              <w:t xml:space="preserve">Pending, </w:t>
+            </w:r>
             <w:r>
               <w:lastRenderedPageBreak/>
-              <w:t xml:space="preserve">The User should be able to track the status of their order </w:t>
-            </w:r>
-          </w:p>
-        </w:tc>
-        <w:tc>
-          <w:tcPr>
-            <w:tcW w:w="2254" w:type="dxa"/>
-          </w:tcPr>
-          <w:p/>
-        </w:tc>
-        <w:tc>
-          <w:tcPr>
-            <w:tcW w:w="2254" w:type="dxa"/>
-          </w:tcPr>
-          <w:p/>
+              <w:t>Delayed</w:t>
+            </w:r>
+            <w:r>
+              <w:t xml:space="preserve">, </w:t>
+            </w:r>
+            <w:r>
+              <w:t>Delivered etc.</w:t>
+            </w:r>
+          </w:p>
+          <w:p>
+            <w:pPr>
+              <w:pStyle w:val="ListParagraph"/>
+              <w:numPr>
+                <w:ilvl w:val="0"/>
+                <w:numId w:val="7"/>
+              </w:numPr>
+            </w:pPr>
+            <w:r>
+              <w:t>The user should get an email or notification when their Item has been delivered or is Out for Delivery.</w:t>
+            </w:r>
+          </w:p>
+          <w:p>
+            <w:pPr>
+              <w:pStyle w:val="ListParagraph"/>
+              <w:numPr>
+                <w:ilvl w:val="0"/>
+                <w:numId w:val="7"/>
+              </w:numPr>
+            </w:pPr>
+            <w:r>
+              <w:t>The tracking status must be consistent across the customer view, the producer dashboard and the manager view.</w:t>
+            </w:r>
+          </w:p>
+          <w:p>
+            <w:pPr>
+              <w:pStyle w:val="ListParagraph"/>
+              <w:numPr>
+                <w:ilvl w:val="0"/>
+                <w:numId w:val="7"/>
+              </w:numPr>
+            </w:pPr>
+            <w:r>
+              <w:t xml:space="preserve">If an order is delayed, there should be an updated Estimated delivery time. The customer should be notified with the reason if available  </w:t>
+            </w:r>
+          </w:p>
         </w:tc>
         <w:tc>
           <w:tcPr>
@@ -4412,7 +5121,7 @@
       <w:tr>
         <w:tc>
           <w:tcPr>
-            <w:tcW w:w="2254" w:type="dxa"/>
+            <w:tcW w:w="1980" w:type="dxa"/>
           </w:tcPr>
           <w:p>
             <w:r>
@@ -4422,15 +5131,97 @@
         </w:tc>
         <w:tc>
           <w:tcPr>
-            <w:tcW w:w="2254" w:type="dxa"/>
-          </w:tcPr>
-          <w:p/>
-        </w:tc>
-        <w:tc>
-          <w:tcPr>
-            <w:tcW w:w="2254" w:type="dxa"/>
-          </w:tcPr>
-          <w:p/>
+            <w:tcW w:w="2268" w:type="dxa"/>
+          </w:tcPr>
+          <w:p>
+            <w:r>
+              <w:t>As a regular customer (James) I want to be able to view my loyalty points or rewards since I have been a regular customer for a long period of time. I wish to feel valued for the commitment and loyalty I have shown.</w:t>
+            </w:r>
+          </w:p>
+        </w:tc>
+        <w:tc>
+          <w:tcPr>
+            <w:tcW w:w="2514" w:type="dxa"/>
+          </w:tcPr>
+          <w:p>
+            <w:pPr>
+              <w:pStyle w:val="ListParagraph"/>
+              <w:numPr>
+                <w:ilvl w:val="0"/>
+                <w:numId w:val="7"/>
+              </w:numPr>
+            </w:pPr>
+            <w:r>
+              <w:t xml:space="preserve">There must be a visible </w:t>
+            </w:r>
+            <w:r>
+              <w:t>“</w:t>
+            </w:r>
+            <w:r>
+              <w:t>Loyalty</w:t>
+            </w:r>
+            <w:r>
+              <w:t>”</w:t>
+            </w:r>
+            <w:r>
+              <w:t xml:space="preserve"> </w:t>
+            </w:r>
+            <w:r>
+              <w:t>or “Rewards”</w:t>
+            </w:r>
+          </w:p>
+          <w:p>
+            <w:pPr>
+              <w:pStyle w:val="ListParagraph"/>
+              <w:numPr>
+                <w:ilvl w:val="0"/>
+                <w:numId w:val="7"/>
+              </w:numPr>
+            </w:pPr>
+            <w:r>
+              <w:t>section in the user’s account.</w:t>
+            </w:r>
+          </w:p>
+          <w:p>
+            <w:pPr>
+              <w:pStyle w:val="ListParagraph"/>
+              <w:numPr>
+                <w:ilvl w:val="0"/>
+                <w:numId w:val="7"/>
+              </w:numPr>
+            </w:pPr>
+            <w:r>
+              <w:t xml:space="preserve">The system must display how many accumulated points they have </w:t>
+            </w:r>
+          </w:p>
+          <w:p>
+            <w:pPr>
+              <w:pStyle w:val="ListParagraph"/>
+              <w:numPr>
+                <w:ilvl w:val="0"/>
+                <w:numId w:val="7"/>
+              </w:numPr>
+            </w:pPr>
+            <w:r>
+              <w:t>The rewards / checkout page must show what applicable discount they can get with their accumulated points.</w:t>
+            </w:r>
+          </w:p>
+          <w:p>
+            <w:pPr>
+              <w:pStyle w:val="ListParagraph"/>
+              <w:numPr>
+                <w:ilvl w:val="0"/>
+                <w:numId w:val="7"/>
+              </w:numPr>
+            </w:pPr>
+            <w:r>
+              <w:t xml:space="preserve">The points balance must automatically update once an </w:t>
+            </w:r>
+            <w:r>
+              <w:lastRenderedPageBreak/>
+              <w:t xml:space="preserve">order status has been marked as “Delivered” </w:t>
+            </w:r>
+          </w:p>
         </w:tc>
         <w:tc>
           <w:tcPr>
@@ -4442,7 +5233,7 @@
       <w:tr>
         <w:tc>
           <w:tcPr>
-            <w:tcW w:w="2254" w:type="dxa"/>
+            <w:tcW w:w="1980" w:type="dxa"/>
           </w:tcPr>
           <w:p>
             <w:r>
@@ -4452,14 +5243,90 @@
         </w:tc>
         <w:tc>
           <w:tcPr>
-            <w:tcW w:w="2254" w:type="dxa"/>
-          </w:tcPr>
-          <w:p/>
-        </w:tc>
-        <w:tc>
-          <w:tcPr>
-            <w:tcW w:w="2254" w:type="dxa"/>
-          </w:tcPr>
+            <w:tcW w:w="2268" w:type="dxa"/>
+          </w:tcPr>
+          <w:p>
+            <w:r>
+              <w:t>As a user with Long-</w:t>
+            </w:r>
+            <w:r>
+              <w:t>sightedness (</w:t>
+            </w:r>
+            <w:r>
+              <w:t>Charles) I want the option for larger and bolder texts as well as a text-to-speech option so that I may be able to access and use the application independently.</w:t>
+            </w:r>
+          </w:p>
+        </w:tc>
+        <w:tc>
+          <w:tcPr>
+            <w:tcW w:w="2514" w:type="dxa"/>
+          </w:tcPr>
+          <w:p>
+            <w:pPr>
+              <w:pStyle w:val="ListParagraph"/>
+              <w:numPr>
+                <w:ilvl w:val="0"/>
+                <w:numId w:val="6"/>
+              </w:numPr>
+            </w:pPr>
+            <w:r>
+              <w:t xml:space="preserve">The app must support screen readers and keyboard navigation. </w:t>
+            </w:r>
+          </w:p>
+          <w:p>
+            <w:pPr>
+              <w:pStyle w:val="ListParagraph"/>
+              <w:numPr>
+                <w:ilvl w:val="0"/>
+                <w:numId w:val="6"/>
+              </w:numPr>
+            </w:pPr>
+            <w:r>
+              <w:t xml:space="preserve">Text must be resizable without breaking the layout. </w:t>
+            </w:r>
+          </w:p>
+          <w:p>
+            <w:pPr>
+              <w:pStyle w:val="ListParagraph"/>
+              <w:numPr>
+                <w:ilvl w:val="0"/>
+                <w:numId w:val="6"/>
+              </w:numPr>
+            </w:pPr>
+            <w:r>
+              <w:t>High contrast mode must be available.</w:t>
+            </w:r>
+          </w:p>
+          <w:p>
+            <w:pPr>
+              <w:pStyle w:val="ListParagraph"/>
+              <w:numPr>
+                <w:ilvl w:val="0"/>
+                <w:numId w:val="6"/>
+              </w:numPr>
+            </w:pPr>
+            <w:r>
+              <w:t>All images must have alt text.</w:t>
+            </w:r>
+          </w:p>
+          <w:p>
+            <w:pPr>
+              <w:pStyle w:val="ListParagraph"/>
+              <w:numPr>
+                <w:ilvl w:val="0"/>
+                <w:numId w:val="6"/>
+              </w:numPr>
+            </w:pPr>
+            <w:r>
+              <w:t xml:space="preserve"> </w:t>
+            </w:r>
+            <w:r>
+              <w:t>Voice commands should be supported where possible</w:t>
+            </w:r>
+            <w:r>
+              <w:t>.</w:t>
+            </w:r>
+          </w:p>
           <w:p/>
         </w:tc>
         <w:tc>
@@ -4493,6 +5360,2488 @@
       </w:r>
       <w:bookmarkEnd w:id="14"/>
     </w:p>
+    <w:tbl>
+      <w:tblPr>
+        <w:tblStyle w:val="TableGrid0"/>
+        <w:tblW w:w="8238" w:type="dxa"/>
+        <w:tblInd w:w="5" w:type="dxa"/>
+        <w:tblCellMar>
+          <w:top w:w="53" w:type="dxa"/>
+          <w:left w:w="108" w:type="dxa"/>
+          <w:bottom w:w="5" w:type="dxa"/>
+          <w:right w:w="68" w:type="dxa"/>
+        </w:tblCellMar>
+        <w:tblLook w:val="04A0" w:firstRow="1" w:lastRow="0" w:firstColumn="1" w:lastColumn="0" w:noHBand="0" w:noVBand="1"/>
+      </w:tblPr>
+      <w:tblGrid>
+        <w:gridCol w:w="2743"/>
+        <w:gridCol w:w="2746"/>
+        <w:gridCol w:w="2749"/>
+      </w:tblGrid>
+      <w:tr>
+        <w:trPr>
+          <w:trHeight w:val="641"/>
+        </w:trPr>
+        <w:tc>
+          <w:tcPr>
+            <w:tcW w:w="5490" w:type="dxa"/>
+            <w:gridSpan w:val="2"/>
+            <w:tcBorders>
+              <w:top w:val="single" w:sz="4" w:space="0" w:color="000000"/>
+              <w:left w:val="single" w:sz="4" w:space="0" w:color="000000"/>
+              <w:bottom w:val="single" w:sz="4" w:space="0" w:color="000000"/>
+              <w:right w:val="nil"/>
+            </w:tcBorders>
+            <w:vAlign w:val="bottom"/>
+            <w:hideMark/>
+          </w:tcPr>
+          <w:p>
+            <w:pPr>
+              <w:spacing w:line="256" w:lineRule="auto"/>
+              <w:rPr>
+                <w:sz w:val="28"/>
+                <w:szCs w:val="28"/>
+              </w:rPr>
+            </w:pPr>
+            <w:r>
+              <w:rPr>
+                <w:color w:val="0F4761"/>
+                <w:sz w:val="28"/>
+                <w:szCs w:val="28"/>
+              </w:rPr>
+              <w:t xml:space="preserve">Performance </w:t>
+            </w:r>
+          </w:p>
+        </w:tc>
+        <w:tc>
+          <w:tcPr>
+            <w:tcW w:w="2749" w:type="dxa"/>
+            <w:tcBorders>
+              <w:top w:val="single" w:sz="4" w:space="0" w:color="000000"/>
+              <w:left w:val="nil"/>
+              <w:bottom w:val="single" w:sz="4" w:space="0" w:color="000000"/>
+              <w:right w:val="single" w:sz="4" w:space="0" w:color="000000"/>
+            </w:tcBorders>
+          </w:tcPr>
+          <w:p>
+            <w:pPr>
+              <w:spacing w:after="160" w:line="256" w:lineRule="auto"/>
+            </w:pPr>
+          </w:p>
+        </w:tc>
+      </w:tr>
+      <w:tr>
+        <w:trPr>
+          <w:trHeight w:val="847"/>
+        </w:trPr>
+        <w:tc>
+          <w:tcPr>
+            <w:tcW w:w="2744" w:type="dxa"/>
+            <w:tcBorders>
+              <w:top w:val="single" w:sz="4" w:space="0" w:color="000000"/>
+              <w:left w:val="single" w:sz="4" w:space="0" w:color="000000"/>
+              <w:bottom w:val="single" w:sz="4" w:space="0" w:color="000000"/>
+              <w:right w:val="single" w:sz="4" w:space="0" w:color="000000"/>
+            </w:tcBorders>
+            <w:hideMark/>
+          </w:tcPr>
+          <w:p>
+            <w:pPr>
+              <w:spacing w:after="22" w:line="256" w:lineRule="auto"/>
+            </w:pPr>
+            <w:r>
+              <w:t xml:space="preserve">Non-Functional </w:t>
+            </w:r>
+          </w:p>
+          <w:p>
+            <w:pPr>
+              <w:spacing w:line="256" w:lineRule="auto"/>
+            </w:pPr>
+            <w:r>
+              <w:t xml:space="preserve">Requirement </w:t>
+            </w:r>
+          </w:p>
+        </w:tc>
+        <w:tc>
+          <w:tcPr>
+            <w:tcW w:w="2746" w:type="dxa"/>
+            <w:tcBorders>
+              <w:top w:val="single" w:sz="4" w:space="0" w:color="000000"/>
+              <w:left w:val="single" w:sz="4" w:space="0" w:color="000000"/>
+              <w:bottom w:val="single" w:sz="4" w:space="0" w:color="000000"/>
+              <w:right w:val="single" w:sz="4" w:space="0" w:color="000000"/>
+            </w:tcBorders>
+            <w:hideMark/>
+          </w:tcPr>
+          <w:p>
+            <w:pPr>
+              <w:spacing w:line="256" w:lineRule="auto"/>
+            </w:pPr>
+            <w:r>
+              <w:t xml:space="preserve">Justification </w:t>
+            </w:r>
+          </w:p>
+        </w:tc>
+        <w:tc>
+          <w:tcPr>
+            <w:tcW w:w="2749" w:type="dxa"/>
+            <w:tcBorders>
+              <w:top w:val="single" w:sz="4" w:space="0" w:color="000000"/>
+              <w:left w:val="single" w:sz="4" w:space="0" w:color="000000"/>
+              <w:bottom w:val="single" w:sz="4" w:space="0" w:color="000000"/>
+              <w:right w:val="single" w:sz="4" w:space="0" w:color="000000"/>
+            </w:tcBorders>
+            <w:hideMark/>
+          </w:tcPr>
+          <w:p>
+            <w:pPr>
+              <w:spacing w:line="256" w:lineRule="auto"/>
+            </w:pPr>
+            <w:r>
+              <w:t xml:space="preserve">KPI </w:t>
+            </w:r>
+          </w:p>
+        </w:tc>
+      </w:tr>
+      <w:tr>
+        <w:trPr>
+          <w:trHeight w:val="2206"/>
+        </w:trPr>
+        <w:tc>
+          <w:tcPr>
+            <w:tcW w:w="2744" w:type="dxa"/>
+            <w:tcBorders>
+              <w:top w:val="single" w:sz="4" w:space="0" w:color="000000"/>
+              <w:left w:val="single" w:sz="4" w:space="0" w:color="000000"/>
+              <w:bottom w:val="single" w:sz="4" w:space="0" w:color="000000"/>
+              <w:right w:val="single" w:sz="4" w:space="0" w:color="000000"/>
+            </w:tcBorders>
+            <w:hideMark/>
+          </w:tcPr>
+          <w:p>
+            <w:pPr>
+              <w:spacing w:line="256" w:lineRule="auto"/>
+              <w:ind w:right="10"/>
+            </w:pPr>
+            <w:r>
+              <w:t xml:space="preserve">The system should load all primary pages within 3 seconds under normal operating conditions  </w:t>
+            </w:r>
+          </w:p>
+        </w:tc>
+        <w:tc>
+          <w:tcPr>
+            <w:tcW w:w="2746" w:type="dxa"/>
+            <w:tcBorders>
+              <w:top w:val="single" w:sz="4" w:space="0" w:color="000000"/>
+              <w:left w:val="single" w:sz="4" w:space="0" w:color="000000"/>
+              <w:bottom w:val="single" w:sz="4" w:space="0" w:color="000000"/>
+              <w:right w:val="single" w:sz="4" w:space="0" w:color="000000"/>
+            </w:tcBorders>
+            <w:hideMark/>
+          </w:tcPr>
+          <w:p>
+            <w:pPr>
+              <w:spacing w:line="256" w:lineRule="auto"/>
+            </w:pPr>
+            <w:r>
+              <w:t xml:space="preserve">Slow load times negatively impact user experience, which may lead to some users abandoning the booking process </w:t>
+            </w:r>
+          </w:p>
+        </w:tc>
+        <w:tc>
+          <w:tcPr>
+            <w:tcW w:w="2749" w:type="dxa"/>
+            <w:tcBorders>
+              <w:top w:val="single" w:sz="4" w:space="0" w:color="000000"/>
+              <w:left w:val="single" w:sz="4" w:space="0" w:color="000000"/>
+              <w:bottom w:val="single" w:sz="4" w:space="0" w:color="000000"/>
+              <w:right w:val="single" w:sz="4" w:space="0" w:color="000000"/>
+            </w:tcBorders>
+            <w:hideMark/>
+          </w:tcPr>
+          <w:p>
+            <w:pPr>
+              <w:spacing w:after="24" w:line="256" w:lineRule="auto"/>
+            </w:pPr>
+            <w:r>
+              <w:t xml:space="preserve">95% of pages load within </w:t>
+            </w:r>
+          </w:p>
+          <w:p>
+            <w:pPr>
+              <w:spacing w:line="256" w:lineRule="auto"/>
+            </w:pPr>
+            <w:r>
+              <w:t xml:space="preserve">3 seconds  </w:t>
+            </w:r>
+          </w:p>
+        </w:tc>
+      </w:tr>
+      <w:tr>
+        <w:trPr>
+          <w:trHeight w:val="1769"/>
+        </w:trPr>
+        <w:tc>
+          <w:tcPr>
+            <w:tcW w:w="2744" w:type="dxa"/>
+            <w:tcBorders>
+              <w:top w:val="single" w:sz="4" w:space="0" w:color="000000"/>
+              <w:left w:val="single" w:sz="4" w:space="0" w:color="000000"/>
+              <w:bottom w:val="single" w:sz="4" w:space="0" w:color="000000"/>
+              <w:right w:val="single" w:sz="4" w:space="0" w:color="000000"/>
+            </w:tcBorders>
+            <w:hideMark/>
+          </w:tcPr>
+          <w:p>
+            <w:pPr>
+              <w:spacing w:line="256" w:lineRule="auto"/>
+            </w:pPr>
+            <w:r>
+              <w:t xml:space="preserve">Booking availability updates should be processed in real time without delay. </w:t>
+            </w:r>
+          </w:p>
+        </w:tc>
+        <w:tc>
+          <w:tcPr>
+            <w:tcW w:w="2746" w:type="dxa"/>
+            <w:tcBorders>
+              <w:top w:val="single" w:sz="4" w:space="0" w:color="000000"/>
+              <w:left w:val="single" w:sz="4" w:space="0" w:color="000000"/>
+              <w:bottom w:val="single" w:sz="4" w:space="0" w:color="000000"/>
+              <w:right w:val="single" w:sz="4" w:space="0" w:color="000000"/>
+            </w:tcBorders>
+            <w:hideMark/>
+          </w:tcPr>
+          <w:p>
+            <w:pPr>
+              <w:spacing w:line="256" w:lineRule="auto"/>
+              <w:ind w:right="23"/>
+            </w:pPr>
+            <w:r>
+              <w:t xml:space="preserve">This prevents double bookings and ensures users have accurate availability information anytime they are booking. </w:t>
+            </w:r>
+          </w:p>
+        </w:tc>
+        <w:tc>
+          <w:tcPr>
+            <w:tcW w:w="2749" w:type="dxa"/>
+            <w:tcBorders>
+              <w:top w:val="single" w:sz="4" w:space="0" w:color="000000"/>
+              <w:left w:val="single" w:sz="4" w:space="0" w:color="000000"/>
+              <w:bottom w:val="single" w:sz="4" w:space="0" w:color="000000"/>
+              <w:right w:val="single" w:sz="4" w:space="0" w:color="000000"/>
+            </w:tcBorders>
+            <w:hideMark/>
+          </w:tcPr>
+          <w:p>
+            <w:pPr>
+              <w:spacing w:line="256" w:lineRule="auto"/>
+            </w:pPr>
+            <w:r>
+              <w:t xml:space="preserve">Availability updates happen within 2 seconds after a booking action is made. </w:t>
+            </w:r>
+          </w:p>
+        </w:tc>
+      </w:tr>
+      <w:tr>
+        <w:trPr>
+          <w:trHeight w:val="1476"/>
+        </w:trPr>
+        <w:tc>
+          <w:tcPr>
+            <w:tcW w:w="2744" w:type="dxa"/>
+            <w:tcBorders>
+              <w:top w:val="single" w:sz="4" w:space="0" w:color="000000"/>
+              <w:left w:val="single" w:sz="4" w:space="0" w:color="000000"/>
+              <w:bottom w:val="single" w:sz="4" w:space="0" w:color="000000"/>
+              <w:right w:val="single" w:sz="4" w:space="0" w:color="000000"/>
+            </w:tcBorders>
+            <w:hideMark/>
+          </w:tcPr>
+          <w:p>
+            <w:pPr>
+              <w:spacing w:line="256" w:lineRule="auto"/>
+            </w:pPr>
+            <w:r>
+              <w:lastRenderedPageBreak/>
+              <w:t xml:space="preserve">The system should be able to withstand a high frequency of users simultaneously. </w:t>
+            </w:r>
+          </w:p>
+        </w:tc>
+        <w:tc>
+          <w:tcPr>
+            <w:tcW w:w="2746" w:type="dxa"/>
+            <w:tcBorders>
+              <w:top w:val="single" w:sz="4" w:space="0" w:color="000000"/>
+              <w:left w:val="single" w:sz="4" w:space="0" w:color="000000"/>
+              <w:bottom w:val="single" w:sz="4" w:space="0" w:color="000000"/>
+              <w:right w:val="single" w:sz="4" w:space="0" w:color="000000"/>
+            </w:tcBorders>
+            <w:hideMark/>
+          </w:tcPr>
+          <w:p>
+            <w:pPr>
+              <w:spacing w:line="256" w:lineRule="auto"/>
+            </w:pPr>
+            <w:r>
+              <w:t xml:space="preserve">This ensures that the system remains usable during peak periods such as weekends or promotional campaigns. </w:t>
+            </w:r>
+          </w:p>
+        </w:tc>
+        <w:tc>
+          <w:tcPr>
+            <w:tcW w:w="2749" w:type="dxa"/>
+            <w:tcBorders>
+              <w:top w:val="single" w:sz="4" w:space="0" w:color="000000"/>
+              <w:left w:val="single" w:sz="4" w:space="0" w:color="000000"/>
+              <w:bottom w:val="single" w:sz="4" w:space="0" w:color="000000"/>
+              <w:right w:val="single" w:sz="4" w:space="0" w:color="000000"/>
+            </w:tcBorders>
+            <w:hideMark/>
+          </w:tcPr>
+          <w:p>
+            <w:pPr>
+              <w:spacing w:line="256" w:lineRule="auto"/>
+            </w:pPr>
+            <w:r>
+              <w:t xml:space="preserve">Under load testing with 90+ virtual users, the average response time must stay below 2 seconds. </w:t>
+            </w:r>
+          </w:p>
+        </w:tc>
+      </w:tr>
+      <w:tr>
+        <w:trPr>
+          <w:trHeight w:val="638"/>
+        </w:trPr>
+        <w:tc>
+          <w:tcPr>
+            <w:tcW w:w="5490" w:type="dxa"/>
+            <w:gridSpan w:val="2"/>
+            <w:tcBorders>
+              <w:top w:val="single" w:sz="4" w:space="0" w:color="000000"/>
+              <w:left w:val="single" w:sz="4" w:space="0" w:color="000000"/>
+              <w:bottom w:val="single" w:sz="4" w:space="0" w:color="000000"/>
+              <w:right w:val="nil"/>
+            </w:tcBorders>
+            <w:vAlign w:val="bottom"/>
+            <w:hideMark/>
+          </w:tcPr>
+          <w:p>
+            <w:pPr>
+              <w:spacing w:line="256" w:lineRule="auto"/>
+              <w:rPr>
+                <w:sz w:val="28"/>
+                <w:szCs w:val="28"/>
+              </w:rPr>
+            </w:pPr>
+            <w:r>
+              <w:rPr>
+                <w:color w:val="0F4761"/>
+                <w:sz w:val="28"/>
+                <w:szCs w:val="28"/>
+              </w:rPr>
+              <w:t xml:space="preserve">Security </w:t>
+            </w:r>
+          </w:p>
+        </w:tc>
+        <w:tc>
+          <w:tcPr>
+            <w:tcW w:w="2749" w:type="dxa"/>
+            <w:tcBorders>
+              <w:top w:val="single" w:sz="4" w:space="0" w:color="000000"/>
+              <w:left w:val="nil"/>
+              <w:bottom w:val="single" w:sz="4" w:space="0" w:color="000000"/>
+              <w:right w:val="single" w:sz="4" w:space="0" w:color="000000"/>
+            </w:tcBorders>
+          </w:tcPr>
+          <w:p>
+            <w:pPr>
+              <w:spacing w:after="160" w:line="256" w:lineRule="auto"/>
+            </w:pPr>
+          </w:p>
+        </w:tc>
+      </w:tr>
+      <w:tr>
+        <w:trPr>
+          <w:trHeight w:val="850"/>
+        </w:trPr>
+        <w:tc>
+          <w:tcPr>
+            <w:tcW w:w="2744" w:type="dxa"/>
+            <w:tcBorders>
+              <w:top w:val="single" w:sz="4" w:space="0" w:color="000000"/>
+              <w:left w:val="single" w:sz="4" w:space="0" w:color="000000"/>
+              <w:bottom w:val="single" w:sz="4" w:space="0" w:color="000000"/>
+              <w:right w:val="single" w:sz="4" w:space="0" w:color="000000"/>
+            </w:tcBorders>
+            <w:hideMark/>
+          </w:tcPr>
+          <w:p>
+            <w:pPr>
+              <w:spacing w:after="22" w:line="256" w:lineRule="auto"/>
+            </w:pPr>
+            <w:r>
+              <w:t xml:space="preserve">Non-Functional </w:t>
+            </w:r>
+          </w:p>
+          <w:p>
+            <w:pPr>
+              <w:spacing w:line="256" w:lineRule="auto"/>
+            </w:pPr>
+            <w:r>
+              <w:t xml:space="preserve">Requirement </w:t>
+            </w:r>
+          </w:p>
+        </w:tc>
+        <w:tc>
+          <w:tcPr>
+            <w:tcW w:w="2746" w:type="dxa"/>
+            <w:tcBorders>
+              <w:top w:val="single" w:sz="4" w:space="0" w:color="000000"/>
+              <w:left w:val="single" w:sz="4" w:space="0" w:color="000000"/>
+              <w:bottom w:val="single" w:sz="4" w:space="0" w:color="000000"/>
+              <w:right w:val="single" w:sz="4" w:space="0" w:color="000000"/>
+            </w:tcBorders>
+            <w:hideMark/>
+          </w:tcPr>
+          <w:p>
+            <w:pPr>
+              <w:spacing w:line="256" w:lineRule="auto"/>
+            </w:pPr>
+            <w:r>
+              <w:t xml:space="preserve">Justification </w:t>
+            </w:r>
+          </w:p>
+        </w:tc>
+        <w:tc>
+          <w:tcPr>
+            <w:tcW w:w="2749" w:type="dxa"/>
+            <w:tcBorders>
+              <w:top w:val="single" w:sz="4" w:space="0" w:color="000000"/>
+              <w:left w:val="single" w:sz="4" w:space="0" w:color="000000"/>
+              <w:bottom w:val="single" w:sz="4" w:space="0" w:color="000000"/>
+              <w:right w:val="single" w:sz="4" w:space="0" w:color="000000"/>
+            </w:tcBorders>
+            <w:hideMark/>
+          </w:tcPr>
+          <w:p>
+            <w:pPr>
+              <w:spacing w:line="256" w:lineRule="auto"/>
+            </w:pPr>
+            <w:r>
+              <w:t xml:space="preserve">KPI </w:t>
+            </w:r>
+          </w:p>
+        </w:tc>
+      </w:tr>
+      <w:tr>
+        <w:trPr>
+          <w:trHeight w:val="1868"/>
+        </w:trPr>
+        <w:tc>
+          <w:tcPr>
+            <w:tcW w:w="2744" w:type="dxa"/>
+            <w:tcBorders>
+              <w:top w:val="single" w:sz="4" w:space="0" w:color="000000"/>
+              <w:left w:val="single" w:sz="4" w:space="0" w:color="000000"/>
+              <w:bottom w:val="single" w:sz="4" w:space="0" w:color="000000"/>
+              <w:right w:val="single" w:sz="4" w:space="0" w:color="000000"/>
+            </w:tcBorders>
+            <w:hideMark/>
+          </w:tcPr>
+          <w:p>
+            <w:pPr>
+              <w:spacing w:line="256" w:lineRule="auto"/>
+            </w:pPr>
+            <w:r>
+              <w:t xml:space="preserve">All passwords must be stored using a strong hashing or other forms of encryption </w:t>
+            </w:r>
+          </w:p>
+        </w:tc>
+        <w:tc>
+          <w:tcPr>
+            <w:tcW w:w="2746" w:type="dxa"/>
+            <w:tcBorders>
+              <w:top w:val="single" w:sz="4" w:space="0" w:color="000000"/>
+              <w:left w:val="single" w:sz="4" w:space="0" w:color="000000"/>
+              <w:bottom w:val="single" w:sz="4" w:space="0" w:color="000000"/>
+              <w:right w:val="single" w:sz="4" w:space="0" w:color="000000"/>
+            </w:tcBorders>
+            <w:hideMark/>
+          </w:tcPr>
+          <w:p>
+            <w:pPr>
+              <w:spacing w:line="256" w:lineRule="auto"/>
+              <w:ind w:right="20"/>
+            </w:pPr>
+            <w:r>
+              <w:t xml:space="preserve">In case of a data breach, hashed passwords protect user accounts from being compromised  </w:t>
+            </w:r>
+          </w:p>
+        </w:tc>
+        <w:tc>
+          <w:tcPr>
+            <w:tcW w:w="2749" w:type="dxa"/>
+            <w:tcBorders>
+              <w:top w:val="single" w:sz="4" w:space="0" w:color="000000"/>
+              <w:left w:val="single" w:sz="4" w:space="0" w:color="000000"/>
+              <w:bottom w:val="single" w:sz="4" w:space="0" w:color="000000"/>
+              <w:right w:val="single" w:sz="4" w:space="0" w:color="000000"/>
+            </w:tcBorders>
+            <w:hideMark/>
+          </w:tcPr>
+          <w:p>
+            <w:pPr>
+              <w:spacing w:after="1" w:line="276" w:lineRule="auto"/>
+            </w:pPr>
+            <w:r>
+              <w:t xml:space="preserve">100% of passwords in the database are hashed using </w:t>
+            </w:r>
+            <w:proofErr w:type="spellStart"/>
+            <w:r>
+              <w:t>bcrypt</w:t>
+            </w:r>
+            <w:proofErr w:type="spellEnd"/>
+            <w:r>
+              <w:t xml:space="preserve"> with a minimum cost factor of </w:t>
+            </w:r>
+          </w:p>
+          <w:p>
+            <w:pPr>
+              <w:spacing w:line="256" w:lineRule="auto"/>
+            </w:pPr>
+            <w:r>
+              <w:t xml:space="preserve">12 </w:t>
+            </w:r>
+          </w:p>
+        </w:tc>
+      </w:tr>
+      <w:tr>
+        <w:trPr>
+          <w:trHeight w:val="1474"/>
+        </w:trPr>
+        <w:tc>
+          <w:tcPr>
+            <w:tcW w:w="2744" w:type="dxa"/>
+            <w:tcBorders>
+              <w:top w:val="single" w:sz="4" w:space="0" w:color="000000"/>
+              <w:left w:val="single" w:sz="4" w:space="0" w:color="000000"/>
+              <w:bottom w:val="single" w:sz="4" w:space="0" w:color="000000"/>
+              <w:right w:val="single" w:sz="4" w:space="0" w:color="000000"/>
+            </w:tcBorders>
+            <w:hideMark/>
+          </w:tcPr>
+          <w:p>
+            <w:pPr>
+              <w:spacing w:line="256" w:lineRule="auto"/>
+            </w:pPr>
+            <w:r>
+              <w:t xml:space="preserve">The website must enforce HTTPS across all pages.  </w:t>
+            </w:r>
+          </w:p>
+        </w:tc>
+        <w:tc>
+          <w:tcPr>
+            <w:tcW w:w="2746" w:type="dxa"/>
+            <w:tcBorders>
+              <w:top w:val="single" w:sz="4" w:space="0" w:color="000000"/>
+              <w:left w:val="single" w:sz="4" w:space="0" w:color="000000"/>
+              <w:bottom w:val="single" w:sz="4" w:space="0" w:color="000000"/>
+              <w:right w:val="single" w:sz="4" w:space="0" w:color="000000"/>
+            </w:tcBorders>
+            <w:hideMark/>
+          </w:tcPr>
+          <w:p>
+            <w:pPr>
+              <w:spacing w:line="256" w:lineRule="auto"/>
+            </w:pPr>
+            <w:r>
+              <w:t xml:space="preserve">HTTPS encrypts data between the user and the server, preventing interception of personal or payment details  </w:t>
+            </w:r>
+          </w:p>
+        </w:tc>
+        <w:tc>
+          <w:tcPr>
+            <w:tcW w:w="2749" w:type="dxa"/>
+            <w:tcBorders>
+              <w:top w:val="single" w:sz="4" w:space="0" w:color="000000"/>
+              <w:left w:val="single" w:sz="4" w:space="0" w:color="000000"/>
+              <w:bottom w:val="single" w:sz="4" w:space="0" w:color="000000"/>
+              <w:right w:val="single" w:sz="4" w:space="0" w:color="000000"/>
+            </w:tcBorders>
+            <w:hideMark/>
+          </w:tcPr>
+          <w:p>
+            <w:pPr>
+              <w:spacing w:line="256" w:lineRule="auto"/>
+            </w:pPr>
+            <w:r>
+              <w:t xml:space="preserve">All pages load over </w:t>
+            </w:r>
+          </w:p>
+          <w:p>
+            <w:pPr>
+              <w:spacing w:line="256" w:lineRule="auto"/>
+            </w:pPr>
+            <w:r>
+              <w:t xml:space="preserve">HTTPS, with HSTS (HTTP Strict Transport Security) enabled. </w:t>
+            </w:r>
+          </w:p>
+        </w:tc>
+      </w:tr>
+      <w:tr>
+        <w:trPr>
+          <w:trHeight w:val="1476"/>
+        </w:trPr>
+        <w:tc>
+          <w:tcPr>
+            <w:tcW w:w="2744" w:type="dxa"/>
+            <w:tcBorders>
+              <w:top w:val="single" w:sz="4" w:space="0" w:color="000000"/>
+              <w:left w:val="single" w:sz="4" w:space="0" w:color="000000"/>
+              <w:bottom w:val="single" w:sz="4" w:space="0" w:color="000000"/>
+              <w:right w:val="single" w:sz="4" w:space="0" w:color="000000"/>
+            </w:tcBorders>
+            <w:hideMark/>
+          </w:tcPr>
+          <w:p>
+            <w:pPr>
+              <w:spacing w:line="256" w:lineRule="auto"/>
+              <w:jc w:val="both"/>
+            </w:pPr>
+            <w:r>
+              <w:t xml:space="preserve">Sessions timeout after 15 minutes of inactivity  </w:t>
+            </w:r>
+          </w:p>
+        </w:tc>
+        <w:tc>
+          <w:tcPr>
+            <w:tcW w:w="2746" w:type="dxa"/>
+            <w:tcBorders>
+              <w:top w:val="single" w:sz="4" w:space="0" w:color="000000"/>
+              <w:left w:val="single" w:sz="4" w:space="0" w:color="000000"/>
+              <w:bottom w:val="single" w:sz="4" w:space="0" w:color="000000"/>
+              <w:right w:val="single" w:sz="4" w:space="0" w:color="000000"/>
+            </w:tcBorders>
+            <w:hideMark/>
+          </w:tcPr>
+          <w:p>
+            <w:pPr>
+              <w:spacing w:line="256" w:lineRule="auto"/>
+              <w:ind w:right="6"/>
+            </w:pPr>
+            <w:r>
+              <w:t xml:space="preserve">This reduces the risk of someone accessing a customer’s account if they leave their device unattended. </w:t>
+            </w:r>
+          </w:p>
+        </w:tc>
+        <w:tc>
+          <w:tcPr>
+            <w:tcW w:w="2749" w:type="dxa"/>
+            <w:tcBorders>
+              <w:top w:val="single" w:sz="4" w:space="0" w:color="000000"/>
+              <w:left w:val="single" w:sz="4" w:space="0" w:color="000000"/>
+              <w:bottom w:val="single" w:sz="4" w:space="0" w:color="000000"/>
+              <w:right w:val="single" w:sz="4" w:space="0" w:color="000000"/>
+            </w:tcBorders>
+            <w:hideMark/>
+          </w:tcPr>
+          <w:p>
+            <w:pPr>
+              <w:spacing w:line="256" w:lineRule="auto"/>
+            </w:pPr>
+            <w:r>
+              <w:t xml:space="preserve">User sessions automatically expire after 15 mins of no activity, requiring re-login </w:t>
+            </w:r>
+          </w:p>
+        </w:tc>
+      </w:tr>
+    </w:tbl>
+    <w:p>
+      <w:pPr>
+        <w:spacing w:after="0" w:line="256" w:lineRule="auto"/>
+        <w:ind w:left="-1440" w:right="781"/>
+        <w:rPr>
+          <w:rFonts w:ascii="Calibri" w:eastAsia="Calibri" w:hAnsi="Calibri" w:cs="Calibri"/>
+          <w:color w:val="000000"/>
+        </w:rPr>
+      </w:pPr>
+    </w:p>
+    <w:tbl>
+      <w:tblPr>
+        <w:tblStyle w:val="TableGrid0"/>
+        <w:tblW w:w="8238" w:type="dxa"/>
+        <w:tblInd w:w="5" w:type="dxa"/>
+        <w:tblCellMar>
+          <w:top w:w="53" w:type="dxa"/>
+          <w:left w:w="108" w:type="dxa"/>
+          <w:bottom w:w="5" w:type="dxa"/>
+          <w:right w:w="59" w:type="dxa"/>
+        </w:tblCellMar>
+        <w:tblLook w:val="04A0" w:firstRow="1" w:lastRow="0" w:firstColumn="1" w:lastColumn="0" w:noHBand="0" w:noVBand="1"/>
+      </w:tblPr>
+      <w:tblGrid>
+        <w:gridCol w:w="2743"/>
+        <w:gridCol w:w="2746"/>
+        <w:gridCol w:w="2749"/>
+      </w:tblGrid>
+      <w:tr>
+        <w:trPr>
+          <w:trHeight w:val="1769"/>
+        </w:trPr>
+        <w:tc>
+          <w:tcPr>
+            <w:tcW w:w="2744" w:type="dxa"/>
+            <w:tcBorders>
+              <w:top w:val="single" w:sz="4" w:space="0" w:color="000000"/>
+              <w:left w:val="single" w:sz="4" w:space="0" w:color="000000"/>
+              <w:bottom w:val="single" w:sz="4" w:space="0" w:color="000000"/>
+              <w:right w:val="single" w:sz="4" w:space="0" w:color="000000"/>
+            </w:tcBorders>
+            <w:hideMark/>
+          </w:tcPr>
+          <w:p>
+            <w:pPr>
+              <w:spacing w:line="256" w:lineRule="auto"/>
+            </w:pPr>
+            <w:r>
+              <w:t xml:space="preserve">There should be explicit user consent for the use of cookies. </w:t>
+            </w:r>
+          </w:p>
+        </w:tc>
+        <w:tc>
+          <w:tcPr>
+            <w:tcW w:w="2746" w:type="dxa"/>
+            <w:tcBorders>
+              <w:top w:val="single" w:sz="4" w:space="0" w:color="000000"/>
+              <w:left w:val="single" w:sz="4" w:space="0" w:color="000000"/>
+              <w:bottom w:val="single" w:sz="4" w:space="0" w:color="000000"/>
+              <w:right w:val="single" w:sz="4" w:space="0" w:color="000000"/>
+            </w:tcBorders>
+            <w:hideMark/>
+          </w:tcPr>
+          <w:p>
+            <w:pPr>
+              <w:spacing w:line="256" w:lineRule="auto"/>
+              <w:ind w:right="29"/>
+            </w:pPr>
+            <w:r>
+              <w:t xml:space="preserve">This will enable the client to comply with GDPR laws and protect themselves from potential fines related to cookies. </w:t>
+            </w:r>
+          </w:p>
+        </w:tc>
+        <w:tc>
+          <w:tcPr>
+            <w:tcW w:w="2749" w:type="dxa"/>
+            <w:tcBorders>
+              <w:top w:val="single" w:sz="4" w:space="0" w:color="000000"/>
+              <w:left w:val="single" w:sz="4" w:space="0" w:color="000000"/>
+              <w:bottom w:val="single" w:sz="4" w:space="0" w:color="000000"/>
+              <w:right w:val="single" w:sz="4" w:space="0" w:color="000000"/>
+            </w:tcBorders>
+            <w:hideMark/>
+          </w:tcPr>
+          <w:p>
+            <w:pPr>
+              <w:spacing w:line="256" w:lineRule="auto"/>
+            </w:pPr>
+            <w:r>
+              <w:t xml:space="preserve">Cookies should be visible on any page of the website with a clear way to accept or deny the cookies. </w:t>
+            </w:r>
+          </w:p>
+        </w:tc>
+      </w:tr>
+      <w:tr>
+        <w:trPr>
+          <w:trHeight w:val="641"/>
+        </w:trPr>
+        <w:tc>
+          <w:tcPr>
+            <w:tcW w:w="8238" w:type="dxa"/>
+            <w:gridSpan w:val="3"/>
+            <w:tcBorders>
+              <w:top w:val="single" w:sz="4" w:space="0" w:color="000000"/>
+              <w:left w:val="single" w:sz="4" w:space="0" w:color="000000"/>
+              <w:bottom w:val="single" w:sz="4" w:space="0" w:color="000000"/>
+              <w:right w:val="single" w:sz="4" w:space="0" w:color="000000"/>
+            </w:tcBorders>
+            <w:vAlign w:val="bottom"/>
+            <w:hideMark/>
+          </w:tcPr>
+          <w:p>
+            <w:pPr>
+              <w:spacing w:line="256" w:lineRule="auto"/>
+              <w:rPr>
+                <w:sz w:val="28"/>
+                <w:szCs w:val="28"/>
+              </w:rPr>
+            </w:pPr>
+            <w:r>
+              <w:rPr>
+                <w:color w:val="0F4761"/>
+                <w:sz w:val="28"/>
+                <w:szCs w:val="28"/>
+              </w:rPr>
+              <w:t xml:space="preserve">Scalability </w:t>
+            </w:r>
+          </w:p>
+        </w:tc>
+      </w:tr>
+      <w:tr>
+        <w:trPr>
+          <w:trHeight w:val="848"/>
+        </w:trPr>
+        <w:tc>
+          <w:tcPr>
+            <w:tcW w:w="2744" w:type="dxa"/>
+            <w:tcBorders>
+              <w:top w:val="single" w:sz="4" w:space="0" w:color="000000"/>
+              <w:left w:val="single" w:sz="4" w:space="0" w:color="000000"/>
+              <w:bottom w:val="single" w:sz="4" w:space="0" w:color="000000"/>
+              <w:right w:val="single" w:sz="4" w:space="0" w:color="000000"/>
+            </w:tcBorders>
+            <w:hideMark/>
+          </w:tcPr>
+          <w:p>
+            <w:pPr>
+              <w:spacing w:after="22" w:line="256" w:lineRule="auto"/>
+            </w:pPr>
+            <w:r>
+              <w:t xml:space="preserve">Non-Functional </w:t>
+            </w:r>
+          </w:p>
+          <w:p>
+            <w:pPr>
+              <w:spacing w:line="256" w:lineRule="auto"/>
+            </w:pPr>
+            <w:r>
+              <w:t xml:space="preserve">Requirement </w:t>
+            </w:r>
+          </w:p>
+        </w:tc>
+        <w:tc>
+          <w:tcPr>
+            <w:tcW w:w="2746" w:type="dxa"/>
+            <w:tcBorders>
+              <w:top w:val="single" w:sz="4" w:space="0" w:color="000000"/>
+              <w:left w:val="single" w:sz="4" w:space="0" w:color="000000"/>
+              <w:bottom w:val="single" w:sz="4" w:space="0" w:color="000000"/>
+              <w:right w:val="single" w:sz="4" w:space="0" w:color="000000"/>
+            </w:tcBorders>
+            <w:hideMark/>
+          </w:tcPr>
+          <w:p>
+            <w:pPr>
+              <w:spacing w:line="256" w:lineRule="auto"/>
+            </w:pPr>
+            <w:r>
+              <w:t xml:space="preserve">Justification </w:t>
+            </w:r>
+          </w:p>
+        </w:tc>
+        <w:tc>
+          <w:tcPr>
+            <w:tcW w:w="2749" w:type="dxa"/>
+            <w:tcBorders>
+              <w:top w:val="single" w:sz="4" w:space="0" w:color="000000"/>
+              <w:left w:val="single" w:sz="4" w:space="0" w:color="000000"/>
+              <w:bottom w:val="single" w:sz="4" w:space="0" w:color="000000"/>
+              <w:right w:val="single" w:sz="4" w:space="0" w:color="000000"/>
+            </w:tcBorders>
+            <w:hideMark/>
+          </w:tcPr>
+          <w:p>
+            <w:pPr>
+              <w:spacing w:line="256" w:lineRule="auto"/>
+            </w:pPr>
+            <w:r>
+              <w:t xml:space="preserve">KPI </w:t>
+            </w:r>
+          </w:p>
+        </w:tc>
+      </w:tr>
+      <w:tr>
+        <w:trPr>
+          <w:trHeight w:val="1867"/>
+        </w:trPr>
+        <w:tc>
+          <w:tcPr>
+            <w:tcW w:w="2744" w:type="dxa"/>
+            <w:tcBorders>
+              <w:top w:val="single" w:sz="4" w:space="0" w:color="000000"/>
+              <w:left w:val="single" w:sz="4" w:space="0" w:color="000000"/>
+              <w:bottom w:val="single" w:sz="4" w:space="0" w:color="000000"/>
+              <w:right w:val="single" w:sz="4" w:space="0" w:color="000000"/>
+            </w:tcBorders>
+            <w:hideMark/>
+          </w:tcPr>
+          <w:p>
+            <w:pPr>
+              <w:spacing w:line="256" w:lineRule="auto"/>
+              <w:ind w:right="5"/>
+            </w:pPr>
+            <w:r>
+              <w:t xml:space="preserve">The system should support an increasing number of rooms and uses without performance loss. </w:t>
+            </w:r>
+          </w:p>
+        </w:tc>
+        <w:tc>
+          <w:tcPr>
+            <w:tcW w:w="2746" w:type="dxa"/>
+            <w:tcBorders>
+              <w:top w:val="single" w:sz="4" w:space="0" w:color="000000"/>
+              <w:left w:val="single" w:sz="4" w:space="0" w:color="000000"/>
+              <w:bottom w:val="single" w:sz="4" w:space="0" w:color="000000"/>
+              <w:right w:val="single" w:sz="4" w:space="0" w:color="000000"/>
+            </w:tcBorders>
+            <w:hideMark/>
+          </w:tcPr>
+          <w:p>
+            <w:pPr>
+              <w:spacing w:line="256" w:lineRule="auto"/>
+            </w:pPr>
+            <w:r>
+              <w:t xml:space="preserve">As </w:t>
+            </w:r>
+            <w:proofErr w:type="spellStart"/>
+            <w:r>
+              <w:t>CityPoint</w:t>
+            </w:r>
+            <w:proofErr w:type="spellEnd"/>
+            <w:r>
+              <w:t xml:space="preserve"> grows, the system must accommodate more rooms, bookings, and customers.  </w:t>
+            </w:r>
+          </w:p>
+        </w:tc>
+        <w:tc>
+          <w:tcPr>
+            <w:tcW w:w="2749" w:type="dxa"/>
+            <w:tcBorders>
+              <w:top w:val="single" w:sz="4" w:space="0" w:color="000000"/>
+              <w:left w:val="single" w:sz="4" w:space="0" w:color="000000"/>
+              <w:bottom w:val="single" w:sz="4" w:space="0" w:color="000000"/>
+              <w:right w:val="single" w:sz="4" w:space="0" w:color="000000"/>
+            </w:tcBorders>
+            <w:hideMark/>
+          </w:tcPr>
+          <w:p>
+            <w:pPr>
+              <w:spacing w:line="256" w:lineRule="auto"/>
+            </w:pPr>
+            <w:r>
+              <w:t xml:space="preserve">The system can handle a 50% increase in rooms and users without response time degradation. </w:t>
+            </w:r>
+          </w:p>
+        </w:tc>
+      </w:tr>
+      <w:tr>
+        <w:trPr>
+          <w:trHeight w:val="1474"/>
+        </w:trPr>
+        <w:tc>
+          <w:tcPr>
+            <w:tcW w:w="2744" w:type="dxa"/>
+            <w:tcBorders>
+              <w:top w:val="single" w:sz="4" w:space="0" w:color="000000"/>
+              <w:left w:val="single" w:sz="4" w:space="0" w:color="000000"/>
+              <w:bottom w:val="single" w:sz="4" w:space="0" w:color="000000"/>
+              <w:right w:val="single" w:sz="4" w:space="0" w:color="000000"/>
+            </w:tcBorders>
+            <w:hideMark/>
+          </w:tcPr>
+          <w:p>
+            <w:pPr>
+              <w:spacing w:line="256" w:lineRule="auto"/>
+            </w:pPr>
+            <w:r>
+              <w:lastRenderedPageBreak/>
+              <w:t xml:space="preserve">Database design must allow for easy addition of new features, e.g., new room types, payment methods, etc. </w:t>
+            </w:r>
+          </w:p>
+        </w:tc>
+        <w:tc>
+          <w:tcPr>
+            <w:tcW w:w="2746" w:type="dxa"/>
+            <w:tcBorders>
+              <w:top w:val="single" w:sz="4" w:space="0" w:color="000000"/>
+              <w:left w:val="single" w:sz="4" w:space="0" w:color="000000"/>
+              <w:bottom w:val="single" w:sz="4" w:space="0" w:color="000000"/>
+              <w:right w:val="single" w:sz="4" w:space="0" w:color="000000"/>
+            </w:tcBorders>
+            <w:hideMark/>
+          </w:tcPr>
+          <w:p>
+            <w:pPr>
+              <w:spacing w:line="256" w:lineRule="auto"/>
+            </w:pPr>
+            <w:r>
+              <w:t xml:space="preserve">Future expansions should not require major reconstruction </w:t>
+            </w:r>
+          </w:p>
+        </w:tc>
+        <w:tc>
+          <w:tcPr>
+            <w:tcW w:w="2749" w:type="dxa"/>
+            <w:tcBorders>
+              <w:top w:val="single" w:sz="4" w:space="0" w:color="000000"/>
+              <w:left w:val="single" w:sz="4" w:space="0" w:color="000000"/>
+              <w:bottom w:val="single" w:sz="4" w:space="0" w:color="000000"/>
+              <w:right w:val="single" w:sz="4" w:space="0" w:color="000000"/>
+            </w:tcBorders>
+            <w:hideMark/>
+          </w:tcPr>
+          <w:p>
+            <w:pPr>
+              <w:spacing w:line="256" w:lineRule="auto"/>
+            </w:pPr>
+            <w:r>
+              <w:t xml:space="preserve">New room types or payment methods can be added with less than 20% changes to the existing database design. </w:t>
+            </w:r>
+          </w:p>
+        </w:tc>
+      </w:tr>
+      <w:tr>
+        <w:trPr>
+          <w:trHeight w:val="1769"/>
+        </w:trPr>
+        <w:tc>
+          <w:tcPr>
+            <w:tcW w:w="2744" w:type="dxa"/>
+            <w:tcBorders>
+              <w:top w:val="single" w:sz="4" w:space="0" w:color="000000"/>
+              <w:left w:val="single" w:sz="4" w:space="0" w:color="000000"/>
+              <w:bottom w:val="single" w:sz="4" w:space="0" w:color="000000"/>
+              <w:right w:val="single" w:sz="4" w:space="0" w:color="000000"/>
+            </w:tcBorders>
+            <w:vAlign w:val="center"/>
+            <w:hideMark/>
+          </w:tcPr>
+          <w:p>
+            <w:r>
+              <w:t xml:space="preserve">The system should be deployable on cloud infrastructure (e.g., AWS, </w:t>
+            </w:r>
+          </w:p>
+          <w:p>
+            <w:pPr>
+              <w:spacing w:line="256" w:lineRule="auto"/>
+            </w:pPr>
+            <w:r>
+              <w:t xml:space="preserve">Azure) </w:t>
+            </w:r>
+          </w:p>
+        </w:tc>
+        <w:tc>
+          <w:tcPr>
+            <w:tcW w:w="2746" w:type="dxa"/>
+            <w:tcBorders>
+              <w:top w:val="single" w:sz="4" w:space="0" w:color="000000"/>
+              <w:left w:val="single" w:sz="4" w:space="0" w:color="000000"/>
+              <w:bottom w:val="single" w:sz="4" w:space="0" w:color="000000"/>
+              <w:right w:val="single" w:sz="4" w:space="0" w:color="000000"/>
+            </w:tcBorders>
+            <w:hideMark/>
+          </w:tcPr>
+          <w:p>
+            <w:pPr>
+              <w:spacing w:line="256" w:lineRule="auto"/>
+            </w:pPr>
+            <w:r>
+              <w:t xml:space="preserve">Cloud hosting makes it easier to scale up server resources during busy periods and scale down during quiet times to save costs. </w:t>
+            </w:r>
+          </w:p>
+        </w:tc>
+        <w:tc>
+          <w:tcPr>
+            <w:tcW w:w="2749" w:type="dxa"/>
+            <w:tcBorders>
+              <w:top w:val="single" w:sz="4" w:space="0" w:color="000000"/>
+              <w:left w:val="single" w:sz="4" w:space="0" w:color="000000"/>
+              <w:bottom w:val="single" w:sz="4" w:space="0" w:color="000000"/>
+              <w:right w:val="single" w:sz="4" w:space="0" w:color="000000"/>
+            </w:tcBorders>
+            <w:vAlign w:val="center"/>
+            <w:hideMark/>
+          </w:tcPr>
+          <w:p>
+            <w:pPr>
+              <w:spacing w:line="256" w:lineRule="auto"/>
+            </w:pPr>
+            <w:r>
+              <w:t xml:space="preserve">The application can be deployed and run on at least one major cloud platform (AWS, Azure, or Google Cloud). </w:t>
+            </w:r>
+          </w:p>
+        </w:tc>
+      </w:tr>
+      <w:tr>
+        <w:trPr>
+          <w:trHeight w:val="641"/>
+        </w:trPr>
+        <w:tc>
+          <w:tcPr>
+            <w:tcW w:w="8238" w:type="dxa"/>
+            <w:gridSpan w:val="3"/>
+            <w:tcBorders>
+              <w:top w:val="single" w:sz="4" w:space="0" w:color="000000"/>
+              <w:left w:val="single" w:sz="4" w:space="0" w:color="000000"/>
+              <w:bottom w:val="single" w:sz="4" w:space="0" w:color="000000"/>
+              <w:right w:val="single" w:sz="4" w:space="0" w:color="000000"/>
+            </w:tcBorders>
+            <w:vAlign w:val="bottom"/>
+            <w:hideMark/>
+          </w:tcPr>
+          <w:p>
+            <w:pPr>
+              <w:spacing w:line="256" w:lineRule="auto"/>
+              <w:rPr>
+                <w:sz w:val="28"/>
+                <w:szCs w:val="28"/>
+              </w:rPr>
+            </w:pPr>
+            <w:r>
+              <w:rPr>
+                <w:color w:val="0F4761"/>
+                <w:sz w:val="28"/>
+                <w:szCs w:val="28"/>
+              </w:rPr>
+              <w:t xml:space="preserve">Capacity </w:t>
+            </w:r>
+          </w:p>
+        </w:tc>
+      </w:tr>
+      <w:tr>
+        <w:trPr>
+          <w:trHeight w:val="850"/>
+        </w:trPr>
+        <w:tc>
+          <w:tcPr>
+            <w:tcW w:w="2744" w:type="dxa"/>
+            <w:tcBorders>
+              <w:top w:val="single" w:sz="4" w:space="0" w:color="000000"/>
+              <w:left w:val="single" w:sz="4" w:space="0" w:color="000000"/>
+              <w:bottom w:val="single" w:sz="4" w:space="0" w:color="000000"/>
+              <w:right w:val="single" w:sz="4" w:space="0" w:color="000000"/>
+            </w:tcBorders>
+            <w:hideMark/>
+          </w:tcPr>
+          <w:p>
+            <w:pPr>
+              <w:spacing w:after="24" w:line="256" w:lineRule="auto"/>
+            </w:pPr>
+            <w:r>
+              <w:t xml:space="preserve">Non-Functional </w:t>
+            </w:r>
+          </w:p>
+          <w:p>
+            <w:pPr>
+              <w:spacing w:line="256" w:lineRule="auto"/>
+            </w:pPr>
+            <w:r>
+              <w:t xml:space="preserve">Requirement </w:t>
+            </w:r>
+          </w:p>
+        </w:tc>
+        <w:tc>
+          <w:tcPr>
+            <w:tcW w:w="2746" w:type="dxa"/>
+            <w:tcBorders>
+              <w:top w:val="single" w:sz="4" w:space="0" w:color="000000"/>
+              <w:left w:val="single" w:sz="4" w:space="0" w:color="000000"/>
+              <w:bottom w:val="single" w:sz="4" w:space="0" w:color="000000"/>
+              <w:right w:val="single" w:sz="4" w:space="0" w:color="000000"/>
+            </w:tcBorders>
+            <w:hideMark/>
+          </w:tcPr>
+          <w:p>
+            <w:pPr>
+              <w:spacing w:line="256" w:lineRule="auto"/>
+            </w:pPr>
+            <w:r>
+              <w:t xml:space="preserve">Justification </w:t>
+            </w:r>
+          </w:p>
+        </w:tc>
+        <w:tc>
+          <w:tcPr>
+            <w:tcW w:w="2749" w:type="dxa"/>
+            <w:tcBorders>
+              <w:top w:val="single" w:sz="4" w:space="0" w:color="000000"/>
+              <w:left w:val="single" w:sz="4" w:space="0" w:color="000000"/>
+              <w:bottom w:val="single" w:sz="4" w:space="0" w:color="000000"/>
+              <w:right w:val="single" w:sz="4" w:space="0" w:color="000000"/>
+            </w:tcBorders>
+            <w:hideMark/>
+          </w:tcPr>
+          <w:p>
+            <w:pPr>
+              <w:spacing w:line="256" w:lineRule="auto"/>
+            </w:pPr>
+            <w:r>
+              <w:t xml:space="preserve">KPI </w:t>
+            </w:r>
+          </w:p>
+        </w:tc>
+      </w:tr>
+      <w:tr>
+        <w:trPr>
+          <w:trHeight w:val="1526"/>
+        </w:trPr>
+        <w:tc>
+          <w:tcPr>
+            <w:tcW w:w="2744" w:type="dxa"/>
+            <w:tcBorders>
+              <w:top w:val="single" w:sz="4" w:space="0" w:color="000000"/>
+              <w:left w:val="single" w:sz="4" w:space="0" w:color="000000"/>
+              <w:bottom w:val="single" w:sz="4" w:space="0" w:color="000000"/>
+              <w:right w:val="single" w:sz="4" w:space="0" w:color="000000"/>
+            </w:tcBorders>
+            <w:hideMark/>
+          </w:tcPr>
+          <w:p>
+            <w:pPr>
+              <w:spacing w:line="256" w:lineRule="auto"/>
+            </w:pPr>
+            <w:r>
+              <w:t xml:space="preserve">The system must support at least 500 concurrent users </w:t>
+            </w:r>
+          </w:p>
+        </w:tc>
+        <w:tc>
+          <w:tcPr>
+            <w:tcW w:w="2746" w:type="dxa"/>
+            <w:tcBorders>
+              <w:top w:val="single" w:sz="4" w:space="0" w:color="000000"/>
+              <w:left w:val="single" w:sz="4" w:space="0" w:color="000000"/>
+              <w:bottom w:val="single" w:sz="4" w:space="0" w:color="000000"/>
+              <w:right w:val="single" w:sz="4" w:space="0" w:color="000000"/>
+            </w:tcBorders>
+            <w:hideMark/>
+          </w:tcPr>
+          <w:p>
+            <w:pPr>
+              <w:spacing w:line="256" w:lineRule="auto"/>
+            </w:pPr>
+            <w:r>
+              <w:t xml:space="preserve">During peak booking times, many users may be accessing the system simultaneously. </w:t>
+            </w:r>
+          </w:p>
+        </w:tc>
+        <w:tc>
+          <w:tcPr>
+            <w:tcW w:w="2749" w:type="dxa"/>
+            <w:tcBorders>
+              <w:top w:val="single" w:sz="4" w:space="0" w:color="000000"/>
+              <w:left w:val="single" w:sz="4" w:space="0" w:color="000000"/>
+              <w:bottom w:val="single" w:sz="4" w:space="0" w:color="000000"/>
+              <w:right w:val="single" w:sz="4" w:space="0" w:color="000000"/>
+            </w:tcBorders>
+            <w:hideMark/>
+          </w:tcPr>
+          <w:p>
+            <w:pPr>
+              <w:spacing w:line="256" w:lineRule="auto"/>
+            </w:pPr>
+            <w:r>
+              <w:t xml:space="preserve">System remains responsive with 500+ concurrent users during simulated peak load. </w:t>
+            </w:r>
+          </w:p>
+        </w:tc>
+      </w:tr>
+      <w:tr>
+        <w:trPr>
+          <w:trHeight w:val="1184"/>
+        </w:trPr>
+        <w:tc>
+          <w:tcPr>
+            <w:tcW w:w="2744" w:type="dxa"/>
+            <w:tcBorders>
+              <w:top w:val="single" w:sz="4" w:space="0" w:color="000000"/>
+              <w:left w:val="single" w:sz="4" w:space="0" w:color="000000"/>
+              <w:bottom w:val="single" w:sz="4" w:space="0" w:color="000000"/>
+              <w:right w:val="single" w:sz="4" w:space="0" w:color="000000"/>
+            </w:tcBorders>
+            <w:hideMark/>
+          </w:tcPr>
+          <w:p>
+            <w:r>
+              <w:t xml:space="preserve">The database must store booking history for at </w:t>
+            </w:r>
+          </w:p>
+          <w:p>
+            <w:pPr>
+              <w:spacing w:line="256" w:lineRule="auto"/>
+            </w:pPr>
+            <w:r>
+              <w:t xml:space="preserve">least 2 years  </w:t>
+            </w:r>
+          </w:p>
+        </w:tc>
+        <w:tc>
+          <w:tcPr>
+            <w:tcW w:w="2746" w:type="dxa"/>
+            <w:tcBorders>
+              <w:top w:val="single" w:sz="4" w:space="0" w:color="000000"/>
+              <w:left w:val="single" w:sz="4" w:space="0" w:color="000000"/>
+              <w:bottom w:val="single" w:sz="4" w:space="0" w:color="000000"/>
+              <w:right w:val="single" w:sz="4" w:space="0" w:color="000000"/>
+            </w:tcBorders>
+            <w:hideMark/>
+          </w:tcPr>
+          <w:p>
+            <w:pPr>
+              <w:spacing w:line="256" w:lineRule="auto"/>
+            </w:pPr>
+            <w:r>
+              <w:t xml:space="preserve">Required for recordkeeping, customer service, and business analytics. </w:t>
+            </w:r>
+          </w:p>
+        </w:tc>
+        <w:tc>
+          <w:tcPr>
+            <w:tcW w:w="2749" w:type="dxa"/>
+            <w:tcBorders>
+              <w:top w:val="single" w:sz="4" w:space="0" w:color="000000"/>
+              <w:left w:val="single" w:sz="4" w:space="0" w:color="000000"/>
+              <w:bottom w:val="single" w:sz="4" w:space="0" w:color="000000"/>
+              <w:right w:val="single" w:sz="4" w:space="0" w:color="000000"/>
+            </w:tcBorders>
+            <w:hideMark/>
+          </w:tcPr>
+          <w:p>
+            <w:pPr>
+              <w:spacing w:line="256" w:lineRule="auto"/>
+            </w:pPr>
+            <w:r>
+              <w:t xml:space="preserve">All booking data is retained and accessible for 24 months from the date of booking. </w:t>
+            </w:r>
+          </w:p>
+        </w:tc>
+      </w:tr>
+      <w:tr>
+        <w:trPr>
+          <w:trHeight w:val="1181"/>
+        </w:trPr>
+        <w:tc>
+          <w:tcPr>
+            <w:tcW w:w="2744" w:type="dxa"/>
+            <w:tcBorders>
+              <w:top w:val="single" w:sz="4" w:space="0" w:color="000000"/>
+              <w:left w:val="single" w:sz="4" w:space="0" w:color="000000"/>
+              <w:bottom w:val="single" w:sz="4" w:space="0" w:color="000000"/>
+              <w:right w:val="single" w:sz="4" w:space="0" w:color="000000"/>
+            </w:tcBorders>
+            <w:hideMark/>
+          </w:tcPr>
+          <w:p>
+            <w:pPr>
+              <w:spacing w:line="256" w:lineRule="auto"/>
+            </w:pPr>
+            <w:r>
+              <w:t xml:space="preserve">The system must handle at least 10,000 customer accounts </w:t>
+            </w:r>
+          </w:p>
+        </w:tc>
+        <w:tc>
+          <w:tcPr>
+            <w:tcW w:w="2746" w:type="dxa"/>
+            <w:tcBorders>
+              <w:top w:val="single" w:sz="4" w:space="0" w:color="000000"/>
+              <w:left w:val="single" w:sz="4" w:space="0" w:color="000000"/>
+              <w:bottom w:val="single" w:sz="4" w:space="0" w:color="000000"/>
+              <w:right w:val="single" w:sz="4" w:space="0" w:color="000000"/>
+            </w:tcBorders>
+            <w:hideMark/>
+          </w:tcPr>
+          <w:p>
+            <w:pPr>
+              <w:spacing w:line="256" w:lineRule="auto"/>
+              <w:ind w:right="2"/>
+            </w:pPr>
+            <w:r>
+              <w:t xml:space="preserve">As the business grows, the user base will increase. </w:t>
+            </w:r>
+          </w:p>
+        </w:tc>
+        <w:tc>
+          <w:tcPr>
+            <w:tcW w:w="2749" w:type="dxa"/>
+            <w:tcBorders>
+              <w:top w:val="single" w:sz="4" w:space="0" w:color="000000"/>
+              <w:left w:val="single" w:sz="4" w:space="0" w:color="000000"/>
+              <w:bottom w:val="single" w:sz="4" w:space="0" w:color="000000"/>
+              <w:right w:val="single" w:sz="4" w:space="0" w:color="000000"/>
+            </w:tcBorders>
+            <w:hideMark/>
+          </w:tcPr>
+          <w:p>
+            <w:pPr>
+              <w:spacing w:line="256" w:lineRule="auto"/>
+            </w:pPr>
+            <w:r>
+              <w:t xml:space="preserve">The database can handle over 10,000 user records with query response times under 100ms </w:t>
+            </w:r>
+          </w:p>
+        </w:tc>
+      </w:tr>
+    </w:tbl>
+    <w:p>
+      <w:pPr>
+        <w:spacing w:after="0" w:line="256" w:lineRule="auto"/>
+        <w:ind w:left="-1440" w:right="781"/>
+        <w:rPr>
+          <w:rFonts w:ascii="Calibri" w:eastAsia="Calibri" w:hAnsi="Calibri" w:cs="Calibri"/>
+          <w:color w:val="000000"/>
+        </w:rPr>
+      </w:pPr>
+    </w:p>
+    <w:tbl>
+      <w:tblPr>
+        <w:tblStyle w:val="TableGrid0"/>
+        <w:tblW w:w="8238" w:type="dxa"/>
+        <w:tblInd w:w="5" w:type="dxa"/>
+        <w:tblCellMar>
+          <w:top w:w="53" w:type="dxa"/>
+          <w:left w:w="108" w:type="dxa"/>
+          <w:right w:w="58" w:type="dxa"/>
+        </w:tblCellMar>
+        <w:tblLook w:val="04A0" w:firstRow="1" w:lastRow="0" w:firstColumn="1" w:lastColumn="0" w:noHBand="0" w:noVBand="1"/>
+      </w:tblPr>
+      <w:tblGrid>
+        <w:gridCol w:w="2743"/>
+        <w:gridCol w:w="2746"/>
+        <w:gridCol w:w="2749"/>
+      </w:tblGrid>
+      <w:tr>
+        <w:trPr>
+          <w:trHeight w:val="509"/>
+        </w:trPr>
+        <w:tc>
+          <w:tcPr>
+            <w:tcW w:w="2744" w:type="dxa"/>
+            <w:tcBorders>
+              <w:top w:val="single" w:sz="4" w:space="0" w:color="000000"/>
+              <w:left w:val="single" w:sz="4" w:space="0" w:color="000000"/>
+              <w:bottom w:val="single" w:sz="4" w:space="0" w:color="000000"/>
+              <w:right w:val="nil"/>
+            </w:tcBorders>
+            <w:hideMark/>
+          </w:tcPr>
+          <w:p>
+            <w:pPr>
+              <w:pStyle w:val="Heading2"/>
+            </w:pPr>
+            <w:r>
+              <w:rPr>
+                <w:rFonts w:asciiTheme="minorHAnsi" w:hAnsiTheme="minorHAnsi" w:cstheme="minorHAnsi"/>
+                <w:sz w:val="28"/>
+                <w:szCs w:val="28"/>
+              </w:rPr>
+              <w:t>Reliability</w:t>
+            </w:r>
+            <w:r>
+              <w:t xml:space="preserve"> </w:t>
+            </w:r>
+          </w:p>
+        </w:tc>
+        <w:tc>
+          <w:tcPr>
+            <w:tcW w:w="2746" w:type="dxa"/>
+            <w:tcBorders>
+              <w:top w:val="single" w:sz="4" w:space="0" w:color="000000"/>
+              <w:left w:val="nil"/>
+              <w:bottom w:val="single" w:sz="4" w:space="0" w:color="000000"/>
+              <w:right w:val="nil"/>
+            </w:tcBorders>
+          </w:tcPr>
+          <w:p>
+            <w:pPr>
+              <w:spacing w:after="160" w:line="256" w:lineRule="auto"/>
+            </w:pPr>
+          </w:p>
+        </w:tc>
+        <w:tc>
+          <w:tcPr>
+            <w:tcW w:w="2749" w:type="dxa"/>
+            <w:tcBorders>
+              <w:top w:val="single" w:sz="4" w:space="0" w:color="000000"/>
+              <w:left w:val="nil"/>
+              <w:bottom w:val="single" w:sz="4" w:space="0" w:color="000000"/>
+              <w:right w:val="single" w:sz="4" w:space="0" w:color="000000"/>
+            </w:tcBorders>
+          </w:tcPr>
+          <w:p>
+            <w:pPr>
+              <w:spacing w:after="160" w:line="256" w:lineRule="auto"/>
+            </w:pPr>
+          </w:p>
+        </w:tc>
+      </w:tr>
+      <w:tr>
+        <w:trPr>
+          <w:trHeight w:val="850"/>
+        </w:trPr>
+        <w:tc>
+          <w:tcPr>
+            <w:tcW w:w="2744" w:type="dxa"/>
+            <w:tcBorders>
+              <w:top w:val="single" w:sz="4" w:space="0" w:color="000000"/>
+              <w:left w:val="single" w:sz="4" w:space="0" w:color="000000"/>
+              <w:bottom w:val="single" w:sz="4" w:space="0" w:color="000000"/>
+              <w:right w:val="single" w:sz="4" w:space="0" w:color="000000"/>
+            </w:tcBorders>
+            <w:hideMark/>
+          </w:tcPr>
+          <w:p>
+            <w:pPr>
+              <w:spacing w:after="24" w:line="256" w:lineRule="auto"/>
+            </w:pPr>
+            <w:r>
+              <w:t xml:space="preserve">Non-Functional </w:t>
+            </w:r>
+          </w:p>
+          <w:p>
+            <w:pPr>
+              <w:spacing w:line="256" w:lineRule="auto"/>
+            </w:pPr>
+            <w:r>
+              <w:t xml:space="preserve">Requirement </w:t>
+            </w:r>
+          </w:p>
+        </w:tc>
+        <w:tc>
+          <w:tcPr>
+            <w:tcW w:w="2746" w:type="dxa"/>
+            <w:tcBorders>
+              <w:top w:val="single" w:sz="4" w:space="0" w:color="000000"/>
+              <w:left w:val="single" w:sz="4" w:space="0" w:color="000000"/>
+              <w:bottom w:val="single" w:sz="4" w:space="0" w:color="000000"/>
+              <w:right w:val="single" w:sz="4" w:space="0" w:color="000000"/>
+            </w:tcBorders>
+            <w:hideMark/>
+          </w:tcPr>
+          <w:p>
+            <w:pPr>
+              <w:spacing w:line="256" w:lineRule="auto"/>
+            </w:pPr>
+            <w:r>
+              <w:t xml:space="preserve">Justification </w:t>
+            </w:r>
+          </w:p>
+        </w:tc>
+        <w:tc>
+          <w:tcPr>
+            <w:tcW w:w="2749" w:type="dxa"/>
+            <w:tcBorders>
+              <w:top w:val="single" w:sz="4" w:space="0" w:color="000000"/>
+              <w:left w:val="single" w:sz="4" w:space="0" w:color="000000"/>
+              <w:bottom w:val="single" w:sz="4" w:space="0" w:color="000000"/>
+              <w:right w:val="single" w:sz="4" w:space="0" w:color="000000"/>
+            </w:tcBorders>
+            <w:hideMark/>
+          </w:tcPr>
+          <w:p>
+            <w:pPr>
+              <w:spacing w:line="256" w:lineRule="auto"/>
+            </w:pPr>
+            <w:r>
+              <w:t xml:space="preserve">KPI </w:t>
+            </w:r>
+          </w:p>
+        </w:tc>
+      </w:tr>
+      <w:tr>
+        <w:trPr>
+          <w:trHeight w:val="2545"/>
+        </w:trPr>
+        <w:tc>
+          <w:tcPr>
+            <w:tcW w:w="2744" w:type="dxa"/>
+            <w:tcBorders>
+              <w:top w:val="single" w:sz="4" w:space="0" w:color="000000"/>
+              <w:left w:val="single" w:sz="4" w:space="0" w:color="000000"/>
+              <w:bottom w:val="single" w:sz="4" w:space="0" w:color="000000"/>
+              <w:right w:val="single" w:sz="4" w:space="0" w:color="000000"/>
+            </w:tcBorders>
+            <w:hideMark/>
+          </w:tcPr>
+          <w:p>
+            <w:pPr>
+              <w:spacing w:line="256" w:lineRule="auto"/>
+            </w:pPr>
+            <w:r>
+              <w:t xml:space="preserve">The system must be available(up-time) 99.9% of the time, excluding scheduled maintenance </w:t>
+            </w:r>
+          </w:p>
+        </w:tc>
+        <w:tc>
+          <w:tcPr>
+            <w:tcW w:w="2746" w:type="dxa"/>
+            <w:tcBorders>
+              <w:top w:val="single" w:sz="4" w:space="0" w:color="000000"/>
+              <w:left w:val="single" w:sz="4" w:space="0" w:color="000000"/>
+              <w:bottom w:val="single" w:sz="4" w:space="0" w:color="000000"/>
+              <w:right w:val="single" w:sz="4" w:space="0" w:color="000000"/>
+            </w:tcBorders>
+            <w:hideMark/>
+          </w:tcPr>
+          <w:p>
+            <w:pPr>
+              <w:spacing w:line="256" w:lineRule="auto"/>
+            </w:pPr>
+            <w:r>
+              <w:t xml:space="preserve">The platform must be consistently accessible to customers for ordering and reservations. Downtime directly impacts revenue and customer trust. </w:t>
+            </w:r>
+          </w:p>
+        </w:tc>
+        <w:tc>
+          <w:tcPr>
+            <w:tcW w:w="2749" w:type="dxa"/>
+            <w:tcBorders>
+              <w:top w:val="single" w:sz="4" w:space="0" w:color="000000"/>
+              <w:left w:val="single" w:sz="4" w:space="0" w:color="000000"/>
+              <w:bottom w:val="single" w:sz="4" w:space="0" w:color="000000"/>
+              <w:right w:val="single" w:sz="4" w:space="0" w:color="000000"/>
+            </w:tcBorders>
+            <w:hideMark/>
+          </w:tcPr>
+          <w:p>
+            <w:pPr>
+              <w:spacing w:line="256" w:lineRule="auto"/>
+            </w:pPr>
+            <w:r>
+              <w:t xml:space="preserve">99.9% uptime measured monthly; scheduled maintenance communicated ≥ 24 hours in advance. </w:t>
+            </w:r>
+          </w:p>
+        </w:tc>
+      </w:tr>
+      <w:tr>
+        <w:trPr>
+          <w:trHeight w:val="1769"/>
+        </w:trPr>
+        <w:tc>
+          <w:tcPr>
+            <w:tcW w:w="2744" w:type="dxa"/>
+            <w:tcBorders>
+              <w:top w:val="single" w:sz="4" w:space="0" w:color="000000"/>
+              <w:left w:val="single" w:sz="4" w:space="0" w:color="000000"/>
+              <w:bottom w:val="single" w:sz="4" w:space="0" w:color="000000"/>
+              <w:right w:val="single" w:sz="4" w:space="0" w:color="000000"/>
+            </w:tcBorders>
+            <w:hideMark/>
+          </w:tcPr>
+          <w:p>
+            <w:pPr>
+              <w:spacing w:line="256" w:lineRule="auto"/>
+            </w:pPr>
+            <w:r>
+              <w:lastRenderedPageBreak/>
+              <w:t xml:space="preserve">Daily automatic backups with the ability to restore data if needed </w:t>
+            </w:r>
+          </w:p>
+        </w:tc>
+        <w:tc>
+          <w:tcPr>
+            <w:tcW w:w="2746" w:type="dxa"/>
+            <w:tcBorders>
+              <w:top w:val="single" w:sz="4" w:space="0" w:color="000000"/>
+              <w:left w:val="single" w:sz="4" w:space="0" w:color="000000"/>
+              <w:bottom w:val="single" w:sz="4" w:space="0" w:color="000000"/>
+              <w:right w:val="single" w:sz="4" w:space="0" w:color="000000"/>
+            </w:tcBorders>
+            <w:hideMark/>
+          </w:tcPr>
+          <w:p>
+            <w:pPr>
+              <w:spacing w:line="256" w:lineRule="auto"/>
+            </w:pPr>
+            <w:r>
+              <w:t xml:space="preserve">Backups protect against data loss from system failures, mistakes, or security issues, keeping the business running smoothly. </w:t>
+            </w:r>
+          </w:p>
+        </w:tc>
+        <w:tc>
+          <w:tcPr>
+            <w:tcW w:w="2749" w:type="dxa"/>
+            <w:tcBorders>
+              <w:top w:val="single" w:sz="4" w:space="0" w:color="000000"/>
+              <w:left w:val="single" w:sz="4" w:space="0" w:color="000000"/>
+              <w:bottom w:val="single" w:sz="4" w:space="0" w:color="000000"/>
+              <w:right w:val="single" w:sz="4" w:space="0" w:color="000000"/>
+            </w:tcBorders>
+            <w:hideMark/>
+          </w:tcPr>
+          <w:p>
+            <w:pPr>
+              <w:spacing w:line="256" w:lineRule="auto"/>
+              <w:ind w:right="33"/>
+            </w:pPr>
+            <w:r>
+              <w:t xml:space="preserve">Backups are verified every day; recovery can be completed within 4 hours if needed. </w:t>
+            </w:r>
+          </w:p>
+        </w:tc>
+      </w:tr>
+      <w:tr>
+        <w:trPr>
+          <w:trHeight w:val="641"/>
+        </w:trPr>
+        <w:tc>
+          <w:tcPr>
+            <w:tcW w:w="2744" w:type="dxa"/>
+            <w:tcBorders>
+              <w:top w:val="single" w:sz="4" w:space="0" w:color="000000"/>
+              <w:left w:val="single" w:sz="4" w:space="0" w:color="000000"/>
+              <w:bottom w:val="single" w:sz="4" w:space="0" w:color="000000"/>
+              <w:right w:val="nil"/>
+            </w:tcBorders>
+            <w:vAlign w:val="bottom"/>
+            <w:hideMark/>
+          </w:tcPr>
+          <w:p>
+            <w:pPr>
+              <w:spacing w:line="256" w:lineRule="auto"/>
+              <w:rPr>
+                <w:sz w:val="28"/>
+                <w:szCs w:val="28"/>
+              </w:rPr>
+            </w:pPr>
+            <w:r>
+              <w:rPr>
+                <w:color w:val="0F4761"/>
+                <w:sz w:val="28"/>
+                <w:szCs w:val="28"/>
+              </w:rPr>
+              <w:t xml:space="preserve">Usability </w:t>
+            </w:r>
+          </w:p>
+        </w:tc>
+        <w:tc>
+          <w:tcPr>
+            <w:tcW w:w="2746" w:type="dxa"/>
+            <w:tcBorders>
+              <w:top w:val="single" w:sz="4" w:space="0" w:color="000000"/>
+              <w:left w:val="nil"/>
+              <w:bottom w:val="single" w:sz="4" w:space="0" w:color="000000"/>
+              <w:right w:val="nil"/>
+            </w:tcBorders>
+          </w:tcPr>
+          <w:p>
+            <w:pPr>
+              <w:spacing w:after="160" w:line="256" w:lineRule="auto"/>
+            </w:pPr>
+          </w:p>
+        </w:tc>
+        <w:tc>
+          <w:tcPr>
+            <w:tcW w:w="2749" w:type="dxa"/>
+            <w:tcBorders>
+              <w:top w:val="single" w:sz="4" w:space="0" w:color="000000"/>
+              <w:left w:val="nil"/>
+              <w:bottom w:val="single" w:sz="4" w:space="0" w:color="000000"/>
+              <w:right w:val="single" w:sz="4" w:space="0" w:color="000000"/>
+            </w:tcBorders>
+          </w:tcPr>
+          <w:p>
+            <w:pPr>
+              <w:spacing w:after="160" w:line="256" w:lineRule="auto"/>
+            </w:pPr>
+          </w:p>
+        </w:tc>
+      </w:tr>
+      <w:tr>
+        <w:trPr>
+          <w:trHeight w:val="850"/>
+        </w:trPr>
+        <w:tc>
+          <w:tcPr>
+            <w:tcW w:w="2744" w:type="dxa"/>
+            <w:tcBorders>
+              <w:top w:val="single" w:sz="4" w:space="0" w:color="000000"/>
+              <w:left w:val="single" w:sz="4" w:space="0" w:color="000000"/>
+              <w:bottom w:val="single" w:sz="4" w:space="0" w:color="000000"/>
+              <w:right w:val="single" w:sz="4" w:space="0" w:color="000000"/>
+            </w:tcBorders>
+            <w:hideMark/>
+          </w:tcPr>
+          <w:p>
+            <w:pPr>
+              <w:spacing w:after="24" w:line="256" w:lineRule="auto"/>
+            </w:pPr>
+            <w:r>
+              <w:t xml:space="preserve">Non-Functional </w:t>
+            </w:r>
+          </w:p>
+          <w:p>
+            <w:pPr>
+              <w:spacing w:line="256" w:lineRule="auto"/>
+            </w:pPr>
+            <w:r>
+              <w:t xml:space="preserve">Requirement </w:t>
+            </w:r>
+          </w:p>
+        </w:tc>
+        <w:tc>
+          <w:tcPr>
+            <w:tcW w:w="2746" w:type="dxa"/>
+            <w:tcBorders>
+              <w:top w:val="single" w:sz="4" w:space="0" w:color="000000"/>
+              <w:left w:val="single" w:sz="4" w:space="0" w:color="000000"/>
+              <w:bottom w:val="single" w:sz="4" w:space="0" w:color="000000"/>
+              <w:right w:val="single" w:sz="4" w:space="0" w:color="000000"/>
+            </w:tcBorders>
+            <w:hideMark/>
+          </w:tcPr>
+          <w:p>
+            <w:pPr>
+              <w:spacing w:line="256" w:lineRule="auto"/>
+            </w:pPr>
+            <w:r>
+              <w:t xml:space="preserve">Justification </w:t>
+            </w:r>
+          </w:p>
+        </w:tc>
+        <w:tc>
+          <w:tcPr>
+            <w:tcW w:w="2749" w:type="dxa"/>
+            <w:tcBorders>
+              <w:top w:val="single" w:sz="4" w:space="0" w:color="000000"/>
+              <w:left w:val="single" w:sz="4" w:space="0" w:color="000000"/>
+              <w:bottom w:val="single" w:sz="4" w:space="0" w:color="000000"/>
+              <w:right w:val="single" w:sz="4" w:space="0" w:color="000000"/>
+            </w:tcBorders>
+            <w:hideMark/>
+          </w:tcPr>
+          <w:p>
+            <w:pPr>
+              <w:spacing w:line="256" w:lineRule="auto"/>
+            </w:pPr>
+            <w:r>
+              <w:t xml:space="preserve">KPI </w:t>
+            </w:r>
+          </w:p>
+        </w:tc>
+      </w:tr>
+      <w:tr>
+        <w:trPr>
+          <w:trHeight w:val="1526"/>
+        </w:trPr>
+        <w:tc>
+          <w:tcPr>
+            <w:tcW w:w="2744" w:type="dxa"/>
+            <w:tcBorders>
+              <w:top w:val="single" w:sz="4" w:space="0" w:color="000000"/>
+              <w:left w:val="single" w:sz="4" w:space="0" w:color="000000"/>
+              <w:bottom w:val="single" w:sz="4" w:space="0" w:color="000000"/>
+              <w:right w:val="single" w:sz="4" w:space="0" w:color="000000"/>
+            </w:tcBorders>
+            <w:hideMark/>
+          </w:tcPr>
+          <w:p>
+            <w:pPr>
+              <w:spacing w:line="256" w:lineRule="auto"/>
+              <w:ind w:right="44"/>
+            </w:pPr>
+            <w:r>
+              <w:t xml:space="preserve">First-time users should be able to complete a booking within 5 minutes. </w:t>
+            </w:r>
+          </w:p>
+        </w:tc>
+        <w:tc>
+          <w:tcPr>
+            <w:tcW w:w="2746" w:type="dxa"/>
+            <w:tcBorders>
+              <w:top w:val="single" w:sz="4" w:space="0" w:color="000000"/>
+              <w:left w:val="single" w:sz="4" w:space="0" w:color="000000"/>
+              <w:bottom w:val="single" w:sz="4" w:space="0" w:color="000000"/>
+              <w:right w:val="single" w:sz="4" w:space="0" w:color="000000"/>
+            </w:tcBorders>
+            <w:hideMark/>
+          </w:tcPr>
+          <w:p>
+            <w:pPr>
+              <w:spacing w:line="256" w:lineRule="auto"/>
+            </w:pPr>
+            <w:r>
+              <w:t xml:space="preserve">A simple and intuitive booking process encourages adoption and reduces drop-offs </w:t>
+            </w:r>
+          </w:p>
+        </w:tc>
+        <w:tc>
+          <w:tcPr>
+            <w:tcW w:w="2749" w:type="dxa"/>
+            <w:tcBorders>
+              <w:top w:val="single" w:sz="4" w:space="0" w:color="000000"/>
+              <w:left w:val="single" w:sz="4" w:space="0" w:color="000000"/>
+              <w:bottom w:val="single" w:sz="4" w:space="0" w:color="000000"/>
+              <w:right w:val="single" w:sz="4" w:space="0" w:color="000000"/>
+            </w:tcBorders>
+            <w:hideMark/>
+          </w:tcPr>
+          <w:p>
+            <w:pPr>
+              <w:spacing w:line="256" w:lineRule="auto"/>
+            </w:pPr>
+            <w:r>
+              <w:t xml:space="preserve">90% of new users complete a booking in under 5 minutes during usability testing. </w:t>
+            </w:r>
+          </w:p>
+        </w:tc>
+      </w:tr>
+      <w:tr>
+        <w:trPr>
+          <w:trHeight w:val="1184"/>
+        </w:trPr>
+        <w:tc>
+          <w:tcPr>
+            <w:tcW w:w="2744" w:type="dxa"/>
+            <w:tcBorders>
+              <w:top w:val="single" w:sz="4" w:space="0" w:color="000000"/>
+              <w:left w:val="single" w:sz="4" w:space="0" w:color="000000"/>
+              <w:bottom w:val="single" w:sz="4" w:space="0" w:color="000000"/>
+              <w:right w:val="single" w:sz="4" w:space="0" w:color="000000"/>
+            </w:tcBorders>
+            <w:hideMark/>
+          </w:tcPr>
+          <w:p>
+            <w:pPr>
+              <w:spacing w:line="256" w:lineRule="auto"/>
+              <w:ind w:right="47"/>
+            </w:pPr>
+            <w:r>
+              <w:t xml:space="preserve">Returning users should be able to re-book a previous room type in under 2 minutes. </w:t>
+            </w:r>
+          </w:p>
+        </w:tc>
+        <w:tc>
+          <w:tcPr>
+            <w:tcW w:w="2746" w:type="dxa"/>
+            <w:tcBorders>
+              <w:top w:val="single" w:sz="4" w:space="0" w:color="000000"/>
+              <w:left w:val="single" w:sz="4" w:space="0" w:color="000000"/>
+              <w:bottom w:val="single" w:sz="4" w:space="0" w:color="000000"/>
+              <w:right w:val="single" w:sz="4" w:space="0" w:color="000000"/>
+            </w:tcBorders>
+            <w:hideMark/>
+          </w:tcPr>
+          <w:p>
+            <w:pPr>
+              <w:spacing w:line="256" w:lineRule="auto"/>
+            </w:pPr>
+            <w:r>
+              <w:t xml:space="preserve">Speed and convenience for loyal customers improve satisfaction and retention. </w:t>
+            </w:r>
+          </w:p>
+        </w:tc>
+        <w:tc>
+          <w:tcPr>
+            <w:tcW w:w="2749" w:type="dxa"/>
+            <w:tcBorders>
+              <w:top w:val="single" w:sz="4" w:space="0" w:color="000000"/>
+              <w:left w:val="single" w:sz="4" w:space="0" w:color="000000"/>
+              <w:bottom w:val="single" w:sz="4" w:space="0" w:color="000000"/>
+              <w:right w:val="single" w:sz="4" w:space="0" w:color="000000"/>
+            </w:tcBorders>
+            <w:hideMark/>
+          </w:tcPr>
+          <w:p>
+            <w:pPr>
+              <w:spacing w:line="256" w:lineRule="auto"/>
+            </w:pPr>
+            <w:r>
+              <w:t xml:space="preserve">Users with past bookings can re-book in under 2 minutes on average. </w:t>
+            </w:r>
+          </w:p>
+        </w:tc>
+      </w:tr>
+      <w:tr>
+        <w:trPr>
+          <w:trHeight w:val="1181"/>
+        </w:trPr>
+        <w:tc>
+          <w:tcPr>
+            <w:tcW w:w="2744" w:type="dxa"/>
+            <w:tcBorders>
+              <w:top w:val="single" w:sz="4" w:space="0" w:color="000000"/>
+              <w:left w:val="single" w:sz="4" w:space="0" w:color="000000"/>
+              <w:bottom w:val="single" w:sz="4" w:space="0" w:color="000000"/>
+              <w:right w:val="single" w:sz="4" w:space="0" w:color="000000"/>
+            </w:tcBorders>
+            <w:hideMark/>
+          </w:tcPr>
+          <w:p>
+            <w:pPr>
+              <w:spacing w:line="256" w:lineRule="auto"/>
+            </w:pPr>
+            <w:r>
+              <w:t xml:space="preserve">Error rates for critical tasks (booking, cancellation) should be below 2%. </w:t>
+            </w:r>
+          </w:p>
+        </w:tc>
+        <w:tc>
+          <w:tcPr>
+            <w:tcW w:w="2746" w:type="dxa"/>
+            <w:tcBorders>
+              <w:top w:val="single" w:sz="4" w:space="0" w:color="000000"/>
+              <w:left w:val="single" w:sz="4" w:space="0" w:color="000000"/>
+              <w:bottom w:val="single" w:sz="4" w:space="0" w:color="000000"/>
+              <w:right w:val="single" w:sz="4" w:space="0" w:color="000000"/>
+            </w:tcBorders>
+            <w:hideMark/>
+          </w:tcPr>
+          <w:p>
+            <w:pPr>
+              <w:spacing w:line="256" w:lineRule="auto"/>
+            </w:pPr>
+            <w:r>
+              <w:t xml:space="preserve">A well-designed system minimises user mistakes and frustration. </w:t>
+            </w:r>
+          </w:p>
+        </w:tc>
+        <w:tc>
+          <w:tcPr>
+            <w:tcW w:w="2749" w:type="dxa"/>
+            <w:tcBorders>
+              <w:top w:val="single" w:sz="4" w:space="0" w:color="000000"/>
+              <w:left w:val="single" w:sz="4" w:space="0" w:color="000000"/>
+              <w:bottom w:val="single" w:sz="4" w:space="0" w:color="000000"/>
+              <w:right w:val="single" w:sz="4" w:space="0" w:color="000000"/>
+            </w:tcBorders>
+            <w:hideMark/>
+          </w:tcPr>
+          <w:p>
+            <w:pPr>
+              <w:spacing w:line="256" w:lineRule="auto"/>
+            </w:pPr>
+            <w:r>
+              <w:t xml:space="preserve">Less than 2% of booking or cancellation attempts result in user error requiring correction. </w:t>
+            </w:r>
+          </w:p>
+        </w:tc>
+      </w:tr>
+      <w:tr>
+        <w:trPr>
+          <w:trHeight w:val="641"/>
+        </w:trPr>
+        <w:tc>
+          <w:tcPr>
+            <w:tcW w:w="2744" w:type="dxa"/>
+            <w:tcBorders>
+              <w:top w:val="single" w:sz="4" w:space="0" w:color="000000"/>
+              <w:left w:val="single" w:sz="4" w:space="0" w:color="000000"/>
+              <w:bottom w:val="single" w:sz="4" w:space="0" w:color="000000"/>
+              <w:right w:val="nil"/>
+            </w:tcBorders>
+            <w:vAlign w:val="bottom"/>
+            <w:hideMark/>
+          </w:tcPr>
+          <w:p>
+            <w:pPr>
+              <w:spacing w:line="256" w:lineRule="auto"/>
+              <w:rPr>
+                <w:sz w:val="28"/>
+                <w:szCs w:val="28"/>
+              </w:rPr>
+            </w:pPr>
+            <w:r>
+              <w:rPr>
+                <w:color w:val="0F4761"/>
+                <w:sz w:val="28"/>
+                <w:szCs w:val="28"/>
+              </w:rPr>
+              <w:t xml:space="preserve">Accessibility </w:t>
+            </w:r>
+          </w:p>
+        </w:tc>
+        <w:tc>
+          <w:tcPr>
+            <w:tcW w:w="2746" w:type="dxa"/>
+            <w:tcBorders>
+              <w:top w:val="single" w:sz="4" w:space="0" w:color="000000"/>
+              <w:left w:val="nil"/>
+              <w:bottom w:val="single" w:sz="4" w:space="0" w:color="000000"/>
+              <w:right w:val="nil"/>
+            </w:tcBorders>
+          </w:tcPr>
+          <w:p>
+            <w:pPr>
+              <w:spacing w:after="160" w:line="256" w:lineRule="auto"/>
+            </w:pPr>
+          </w:p>
+        </w:tc>
+        <w:tc>
+          <w:tcPr>
+            <w:tcW w:w="2749" w:type="dxa"/>
+            <w:tcBorders>
+              <w:top w:val="single" w:sz="4" w:space="0" w:color="000000"/>
+              <w:left w:val="nil"/>
+              <w:bottom w:val="single" w:sz="4" w:space="0" w:color="000000"/>
+              <w:right w:val="single" w:sz="4" w:space="0" w:color="000000"/>
+            </w:tcBorders>
+          </w:tcPr>
+          <w:p>
+            <w:pPr>
+              <w:spacing w:after="160" w:line="256" w:lineRule="auto"/>
+            </w:pPr>
+          </w:p>
+        </w:tc>
+      </w:tr>
+      <w:tr>
+        <w:trPr>
+          <w:trHeight w:val="850"/>
+        </w:trPr>
+        <w:tc>
+          <w:tcPr>
+            <w:tcW w:w="2744" w:type="dxa"/>
+            <w:tcBorders>
+              <w:top w:val="single" w:sz="4" w:space="0" w:color="000000"/>
+              <w:left w:val="single" w:sz="4" w:space="0" w:color="000000"/>
+              <w:bottom w:val="single" w:sz="4" w:space="0" w:color="000000"/>
+              <w:right w:val="single" w:sz="4" w:space="0" w:color="000000"/>
+            </w:tcBorders>
+            <w:hideMark/>
+          </w:tcPr>
+          <w:p>
+            <w:pPr>
+              <w:spacing w:after="22" w:line="256" w:lineRule="auto"/>
+            </w:pPr>
+            <w:r>
+              <w:t xml:space="preserve">Non-Functional </w:t>
+            </w:r>
+          </w:p>
+          <w:p>
+            <w:pPr>
+              <w:spacing w:line="256" w:lineRule="auto"/>
+            </w:pPr>
+            <w:r>
+              <w:t xml:space="preserve">Requirement </w:t>
+            </w:r>
+          </w:p>
+        </w:tc>
+        <w:tc>
+          <w:tcPr>
+            <w:tcW w:w="2746" w:type="dxa"/>
+            <w:tcBorders>
+              <w:top w:val="single" w:sz="4" w:space="0" w:color="000000"/>
+              <w:left w:val="single" w:sz="4" w:space="0" w:color="000000"/>
+              <w:bottom w:val="single" w:sz="4" w:space="0" w:color="000000"/>
+              <w:right w:val="single" w:sz="4" w:space="0" w:color="000000"/>
+            </w:tcBorders>
+            <w:hideMark/>
+          </w:tcPr>
+          <w:p>
+            <w:pPr>
+              <w:spacing w:line="256" w:lineRule="auto"/>
+            </w:pPr>
+            <w:r>
+              <w:t xml:space="preserve">Justification </w:t>
+            </w:r>
+          </w:p>
+        </w:tc>
+        <w:tc>
+          <w:tcPr>
+            <w:tcW w:w="2749" w:type="dxa"/>
+            <w:tcBorders>
+              <w:top w:val="single" w:sz="4" w:space="0" w:color="000000"/>
+              <w:left w:val="single" w:sz="4" w:space="0" w:color="000000"/>
+              <w:bottom w:val="single" w:sz="4" w:space="0" w:color="000000"/>
+              <w:right w:val="single" w:sz="4" w:space="0" w:color="000000"/>
+            </w:tcBorders>
+            <w:hideMark/>
+          </w:tcPr>
+          <w:p>
+            <w:pPr>
+              <w:spacing w:line="256" w:lineRule="auto"/>
+            </w:pPr>
+            <w:r>
+              <w:t xml:space="preserve">KPI </w:t>
+            </w:r>
+          </w:p>
+        </w:tc>
+      </w:tr>
+      <w:tr>
+        <w:trPr>
+          <w:trHeight w:val="1366"/>
+        </w:trPr>
+        <w:tc>
+          <w:tcPr>
+            <w:tcW w:w="2744" w:type="dxa"/>
+            <w:tcBorders>
+              <w:top w:val="single" w:sz="4" w:space="0" w:color="000000"/>
+              <w:left w:val="single" w:sz="4" w:space="0" w:color="000000"/>
+              <w:bottom w:val="single" w:sz="4" w:space="0" w:color="000000"/>
+              <w:right w:val="single" w:sz="4" w:space="0" w:color="000000"/>
+            </w:tcBorders>
+            <w:hideMark/>
+          </w:tcPr>
+          <w:p>
+            <w:pPr>
+              <w:spacing w:line="276" w:lineRule="auto"/>
+            </w:pPr>
+            <w:r>
+              <w:t xml:space="preserve">Full compliance with WCAG 2.1 Level AA </w:t>
+            </w:r>
+          </w:p>
+          <w:p>
+            <w:pPr>
+              <w:spacing w:line="256" w:lineRule="auto"/>
+            </w:pPr>
+            <w:r>
+              <w:t xml:space="preserve">standards </w:t>
+            </w:r>
+          </w:p>
+        </w:tc>
+        <w:tc>
+          <w:tcPr>
+            <w:tcW w:w="2746" w:type="dxa"/>
+            <w:tcBorders>
+              <w:top w:val="single" w:sz="4" w:space="0" w:color="000000"/>
+              <w:left w:val="single" w:sz="4" w:space="0" w:color="000000"/>
+              <w:bottom w:val="single" w:sz="4" w:space="0" w:color="000000"/>
+              <w:right w:val="single" w:sz="4" w:space="0" w:color="000000"/>
+            </w:tcBorders>
+            <w:hideMark/>
+          </w:tcPr>
+          <w:p>
+            <w:pPr>
+              <w:spacing w:line="256" w:lineRule="auto"/>
+            </w:pPr>
+            <w:r>
+              <w:t xml:space="preserve">This ensures legal compliance, social responsibility, and access for users with disabilities, </w:t>
+            </w:r>
+          </w:p>
+        </w:tc>
+        <w:tc>
+          <w:tcPr>
+            <w:tcW w:w="2749" w:type="dxa"/>
+            <w:tcBorders>
+              <w:top w:val="single" w:sz="4" w:space="0" w:color="000000"/>
+              <w:left w:val="single" w:sz="4" w:space="0" w:color="000000"/>
+              <w:bottom w:val="single" w:sz="4" w:space="0" w:color="000000"/>
+              <w:right w:val="single" w:sz="4" w:space="0" w:color="000000"/>
+            </w:tcBorders>
+            <w:hideMark/>
+          </w:tcPr>
+          <w:p>
+            <w:pPr>
+              <w:spacing w:line="256" w:lineRule="auto"/>
+            </w:pPr>
+            <w:r>
+              <w:t>Zero Level A or AA violations reported via automated testing (</w:t>
+            </w:r>
+            <w:proofErr w:type="spellStart"/>
+            <w:r>
+              <w:t>axecore</w:t>
+            </w:r>
+            <w:proofErr w:type="spellEnd"/>
+            <w:r>
+              <w:t xml:space="preserve">) and manual screen </w:t>
+            </w:r>
+          </w:p>
+        </w:tc>
+      </w:tr>
+      <w:tr>
+        <w:trPr>
+          <w:trHeight w:val="850"/>
+        </w:trPr>
+        <w:tc>
+          <w:tcPr>
+            <w:tcW w:w="2744" w:type="dxa"/>
+            <w:tcBorders>
+              <w:top w:val="single" w:sz="4" w:space="0" w:color="000000"/>
+              <w:left w:val="single" w:sz="4" w:space="0" w:color="000000"/>
+              <w:bottom w:val="single" w:sz="4" w:space="0" w:color="000000"/>
+              <w:right w:val="single" w:sz="4" w:space="0" w:color="000000"/>
+            </w:tcBorders>
+          </w:tcPr>
+          <w:p>
+            <w:pPr>
+              <w:spacing w:after="160" w:line="256" w:lineRule="auto"/>
+            </w:pPr>
+          </w:p>
+        </w:tc>
+        <w:tc>
+          <w:tcPr>
+            <w:tcW w:w="2746" w:type="dxa"/>
+            <w:tcBorders>
+              <w:top w:val="single" w:sz="4" w:space="0" w:color="000000"/>
+              <w:left w:val="single" w:sz="4" w:space="0" w:color="000000"/>
+              <w:bottom w:val="single" w:sz="4" w:space="0" w:color="000000"/>
+              <w:right w:val="single" w:sz="4" w:space="0" w:color="000000"/>
+            </w:tcBorders>
+            <w:hideMark/>
+          </w:tcPr>
+          <w:p>
+            <w:pPr>
+              <w:spacing w:line="256" w:lineRule="auto"/>
+              <w:jc w:val="both"/>
+            </w:pPr>
+            <w:r>
+              <w:t xml:space="preserve">which in turn expands customer reach. </w:t>
+            </w:r>
+          </w:p>
+        </w:tc>
+        <w:tc>
+          <w:tcPr>
+            <w:tcW w:w="2749" w:type="dxa"/>
+            <w:tcBorders>
+              <w:top w:val="single" w:sz="4" w:space="0" w:color="000000"/>
+              <w:left w:val="single" w:sz="4" w:space="0" w:color="000000"/>
+              <w:bottom w:val="single" w:sz="4" w:space="0" w:color="000000"/>
+              <w:right w:val="single" w:sz="4" w:space="0" w:color="000000"/>
+            </w:tcBorders>
+            <w:hideMark/>
+          </w:tcPr>
+          <w:p>
+            <w:pPr>
+              <w:spacing w:line="256" w:lineRule="auto"/>
+            </w:pPr>
+            <w:r>
+              <w:t xml:space="preserve">reader (NVDA/JAWS) testing. </w:t>
+            </w:r>
+          </w:p>
+        </w:tc>
+      </w:tr>
+      <w:tr>
+        <w:trPr>
+          <w:trHeight w:val="1865"/>
+        </w:trPr>
+        <w:tc>
+          <w:tcPr>
+            <w:tcW w:w="2744" w:type="dxa"/>
+            <w:tcBorders>
+              <w:top w:val="single" w:sz="4" w:space="0" w:color="000000"/>
+              <w:left w:val="single" w:sz="4" w:space="0" w:color="000000"/>
+              <w:bottom w:val="single" w:sz="4" w:space="0" w:color="000000"/>
+              <w:right w:val="single" w:sz="4" w:space="0" w:color="000000"/>
+            </w:tcBorders>
+            <w:hideMark/>
+          </w:tcPr>
+          <w:p>
+            <w:pPr>
+              <w:spacing w:line="256" w:lineRule="auto"/>
+            </w:pPr>
+            <w:r>
+              <w:t xml:space="preserve">All application functionality is operable and accessible via keyboard navigation alone. </w:t>
+            </w:r>
+          </w:p>
+        </w:tc>
+        <w:tc>
+          <w:tcPr>
+            <w:tcW w:w="2746" w:type="dxa"/>
+            <w:tcBorders>
+              <w:top w:val="single" w:sz="4" w:space="0" w:color="000000"/>
+              <w:left w:val="single" w:sz="4" w:space="0" w:color="000000"/>
+              <w:bottom w:val="single" w:sz="4" w:space="0" w:color="000000"/>
+              <w:right w:val="single" w:sz="4" w:space="0" w:color="000000"/>
+            </w:tcBorders>
+            <w:hideMark/>
+          </w:tcPr>
+          <w:p>
+            <w:pPr>
+              <w:spacing w:line="256" w:lineRule="auto"/>
+            </w:pPr>
+            <w:r>
+              <w:t xml:space="preserve">Users with motor impairments or who cannot use a mouse must be able to access all features. </w:t>
+            </w:r>
+          </w:p>
+        </w:tc>
+        <w:tc>
+          <w:tcPr>
+            <w:tcW w:w="2749" w:type="dxa"/>
+            <w:tcBorders>
+              <w:top w:val="single" w:sz="4" w:space="0" w:color="000000"/>
+              <w:left w:val="single" w:sz="4" w:space="0" w:color="000000"/>
+              <w:bottom w:val="single" w:sz="4" w:space="0" w:color="000000"/>
+              <w:right w:val="single" w:sz="4" w:space="0" w:color="000000"/>
+            </w:tcBorders>
+            <w:hideMark/>
+          </w:tcPr>
+          <w:p>
+            <w:pPr>
+              <w:spacing w:line="276" w:lineRule="auto"/>
+            </w:pPr>
+            <w:r>
+              <w:t xml:space="preserve">100% of interactive elements are focusable, navigable, and actionable using only a keyboard </w:t>
+            </w:r>
+          </w:p>
+          <w:p>
+            <w:pPr>
+              <w:spacing w:line="256" w:lineRule="auto"/>
+            </w:pPr>
+            <w:r>
+              <w:t xml:space="preserve">(Tab, Enter, Arrow keys). </w:t>
+            </w:r>
+          </w:p>
+        </w:tc>
+      </w:tr>
+      <w:tr>
+        <w:trPr>
+          <w:trHeight w:val="1477"/>
+        </w:trPr>
+        <w:tc>
+          <w:tcPr>
+            <w:tcW w:w="2744" w:type="dxa"/>
+            <w:tcBorders>
+              <w:top w:val="single" w:sz="4" w:space="0" w:color="000000"/>
+              <w:left w:val="single" w:sz="4" w:space="0" w:color="000000"/>
+              <w:bottom w:val="single" w:sz="4" w:space="0" w:color="000000"/>
+              <w:right w:val="single" w:sz="4" w:space="0" w:color="000000"/>
+            </w:tcBorders>
+            <w:hideMark/>
+          </w:tcPr>
+          <w:p>
+            <w:pPr>
+              <w:spacing w:line="256" w:lineRule="auto"/>
+            </w:pPr>
+            <w:r>
+              <w:lastRenderedPageBreak/>
+              <w:t xml:space="preserve">Text alternatives (alt text) are provided for all nondecorative images and media. </w:t>
+            </w:r>
+          </w:p>
+        </w:tc>
+        <w:tc>
+          <w:tcPr>
+            <w:tcW w:w="2746" w:type="dxa"/>
+            <w:tcBorders>
+              <w:top w:val="single" w:sz="4" w:space="0" w:color="000000"/>
+              <w:left w:val="single" w:sz="4" w:space="0" w:color="000000"/>
+              <w:bottom w:val="single" w:sz="4" w:space="0" w:color="000000"/>
+              <w:right w:val="single" w:sz="4" w:space="0" w:color="000000"/>
+            </w:tcBorders>
+            <w:hideMark/>
+          </w:tcPr>
+          <w:p>
+            <w:pPr>
+              <w:spacing w:line="256" w:lineRule="auto"/>
+              <w:ind w:right="7"/>
+            </w:pPr>
+            <w:r>
+              <w:t xml:space="preserve">Supports users with visual impairments who rely on screen readers to understand visual content. </w:t>
+            </w:r>
+          </w:p>
+        </w:tc>
+        <w:tc>
+          <w:tcPr>
+            <w:tcW w:w="2749" w:type="dxa"/>
+            <w:tcBorders>
+              <w:top w:val="single" w:sz="4" w:space="0" w:color="000000"/>
+              <w:left w:val="single" w:sz="4" w:space="0" w:color="000000"/>
+              <w:bottom w:val="single" w:sz="4" w:space="0" w:color="000000"/>
+              <w:right w:val="single" w:sz="4" w:space="0" w:color="000000"/>
+            </w:tcBorders>
+            <w:hideMark/>
+          </w:tcPr>
+          <w:p>
+            <w:pPr>
+              <w:spacing w:line="256" w:lineRule="auto"/>
+            </w:pPr>
+            <w:r>
+              <w:t xml:space="preserve">All meaningful images have descriptive alt text; decorative images have null alt attributes. </w:t>
+            </w:r>
+          </w:p>
+        </w:tc>
+      </w:tr>
+    </w:tbl>
+    <w:p/>
     <w:p>
       <w:pPr>
         <w:pStyle w:val="Heading1"/>
@@ -4745,9 +8094,9 @@
     </w:lvl>
   </w:abstractNum>
   <w:abstractNum w:abstractNumId="1" w15:restartNumberingAfterBreak="0">
-    <w:nsid w:val="34027ACD"/>
+    <w:nsid w:val="185C4023"/>
     <w:multiLevelType w:val="hybridMultilevel"/>
-    <w:tmpl w:val="445E50A8"/>
+    <w:tmpl w:val="7B32A0B2"/>
     <w:lvl w:ilvl="0" w:tplc="08090001">
       <w:start w:val="1"/>
       <w:numFmt w:val="bullet"/>
@@ -4858,9 +8207,9 @@
     </w:lvl>
   </w:abstractNum>
   <w:abstractNum w:abstractNumId="2" w15:restartNumberingAfterBreak="0">
-    <w:nsid w:val="524C716A"/>
+    <w:nsid w:val="34027ACD"/>
     <w:multiLevelType w:val="hybridMultilevel"/>
-    <w:tmpl w:val="83445056"/>
+    <w:tmpl w:val="445E50A8"/>
     <w:lvl w:ilvl="0" w:tplc="08090001">
       <w:start w:val="1"/>
       <w:numFmt w:val="bullet"/>
@@ -4971,6 +8320,345 @@
     </w:lvl>
   </w:abstractNum>
   <w:abstractNum w:abstractNumId="3" w15:restartNumberingAfterBreak="0">
+    <w:nsid w:val="3F710BBE"/>
+    <w:multiLevelType w:val="hybridMultilevel"/>
+    <w:tmpl w:val="6AB28A3E"/>
+    <w:lvl w:ilvl="0" w:tplc="08090001">
+      <w:start w:val="1"/>
+      <w:numFmt w:val="bullet"/>
+      <w:lvlText w:val=""/>
+      <w:lvlJc w:val="left"/>
+      <w:pPr>
+        <w:ind w:left="720" w:hanging="360"/>
+      </w:pPr>
+      <w:rPr>
+        <w:rFonts w:ascii="Symbol" w:hAnsi="Symbol" w:hint="default"/>
+      </w:rPr>
+    </w:lvl>
+    <w:lvl w:ilvl="1" w:tplc="08090003" w:tentative="1">
+      <w:start w:val="1"/>
+      <w:numFmt w:val="bullet"/>
+      <w:lvlText w:val="o"/>
+      <w:lvlJc w:val="left"/>
+      <w:pPr>
+        <w:ind w:left="1440" w:hanging="360"/>
+      </w:pPr>
+      <w:rPr>
+        <w:rFonts w:ascii="Courier New" w:hAnsi="Courier New" w:cs="Courier New" w:hint="default"/>
+      </w:rPr>
+    </w:lvl>
+    <w:lvl w:ilvl="2" w:tplc="08090005" w:tentative="1">
+      <w:start w:val="1"/>
+      <w:numFmt w:val="bullet"/>
+      <w:lvlText w:val=""/>
+      <w:lvlJc w:val="left"/>
+      <w:pPr>
+        <w:ind w:left="2160" w:hanging="360"/>
+      </w:pPr>
+      <w:rPr>
+        <w:rFonts w:ascii="Wingdings" w:hAnsi="Wingdings" w:hint="default"/>
+      </w:rPr>
+    </w:lvl>
+    <w:lvl w:ilvl="3" w:tplc="08090001" w:tentative="1">
+      <w:start w:val="1"/>
+      <w:numFmt w:val="bullet"/>
+      <w:lvlText w:val=""/>
+      <w:lvlJc w:val="left"/>
+      <w:pPr>
+        <w:ind w:left="2880" w:hanging="360"/>
+      </w:pPr>
+      <w:rPr>
+        <w:rFonts w:ascii="Symbol" w:hAnsi="Symbol" w:hint="default"/>
+      </w:rPr>
+    </w:lvl>
+    <w:lvl w:ilvl="4" w:tplc="08090003" w:tentative="1">
+      <w:start w:val="1"/>
+      <w:numFmt w:val="bullet"/>
+      <w:lvlText w:val="o"/>
+      <w:lvlJc w:val="left"/>
+      <w:pPr>
+        <w:ind w:left="3600" w:hanging="360"/>
+      </w:pPr>
+      <w:rPr>
+        <w:rFonts w:ascii="Courier New" w:hAnsi="Courier New" w:cs="Courier New" w:hint="default"/>
+      </w:rPr>
+    </w:lvl>
+    <w:lvl w:ilvl="5" w:tplc="08090005" w:tentative="1">
+      <w:start w:val="1"/>
+      <w:numFmt w:val="bullet"/>
+      <w:lvlText w:val=""/>
+      <w:lvlJc w:val="left"/>
+      <w:pPr>
+        <w:ind w:left="4320" w:hanging="360"/>
+      </w:pPr>
+      <w:rPr>
+        <w:rFonts w:ascii="Wingdings" w:hAnsi="Wingdings" w:hint="default"/>
+      </w:rPr>
+    </w:lvl>
+    <w:lvl w:ilvl="6" w:tplc="08090001" w:tentative="1">
+      <w:start w:val="1"/>
+      <w:numFmt w:val="bullet"/>
+      <w:lvlText w:val=""/>
+      <w:lvlJc w:val="left"/>
+      <w:pPr>
+        <w:ind w:left="5040" w:hanging="360"/>
+      </w:pPr>
+      <w:rPr>
+        <w:rFonts w:ascii="Symbol" w:hAnsi="Symbol" w:hint="default"/>
+      </w:rPr>
+    </w:lvl>
+    <w:lvl w:ilvl="7" w:tplc="08090003" w:tentative="1">
+      <w:start w:val="1"/>
+      <w:numFmt w:val="bullet"/>
+      <w:lvlText w:val="o"/>
+      <w:lvlJc w:val="left"/>
+      <w:pPr>
+        <w:ind w:left="5760" w:hanging="360"/>
+      </w:pPr>
+      <w:rPr>
+        <w:rFonts w:ascii="Courier New" w:hAnsi="Courier New" w:cs="Courier New" w:hint="default"/>
+      </w:rPr>
+    </w:lvl>
+    <w:lvl w:ilvl="8" w:tplc="08090005" w:tentative="1">
+      <w:start w:val="1"/>
+      <w:numFmt w:val="bullet"/>
+      <w:lvlText w:val=""/>
+      <w:lvlJc w:val="left"/>
+      <w:pPr>
+        <w:ind w:left="6480" w:hanging="360"/>
+      </w:pPr>
+      <w:rPr>
+        <w:rFonts w:ascii="Wingdings" w:hAnsi="Wingdings" w:hint="default"/>
+      </w:rPr>
+    </w:lvl>
+  </w:abstractNum>
+  <w:abstractNum w:abstractNumId="4" w15:restartNumberingAfterBreak="0">
+    <w:nsid w:val="49201253"/>
+    <w:multiLevelType w:val="hybridMultilevel"/>
+    <w:tmpl w:val="70F4CF34"/>
+    <w:lvl w:ilvl="0" w:tplc="08090001">
+      <w:start w:val="1"/>
+      <w:numFmt w:val="bullet"/>
+      <w:lvlText w:val=""/>
+      <w:lvlJc w:val="left"/>
+      <w:pPr>
+        <w:ind w:left="720" w:hanging="360"/>
+      </w:pPr>
+      <w:rPr>
+        <w:rFonts w:ascii="Symbol" w:hAnsi="Symbol" w:hint="default"/>
+      </w:rPr>
+    </w:lvl>
+    <w:lvl w:ilvl="1" w:tplc="08090003" w:tentative="1">
+      <w:start w:val="1"/>
+      <w:numFmt w:val="bullet"/>
+      <w:lvlText w:val="o"/>
+      <w:lvlJc w:val="left"/>
+      <w:pPr>
+        <w:ind w:left="1440" w:hanging="360"/>
+      </w:pPr>
+      <w:rPr>
+        <w:rFonts w:ascii="Courier New" w:hAnsi="Courier New" w:cs="Courier New" w:hint="default"/>
+      </w:rPr>
+    </w:lvl>
+    <w:lvl w:ilvl="2" w:tplc="08090005" w:tentative="1">
+      <w:start w:val="1"/>
+      <w:numFmt w:val="bullet"/>
+      <w:lvlText w:val=""/>
+      <w:lvlJc w:val="left"/>
+      <w:pPr>
+        <w:ind w:left="2160" w:hanging="360"/>
+      </w:pPr>
+      <w:rPr>
+        <w:rFonts w:ascii="Wingdings" w:hAnsi="Wingdings" w:hint="default"/>
+      </w:rPr>
+    </w:lvl>
+    <w:lvl w:ilvl="3" w:tplc="08090001" w:tentative="1">
+      <w:start w:val="1"/>
+      <w:numFmt w:val="bullet"/>
+      <w:lvlText w:val=""/>
+      <w:lvlJc w:val="left"/>
+      <w:pPr>
+        <w:ind w:left="2880" w:hanging="360"/>
+      </w:pPr>
+      <w:rPr>
+        <w:rFonts w:ascii="Symbol" w:hAnsi="Symbol" w:hint="default"/>
+      </w:rPr>
+    </w:lvl>
+    <w:lvl w:ilvl="4" w:tplc="08090003" w:tentative="1">
+      <w:start w:val="1"/>
+      <w:numFmt w:val="bullet"/>
+      <w:lvlText w:val="o"/>
+      <w:lvlJc w:val="left"/>
+      <w:pPr>
+        <w:ind w:left="3600" w:hanging="360"/>
+      </w:pPr>
+      <w:rPr>
+        <w:rFonts w:ascii="Courier New" w:hAnsi="Courier New" w:cs="Courier New" w:hint="default"/>
+      </w:rPr>
+    </w:lvl>
+    <w:lvl w:ilvl="5" w:tplc="08090005" w:tentative="1">
+      <w:start w:val="1"/>
+      <w:numFmt w:val="bullet"/>
+      <w:lvlText w:val=""/>
+      <w:lvlJc w:val="left"/>
+      <w:pPr>
+        <w:ind w:left="4320" w:hanging="360"/>
+      </w:pPr>
+      <w:rPr>
+        <w:rFonts w:ascii="Wingdings" w:hAnsi="Wingdings" w:hint="default"/>
+      </w:rPr>
+    </w:lvl>
+    <w:lvl w:ilvl="6" w:tplc="08090001" w:tentative="1">
+      <w:start w:val="1"/>
+      <w:numFmt w:val="bullet"/>
+      <w:lvlText w:val=""/>
+      <w:lvlJc w:val="left"/>
+      <w:pPr>
+        <w:ind w:left="5040" w:hanging="360"/>
+      </w:pPr>
+      <w:rPr>
+        <w:rFonts w:ascii="Symbol" w:hAnsi="Symbol" w:hint="default"/>
+      </w:rPr>
+    </w:lvl>
+    <w:lvl w:ilvl="7" w:tplc="08090003" w:tentative="1">
+      <w:start w:val="1"/>
+      <w:numFmt w:val="bullet"/>
+      <w:lvlText w:val="o"/>
+      <w:lvlJc w:val="left"/>
+      <w:pPr>
+        <w:ind w:left="5760" w:hanging="360"/>
+      </w:pPr>
+      <w:rPr>
+        <w:rFonts w:ascii="Courier New" w:hAnsi="Courier New" w:cs="Courier New" w:hint="default"/>
+      </w:rPr>
+    </w:lvl>
+    <w:lvl w:ilvl="8" w:tplc="08090005" w:tentative="1">
+      <w:start w:val="1"/>
+      <w:numFmt w:val="bullet"/>
+      <w:lvlText w:val=""/>
+      <w:lvlJc w:val="left"/>
+      <w:pPr>
+        <w:ind w:left="6480" w:hanging="360"/>
+      </w:pPr>
+      <w:rPr>
+        <w:rFonts w:ascii="Wingdings" w:hAnsi="Wingdings" w:hint="default"/>
+      </w:rPr>
+    </w:lvl>
+  </w:abstractNum>
+  <w:abstractNum w:abstractNumId="5" w15:restartNumberingAfterBreak="0">
+    <w:nsid w:val="524C716A"/>
+    <w:multiLevelType w:val="hybridMultilevel"/>
+    <w:tmpl w:val="83445056"/>
+    <w:lvl w:ilvl="0" w:tplc="08090001">
+      <w:start w:val="1"/>
+      <w:numFmt w:val="bullet"/>
+      <w:lvlText w:val=""/>
+      <w:lvlJc w:val="left"/>
+      <w:pPr>
+        <w:ind w:left="720" w:hanging="360"/>
+      </w:pPr>
+      <w:rPr>
+        <w:rFonts w:ascii="Symbol" w:hAnsi="Symbol" w:hint="default"/>
+      </w:rPr>
+    </w:lvl>
+    <w:lvl w:ilvl="1" w:tplc="08090003" w:tentative="1">
+      <w:start w:val="1"/>
+      <w:numFmt w:val="bullet"/>
+      <w:lvlText w:val="o"/>
+      <w:lvlJc w:val="left"/>
+      <w:pPr>
+        <w:ind w:left="1440" w:hanging="360"/>
+      </w:pPr>
+      <w:rPr>
+        <w:rFonts w:ascii="Courier New" w:hAnsi="Courier New" w:cs="Courier New" w:hint="default"/>
+      </w:rPr>
+    </w:lvl>
+    <w:lvl w:ilvl="2" w:tplc="08090005" w:tentative="1">
+      <w:start w:val="1"/>
+      <w:numFmt w:val="bullet"/>
+      <w:lvlText w:val=""/>
+      <w:lvlJc w:val="left"/>
+      <w:pPr>
+        <w:ind w:left="2160" w:hanging="360"/>
+      </w:pPr>
+      <w:rPr>
+        <w:rFonts w:ascii="Wingdings" w:hAnsi="Wingdings" w:hint="default"/>
+      </w:rPr>
+    </w:lvl>
+    <w:lvl w:ilvl="3" w:tplc="08090001" w:tentative="1">
+      <w:start w:val="1"/>
+      <w:numFmt w:val="bullet"/>
+      <w:lvlText w:val=""/>
+      <w:lvlJc w:val="left"/>
+      <w:pPr>
+        <w:ind w:left="2880" w:hanging="360"/>
+      </w:pPr>
+      <w:rPr>
+        <w:rFonts w:ascii="Symbol" w:hAnsi="Symbol" w:hint="default"/>
+      </w:rPr>
+    </w:lvl>
+    <w:lvl w:ilvl="4" w:tplc="08090003" w:tentative="1">
+      <w:start w:val="1"/>
+      <w:numFmt w:val="bullet"/>
+      <w:lvlText w:val="o"/>
+      <w:lvlJc w:val="left"/>
+      <w:pPr>
+        <w:ind w:left="3600" w:hanging="360"/>
+      </w:pPr>
+      <w:rPr>
+        <w:rFonts w:ascii="Courier New" w:hAnsi="Courier New" w:cs="Courier New" w:hint="default"/>
+      </w:rPr>
+    </w:lvl>
+    <w:lvl w:ilvl="5" w:tplc="08090005" w:tentative="1">
+      <w:start w:val="1"/>
+      <w:numFmt w:val="bullet"/>
+      <w:lvlText w:val=""/>
+      <w:lvlJc w:val="left"/>
+      <w:pPr>
+        <w:ind w:left="4320" w:hanging="360"/>
+      </w:pPr>
+      <w:rPr>
+        <w:rFonts w:ascii="Wingdings" w:hAnsi="Wingdings" w:hint="default"/>
+      </w:rPr>
+    </w:lvl>
+    <w:lvl w:ilvl="6" w:tplc="08090001" w:tentative="1">
+      <w:start w:val="1"/>
+      <w:numFmt w:val="bullet"/>
+      <w:lvlText w:val=""/>
+      <w:lvlJc w:val="left"/>
+      <w:pPr>
+        <w:ind w:left="5040" w:hanging="360"/>
+      </w:pPr>
+      <w:rPr>
+        <w:rFonts w:ascii="Symbol" w:hAnsi="Symbol" w:hint="default"/>
+      </w:rPr>
+    </w:lvl>
+    <w:lvl w:ilvl="7" w:tplc="08090003" w:tentative="1">
+      <w:start w:val="1"/>
+      <w:numFmt w:val="bullet"/>
+      <w:lvlText w:val="o"/>
+      <w:lvlJc w:val="left"/>
+      <w:pPr>
+        <w:ind w:left="5760" w:hanging="360"/>
+      </w:pPr>
+      <w:rPr>
+        <w:rFonts w:ascii="Courier New" w:hAnsi="Courier New" w:cs="Courier New" w:hint="default"/>
+      </w:rPr>
+    </w:lvl>
+    <w:lvl w:ilvl="8" w:tplc="08090005" w:tentative="1">
+      <w:start w:val="1"/>
+      <w:numFmt w:val="bullet"/>
+      <w:lvlText w:val=""/>
+      <w:lvlJc w:val="left"/>
+      <w:pPr>
+        <w:ind w:left="6480" w:hanging="360"/>
+      </w:pPr>
+      <w:rPr>
+        <w:rFonts w:ascii="Wingdings" w:hAnsi="Wingdings" w:hint="default"/>
+      </w:rPr>
+    </w:lvl>
+  </w:abstractNum>
+  <w:abstractNum w:abstractNumId="6" w15:restartNumberingAfterBreak="0">
     <w:nsid w:val="773030F4"/>
     <w:multiLevelType w:val="hybridMultilevel"/>
     <w:tmpl w:val="7116F88E"/>
@@ -5083,17 +8771,142 @@
       </w:rPr>
     </w:lvl>
   </w:abstractNum>
+  <w:abstractNum w:abstractNumId="7" w15:restartNumberingAfterBreak="0">
+    <w:nsid w:val="787F6086"/>
+    <w:multiLevelType w:val="hybridMultilevel"/>
+    <w:tmpl w:val="82928676"/>
+    <w:lvl w:ilvl="0" w:tplc="08090001">
+      <w:start w:val="1"/>
+      <w:numFmt w:val="bullet"/>
+      <w:lvlText w:val=""/>
+      <w:lvlJc w:val="left"/>
+      <w:pPr>
+        <w:ind w:left="720" w:hanging="360"/>
+      </w:pPr>
+      <w:rPr>
+        <w:rFonts w:ascii="Symbol" w:hAnsi="Symbol" w:hint="default"/>
+      </w:rPr>
+    </w:lvl>
+    <w:lvl w:ilvl="1" w:tplc="08090003" w:tentative="1">
+      <w:start w:val="1"/>
+      <w:numFmt w:val="bullet"/>
+      <w:lvlText w:val="o"/>
+      <w:lvlJc w:val="left"/>
+      <w:pPr>
+        <w:ind w:left="1440" w:hanging="360"/>
+      </w:pPr>
+      <w:rPr>
+        <w:rFonts w:ascii="Courier New" w:hAnsi="Courier New" w:cs="Courier New" w:hint="default"/>
+      </w:rPr>
+    </w:lvl>
+    <w:lvl w:ilvl="2" w:tplc="08090005" w:tentative="1">
+      <w:start w:val="1"/>
+      <w:numFmt w:val="bullet"/>
+      <w:lvlText w:val=""/>
+      <w:lvlJc w:val="left"/>
+      <w:pPr>
+        <w:ind w:left="2160" w:hanging="360"/>
+      </w:pPr>
+      <w:rPr>
+        <w:rFonts w:ascii="Wingdings" w:hAnsi="Wingdings" w:hint="default"/>
+      </w:rPr>
+    </w:lvl>
+    <w:lvl w:ilvl="3" w:tplc="08090001" w:tentative="1">
+      <w:start w:val="1"/>
+      <w:numFmt w:val="bullet"/>
+      <w:lvlText w:val=""/>
+      <w:lvlJc w:val="left"/>
+      <w:pPr>
+        <w:ind w:left="2880" w:hanging="360"/>
+      </w:pPr>
+      <w:rPr>
+        <w:rFonts w:ascii="Symbol" w:hAnsi="Symbol" w:hint="default"/>
+      </w:rPr>
+    </w:lvl>
+    <w:lvl w:ilvl="4" w:tplc="08090003" w:tentative="1">
+      <w:start w:val="1"/>
+      <w:numFmt w:val="bullet"/>
+      <w:lvlText w:val="o"/>
+      <w:lvlJc w:val="left"/>
+      <w:pPr>
+        <w:ind w:left="3600" w:hanging="360"/>
+      </w:pPr>
+      <w:rPr>
+        <w:rFonts w:ascii="Courier New" w:hAnsi="Courier New" w:cs="Courier New" w:hint="default"/>
+      </w:rPr>
+    </w:lvl>
+    <w:lvl w:ilvl="5" w:tplc="08090005" w:tentative="1">
+      <w:start w:val="1"/>
+      <w:numFmt w:val="bullet"/>
+      <w:lvlText w:val=""/>
+      <w:lvlJc w:val="left"/>
+      <w:pPr>
+        <w:ind w:left="4320" w:hanging="360"/>
+      </w:pPr>
+      <w:rPr>
+        <w:rFonts w:ascii="Wingdings" w:hAnsi="Wingdings" w:hint="default"/>
+      </w:rPr>
+    </w:lvl>
+    <w:lvl w:ilvl="6" w:tplc="08090001" w:tentative="1">
+      <w:start w:val="1"/>
+      <w:numFmt w:val="bullet"/>
+      <w:lvlText w:val=""/>
+      <w:lvlJc w:val="left"/>
+      <w:pPr>
+        <w:ind w:left="5040" w:hanging="360"/>
+      </w:pPr>
+      <w:rPr>
+        <w:rFonts w:ascii="Symbol" w:hAnsi="Symbol" w:hint="default"/>
+      </w:rPr>
+    </w:lvl>
+    <w:lvl w:ilvl="7" w:tplc="08090003" w:tentative="1">
+      <w:start w:val="1"/>
+      <w:numFmt w:val="bullet"/>
+      <w:lvlText w:val="o"/>
+      <w:lvlJc w:val="left"/>
+      <w:pPr>
+        <w:ind w:left="5760" w:hanging="360"/>
+      </w:pPr>
+      <w:rPr>
+        <w:rFonts w:ascii="Courier New" w:hAnsi="Courier New" w:cs="Courier New" w:hint="default"/>
+      </w:rPr>
+    </w:lvl>
+    <w:lvl w:ilvl="8" w:tplc="08090005" w:tentative="1">
+      <w:start w:val="1"/>
+      <w:numFmt w:val="bullet"/>
+      <w:lvlText w:val=""/>
+      <w:lvlJc w:val="left"/>
+      <w:pPr>
+        <w:ind w:left="6480" w:hanging="360"/>
+      </w:pPr>
+      <w:rPr>
+        <w:rFonts w:ascii="Wingdings" w:hAnsi="Wingdings" w:hint="default"/>
+      </w:rPr>
+    </w:lvl>
+  </w:abstractNum>
   <w:num w:numId="1">
-    <w:abstractNumId w:val="2"/>
+    <w:abstractNumId w:val="5"/>
   </w:num>
   <w:num w:numId="2">
-    <w:abstractNumId w:val="3"/>
+    <w:abstractNumId w:val="6"/>
   </w:num>
   <w:num w:numId="3">
     <w:abstractNumId w:val="0"/>
   </w:num>
   <w:num w:numId="4">
+    <w:abstractNumId w:val="2"/>
+  </w:num>
+  <w:num w:numId="5">
+    <w:abstractNumId w:val="3"/>
+  </w:num>
+  <w:num w:numId="6">
+    <w:abstractNumId w:val="4"/>
+  </w:num>
+  <w:num w:numId="7">
     <w:abstractNumId w:val="1"/>
+  </w:num>
+  <w:num w:numId="8">
+    <w:abstractNumId w:val="7"/>
   </w:num>
 </w:numbering>
 </file>
@@ -5715,6 +9528,25 @@
       <w:szCs w:val="24"/>
     </w:rPr>
   </w:style>
+  <w:style w:type="table" w:customStyle="1" w:styleId="TableGrid0">
+    <w:name w:val="TableGrid"/>
+    <w:rsid w:val="00CE4738"/>
+    <w:pPr>
+      <w:spacing w:after="0" w:line="240" w:lineRule="auto"/>
+    </w:pPr>
+    <w:rPr>
+      <w:rFonts w:eastAsiaTheme="minorEastAsia"/>
+      <w:lang w:eastAsia="en-GB"/>
+    </w:rPr>
+    <w:tblPr>
+      <w:tblCellMar>
+        <w:top w:w="0" w:type="dxa"/>
+        <w:left w:w="0" w:type="dxa"/>
+        <w:bottom w:w="0" w:type="dxa"/>
+        <w:right w:w="0" w:type="dxa"/>
+      </w:tblCellMar>
+    </w:tblPr>
+  </w:style>
 </w:styles>
 </file>
 

</xml_diff>

<commit_message>
Complete Task 1 proposal
</commit_message>
<xml_diff>
--- a/Task1_Proposal_721242_Chukwudolue_T.docx
+++ b/Task1_Proposal_721242_Chukwudolue_T.docx
@@ -995,7 +995,7 @@
           <w:r>
             <w:fldChar w:fldCharType="separate"/>
           </w:r>
-          <w:hyperlink w:anchor="_Toc224032086" w:history="1">
+          <w:hyperlink w:anchor="_Toc224299661" w:history="1">
             <w:r>
               <w:rPr>
                 <w:rStyle w:val="Hyperlink"/>
@@ -1024,7 +1024,7 @@
                 <w:noProof/>
                 <w:webHidden/>
               </w:rPr>
-              <w:instrText xml:space="preserve"> PAGEREF _Toc224032086 \h </w:instrText>
+              <w:instrText xml:space="preserve"> PAGEREF _Toc224299661 \h </w:instrText>
             </w:r>
             <w:r>
               <w:rPr>
@@ -1067,7 +1067,7 @@
               <w:lang w:eastAsia="en-GB"/>
             </w:rPr>
           </w:pPr>
-          <w:hyperlink w:anchor="_Toc224032087" w:history="1">
+          <w:hyperlink w:anchor="_Toc224299662" w:history="1">
             <w:r>
               <w:rPr>
                 <w:rStyle w:val="Hyperlink"/>
@@ -1094,7 +1094,7 @@
                 <w:noProof/>
                 <w:webHidden/>
               </w:rPr>
-              <w:instrText xml:space="preserve"> PAGEREF _Toc224032087 \h </w:instrText>
+              <w:instrText xml:space="preserve"> PAGEREF _Toc224299662 \h </w:instrText>
             </w:r>
             <w:r>
               <w:rPr>
@@ -1137,7 +1137,7 @@
               <w:lang w:eastAsia="en-GB"/>
             </w:rPr>
           </w:pPr>
-          <w:hyperlink w:anchor="_Toc224032088" w:history="1">
+          <w:hyperlink w:anchor="_Toc224299663" w:history="1">
             <w:r>
               <w:rPr>
                 <w:rStyle w:val="Hyperlink"/>
@@ -1164,7 +1164,7 @@
                 <w:noProof/>
                 <w:webHidden/>
               </w:rPr>
-              <w:instrText xml:space="preserve"> PAGEREF _Toc224032088 \h </w:instrText>
+              <w:instrText xml:space="preserve"> PAGEREF _Toc224299663 \h </w:instrText>
             </w:r>
             <w:r>
               <w:rPr>
@@ -1207,7 +1207,7 @@
               <w:lang w:eastAsia="en-GB"/>
             </w:rPr>
           </w:pPr>
-          <w:hyperlink w:anchor="_Toc224032089" w:history="1">
+          <w:hyperlink w:anchor="_Toc224299664" w:history="1">
             <w:r>
               <w:rPr>
                 <w:rStyle w:val="Hyperlink"/>
@@ -1234,7 +1234,7 @@
                 <w:noProof/>
                 <w:webHidden/>
               </w:rPr>
-              <w:instrText xml:space="preserve"> PAGEREF _Toc224032089 \h </w:instrText>
+              <w:instrText xml:space="preserve"> PAGEREF _Toc224299664 \h </w:instrText>
             </w:r>
             <w:r>
               <w:rPr>
@@ -1254,7 +1254,7 @@
                 <w:noProof/>
                 <w:webHidden/>
               </w:rPr>
-              <w:t>3</w:t>
+              <w:t>2</w:t>
             </w:r>
             <w:r>
               <w:rPr>
@@ -1277,7 +1277,7 @@
               <w:lang w:eastAsia="en-GB"/>
             </w:rPr>
           </w:pPr>
-          <w:hyperlink w:anchor="_Toc224032090" w:history="1">
+          <w:hyperlink w:anchor="_Toc224299665" w:history="1">
             <w:r>
               <w:rPr>
                 <w:rStyle w:val="Hyperlink"/>
@@ -1304,7 +1304,7 @@
                 <w:noProof/>
                 <w:webHidden/>
               </w:rPr>
-              <w:instrText xml:space="preserve"> PAGEREF _Toc224032090 \h </w:instrText>
+              <w:instrText xml:space="preserve"> PAGEREF _Toc224299665 \h </w:instrText>
             </w:r>
             <w:r>
               <w:rPr>
@@ -1347,7 +1347,7 @@
               <w:lang w:eastAsia="en-GB"/>
             </w:rPr>
           </w:pPr>
-          <w:hyperlink w:anchor="_Toc224032091" w:history="1">
+          <w:hyperlink w:anchor="_Toc224299666" w:history="1">
             <w:r>
               <w:rPr>
                 <w:rStyle w:val="Hyperlink"/>
@@ -1374,7 +1374,7 @@
                 <w:noProof/>
                 <w:webHidden/>
               </w:rPr>
-              <w:instrText xml:space="preserve"> PAGEREF _Toc224032091 \h </w:instrText>
+              <w:instrText xml:space="preserve"> PAGEREF _Toc224299666 \h </w:instrText>
             </w:r>
             <w:r>
               <w:rPr>
@@ -1417,7 +1417,7 @@
               <w:lang w:eastAsia="en-GB"/>
             </w:rPr>
           </w:pPr>
-          <w:hyperlink w:anchor="_Toc224032092" w:history="1">
+          <w:hyperlink w:anchor="_Toc224299667" w:history="1">
             <w:r>
               <w:rPr>
                 <w:rStyle w:val="Hyperlink"/>
@@ -1444,7 +1444,7 @@
                 <w:noProof/>
                 <w:webHidden/>
               </w:rPr>
-              <w:instrText xml:space="preserve"> PAGEREF _Toc224032092 \h </w:instrText>
+              <w:instrText xml:space="preserve"> PAGEREF _Toc224299667 \h </w:instrText>
             </w:r>
             <w:r>
               <w:rPr>
@@ -1464,7 +1464,7 @@
                 <w:noProof/>
                 <w:webHidden/>
               </w:rPr>
-              <w:t>4</w:t>
+              <w:t>3</w:t>
             </w:r>
             <w:r>
               <w:rPr>
@@ -1487,7 +1487,7 @@
               <w:lang w:eastAsia="en-GB"/>
             </w:rPr>
           </w:pPr>
-          <w:hyperlink w:anchor="_Toc224032093" w:history="1">
+          <w:hyperlink w:anchor="_Toc224299668" w:history="1">
             <w:r>
               <w:rPr>
                 <w:rStyle w:val="Hyperlink"/>
@@ -1516,7 +1516,7 @@
                 <w:noProof/>
                 <w:webHidden/>
               </w:rPr>
-              <w:instrText xml:space="preserve"> PAGEREF _Toc224032093 \h </w:instrText>
+              <w:instrText xml:space="preserve"> PAGEREF _Toc224299668 \h </w:instrText>
             </w:r>
             <w:r>
               <w:rPr>
@@ -1559,7 +1559,7 @@
               <w:lang w:eastAsia="en-GB"/>
             </w:rPr>
           </w:pPr>
-          <w:hyperlink w:anchor="_Toc224032094" w:history="1">
+          <w:hyperlink w:anchor="_Toc224299669" w:history="1">
             <w:r>
               <w:rPr>
                 <w:rStyle w:val="Hyperlink"/>
@@ -1588,7 +1588,7 @@
                 <w:noProof/>
                 <w:webHidden/>
               </w:rPr>
-              <w:instrText xml:space="preserve"> PAGEREF _Toc224032094 \h </w:instrText>
+              <w:instrText xml:space="preserve"> PAGEREF _Toc224299669 \h </w:instrText>
             </w:r>
             <w:r>
               <w:rPr>
@@ -1631,7 +1631,7 @@
               <w:lang w:eastAsia="en-GB"/>
             </w:rPr>
           </w:pPr>
-          <w:hyperlink w:anchor="_Toc224032095" w:history="1">
+          <w:hyperlink w:anchor="_Toc224299670" w:history="1">
             <w:r>
               <w:rPr>
                 <w:rStyle w:val="Hyperlink"/>
@@ -1660,7 +1660,7 @@
                 <w:noProof/>
                 <w:webHidden/>
               </w:rPr>
-              <w:instrText xml:space="preserve"> PAGEREF _Toc224032095 \h </w:instrText>
+              <w:instrText xml:space="preserve"> PAGEREF _Toc224299670 \h </w:instrText>
             </w:r>
             <w:r>
               <w:rPr>
@@ -1680,7 +1680,7 @@
                 <w:noProof/>
                 <w:webHidden/>
               </w:rPr>
-              <w:t>5</w:t>
+              <w:t>4</w:t>
             </w:r>
             <w:r>
               <w:rPr>
@@ -1703,7 +1703,7 @@
               <w:lang w:eastAsia="en-GB"/>
             </w:rPr>
           </w:pPr>
-          <w:hyperlink w:anchor="_Toc224032096" w:history="1">
+          <w:hyperlink w:anchor="_Toc224299671" w:history="1">
             <w:r>
               <w:rPr>
                 <w:rStyle w:val="Hyperlink"/>
@@ -1730,7 +1730,7 @@
                 <w:noProof/>
                 <w:webHidden/>
               </w:rPr>
-              <w:instrText xml:space="preserve"> PAGEREF _Toc224032096 \h </w:instrText>
+              <w:instrText xml:space="preserve"> PAGEREF _Toc224299671 \h </w:instrText>
             </w:r>
             <w:r>
               <w:rPr>
@@ -1750,7 +1750,7 @@
                 <w:noProof/>
                 <w:webHidden/>
               </w:rPr>
-              <w:t>5</w:t>
+              <w:t>4</w:t>
             </w:r>
             <w:r>
               <w:rPr>
@@ -1773,7 +1773,7 @@
               <w:lang w:eastAsia="en-GB"/>
             </w:rPr>
           </w:pPr>
-          <w:hyperlink w:anchor="_Toc224032097" w:history="1">
+          <w:hyperlink w:anchor="_Toc224299672" w:history="1">
             <w:r>
               <w:rPr>
                 <w:rStyle w:val="Hyperlink"/>
@@ -1800,7 +1800,7 @@
                 <w:noProof/>
                 <w:webHidden/>
               </w:rPr>
-              <w:instrText xml:space="preserve"> PAGEREF _Toc224032097 \h </w:instrText>
+              <w:instrText xml:space="preserve"> PAGEREF _Toc224299672 \h </w:instrText>
             </w:r>
             <w:r>
               <w:rPr>
@@ -1820,7 +1820,7 @@
                 <w:noProof/>
                 <w:webHidden/>
               </w:rPr>
-              <w:t>5</w:t>
+              <w:t>4</w:t>
             </w:r>
             <w:r>
               <w:rPr>
@@ -1843,7 +1843,7 @@
               <w:lang w:eastAsia="en-GB"/>
             </w:rPr>
           </w:pPr>
-          <w:hyperlink w:anchor="_Toc224032098" w:history="1">
+          <w:hyperlink w:anchor="_Toc224299673" w:history="1">
             <w:r>
               <w:rPr>
                 <w:rStyle w:val="Hyperlink"/>
@@ -1870,7 +1870,7 @@
                 <w:noProof/>
                 <w:webHidden/>
               </w:rPr>
-              <w:instrText xml:space="preserve"> PAGEREF _Toc224032098 \h </w:instrText>
+              <w:instrText xml:space="preserve"> PAGEREF _Toc224299673 \h </w:instrText>
             </w:r>
             <w:r>
               <w:rPr>
@@ -1890,7 +1890,7 @@
                 <w:noProof/>
                 <w:webHidden/>
               </w:rPr>
-              <w:t>5</w:t>
+              <w:t>4</w:t>
             </w:r>
             <w:r>
               <w:rPr>
@@ -1913,7 +1913,7 @@
               <w:lang w:eastAsia="en-GB"/>
             </w:rPr>
           </w:pPr>
-          <w:hyperlink w:anchor="_Toc224032099" w:history="1">
+          <w:hyperlink w:anchor="_Toc224299674" w:history="1">
             <w:r>
               <w:rPr>
                 <w:rStyle w:val="Hyperlink"/>
@@ -1940,7 +1940,7 @@
                 <w:noProof/>
                 <w:webHidden/>
               </w:rPr>
-              <w:instrText xml:space="preserve"> PAGEREF _Toc224032099 \h </w:instrText>
+              <w:instrText xml:space="preserve"> PAGEREF _Toc224299674 \h </w:instrText>
             </w:r>
             <w:r>
               <w:rPr>
@@ -1960,7 +1960,7 @@
                 <w:noProof/>
                 <w:webHidden/>
               </w:rPr>
-              <w:t>5</w:t>
+              <w:t>4</w:t>
             </w:r>
             <w:r>
               <w:rPr>
@@ -1983,7 +1983,7 @@
               <w:lang w:eastAsia="en-GB"/>
             </w:rPr>
           </w:pPr>
-          <w:hyperlink w:anchor="_Toc224032100" w:history="1">
+          <w:hyperlink w:anchor="_Toc224299675" w:history="1">
             <w:r>
               <w:rPr>
                 <w:rStyle w:val="Hyperlink"/>
@@ -2012,7 +2012,7 @@
                 <w:noProof/>
                 <w:webHidden/>
               </w:rPr>
-              <w:instrText xml:space="preserve"> PAGEREF _Toc224032100 \h </w:instrText>
+              <w:instrText xml:space="preserve"> PAGEREF _Toc224299675 \h </w:instrText>
             </w:r>
             <w:r>
               <w:rPr>
@@ -2032,7 +2032,7 @@
                 <w:noProof/>
                 <w:webHidden/>
               </w:rPr>
-              <w:t>11</w:t>
+              <w:t>9</w:t>
             </w:r>
             <w:r>
               <w:rPr>
@@ -2055,10 +2055,12 @@
               <w:lang w:eastAsia="en-GB"/>
             </w:rPr>
           </w:pPr>
-          <w:hyperlink w:anchor="_Toc224032101" w:history="1">
+          <w:hyperlink w:anchor="_Toc224299676" w:history="1">
             <w:r>
               <w:rPr>
                 <w:rStyle w:val="Hyperlink"/>
+                <w:b/>
+                <w:bCs/>
                 <w:noProof/>
               </w:rPr>
               <w:t>Performance</w:t>
@@ -2082,7 +2084,7 @@
                 <w:noProof/>
                 <w:webHidden/>
               </w:rPr>
-              <w:instrText xml:space="preserve"> PAGEREF _Toc224032101 \h </w:instrText>
+              <w:instrText xml:space="preserve"> PAGEREF _Toc224299676 \h </w:instrText>
             </w:r>
             <w:r>
               <w:rPr>
@@ -2102,7 +2104,7 @@
                 <w:noProof/>
                 <w:webHidden/>
               </w:rPr>
-              <w:t>11</w:t>
+              <w:t>9</w:t>
             </w:r>
             <w:r>
               <w:rPr>
@@ -2125,10 +2127,12 @@
               <w:lang w:eastAsia="en-GB"/>
             </w:rPr>
           </w:pPr>
-          <w:hyperlink w:anchor="_Toc224032102" w:history="1">
+          <w:hyperlink w:anchor="_Toc224299677" w:history="1">
             <w:r>
               <w:rPr>
                 <w:rStyle w:val="Hyperlink"/>
+                <w:b/>
+                <w:bCs/>
                 <w:noProof/>
               </w:rPr>
               <w:t>Security</w:t>
@@ -2152,7 +2156,7 @@
                 <w:noProof/>
                 <w:webHidden/>
               </w:rPr>
-              <w:instrText xml:space="preserve"> PAGEREF _Toc224032102 \h </w:instrText>
+              <w:instrText xml:space="preserve"> PAGEREF _Toc224299677 \h </w:instrText>
             </w:r>
             <w:r>
               <w:rPr>
@@ -2172,7 +2176,7 @@
                 <w:noProof/>
                 <w:webHidden/>
               </w:rPr>
-              <w:t>12</w:t>
+              <w:t>10</w:t>
             </w:r>
             <w:r>
               <w:rPr>
@@ -2195,10 +2199,12 @@
               <w:lang w:eastAsia="en-GB"/>
             </w:rPr>
           </w:pPr>
-          <w:hyperlink w:anchor="_Toc224032103" w:history="1">
+          <w:hyperlink w:anchor="_Toc224299678" w:history="1">
             <w:r>
               <w:rPr>
                 <w:rStyle w:val="Hyperlink"/>
+                <w:b/>
+                <w:bCs/>
                 <w:noProof/>
               </w:rPr>
               <w:t>Scalability</w:t>
@@ -2222,7 +2228,7 @@
                 <w:noProof/>
                 <w:webHidden/>
               </w:rPr>
-              <w:instrText xml:space="preserve"> PAGEREF _Toc224032103 \h </w:instrText>
+              <w:instrText xml:space="preserve"> PAGEREF _Toc224299678 \h </w:instrText>
             </w:r>
             <w:r>
               <w:rPr>
@@ -2242,7 +2248,7 @@
                 <w:noProof/>
                 <w:webHidden/>
               </w:rPr>
-              <w:t>12</w:t>
+              <w:t>10</w:t>
             </w:r>
             <w:r>
               <w:rPr>
@@ -2265,10 +2271,12 @@
               <w:lang w:eastAsia="en-GB"/>
             </w:rPr>
           </w:pPr>
-          <w:hyperlink w:anchor="_Toc224032104" w:history="1">
+          <w:hyperlink w:anchor="_Toc224299679" w:history="1">
             <w:r>
               <w:rPr>
                 <w:rStyle w:val="Hyperlink"/>
+                <w:b/>
+                <w:bCs/>
                 <w:noProof/>
               </w:rPr>
               <w:t>Capacity</w:t>
@@ -2292,7 +2300,7 @@
                 <w:noProof/>
                 <w:webHidden/>
               </w:rPr>
-              <w:instrText xml:space="preserve"> PAGEREF _Toc224032104 \h </w:instrText>
+              <w:instrText xml:space="preserve"> PAGEREF _Toc224299679 \h </w:instrText>
             </w:r>
             <w:r>
               <w:rPr>
@@ -2312,7 +2320,7 @@
                 <w:noProof/>
                 <w:webHidden/>
               </w:rPr>
-              <w:t>13</w:t>
+              <w:t>11</w:t>
             </w:r>
             <w:r>
               <w:rPr>
@@ -2335,10 +2343,12 @@
               <w:lang w:eastAsia="en-GB"/>
             </w:rPr>
           </w:pPr>
-          <w:hyperlink w:anchor="_Toc224032105" w:history="1">
+          <w:hyperlink w:anchor="_Toc224299680" w:history="1">
             <w:r>
               <w:rPr>
                 <w:rStyle w:val="Hyperlink"/>
+                <w:b/>
+                <w:bCs/>
                 <w:noProof/>
               </w:rPr>
               <w:t>Reliability</w:t>
@@ -2362,7 +2372,7 @@
                 <w:noProof/>
                 <w:webHidden/>
               </w:rPr>
-              <w:instrText xml:space="preserve"> PAGEREF _Toc224032105 \h </w:instrText>
+              <w:instrText xml:space="preserve"> PAGEREF _Toc224299680 \h </w:instrText>
             </w:r>
             <w:r>
               <w:rPr>
@@ -2382,7 +2392,7 @@
                 <w:noProof/>
                 <w:webHidden/>
               </w:rPr>
-              <w:t>13</w:t>
+              <w:t>11</w:t>
             </w:r>
             <w:r>
               <w:rPr>
@@ -2405,10 +2415,12 @@
               <w:lang w:eastAsia="en-GB"/>
             </w:rPr>
           </w:pPr>
-          <w:hyperlink w:anchor="_Toc224032106" w:history="1">
+          <w:hyperlink w:anchor="_Toc224299681" w:history="1">
             <w:r>
               <w:rPr>
                 <w:rStyle w:val="Hyperlink"/>
+                <w:b/>
+                <w:bCs/>
                 <w:noProof/>
               </w:rPr>
               <w:t>Usability</w:t>
@@ -2432,7 +2444,7 @@
                 <w:noProof/>
                 <w:webHidden/>
               </w:rPr>
-              <w:instrText xml:space="preserve"> PAGEREF _Toc224032106 \h </w:instrText>
+              <w:instrText xml:space="preserve"> PAGEREF _Toc224299681 \h </w:instrText>
             </w:r>
             <w:r>
               <w:rPr>
@@ -2452,7 +2464,7 @@
                 <w:noProof/>
                 <w:webHidden/>
               </w:rPr>
-              <w:t>14</w:t>
+              <w:t>12</w:t>
             </w:r>
             <w:r>
               <w:rPr>
@@ -2475,10 +2487,12 @@
               <w:lang w:eastAsia="en-GB"/>
             </w:rPr>
           </w:pPr>
-          <w:hyperlink w:anchor="_Toc224032107" w:history="1">
+          <w:hyperlink w:anchor="_Toc224299682" w:history="1">
             <w:r>
               <w:rPr>
                 <w:rStyle w:val="Hyperlink"/>
+                <w:b/>
+                <w:bCs/>
                 <w:noProof/>
               </w:rPr>
               <w:t>Accessibility</w:t>
@@ -2502,7 +2516,7 @@
                 <w:noProof/>
                 <w:webHidden/>
               </w:rPr>
-              <w:instrText xml:space="preserve"> PAGEREF _Toc224032107 \h </w:instrText>
+              <w:instrText xml:space="preserve"> PAGEREF _Toc224299682 \h </w:instrText>
             </w:r>
             <w:r>
               <w:rPr>
@@ -2522,7 +2536,7 @@
                 <w:noProof/>
                 <w:webHidden/>
               </w:rPr>
-              <w:t>14</w:t>
+              <w:t>12</w:t>
             </w:r>
             <w:r>
               <w:rPr>
@@ -2545,7 +2559,7 @@
               <w:lang w:eastAsia="en-GB"/>
             </w:rPr>
           </w:pPr>
-          <w:hyperlink w:anchor="_Toc224032108" w:history="1">
+          <w:hyperlink w:anchor="_Toc224299683" w:history="1">
             <w:r>
               <w:rPr>
                 <w:rStyle w:val="Hyperlink"/>
@@ -2574,7 +2588,7 @@
                 <w:noProof/>
                 <w:webHidden/>
               </w:rPr>
-              <w:instrText xml:space="preserve"> PAGEREF _Toc224032108 \h </w:instrText>
+              <w:instrText xml:space="preserve"> PAGEREF _Toc224299683 \h </w:instrText>
             </w:r>
             <w:r>
               <w:rPr>
@@ -2594,7 +2608,7 @@
                 <w:noProof/>
                 <w:webHidden/>
               </w:rPr>
-              <w:t>14</w:t>
+              <w:t>13</w:t>
             </w:r>
             <w:r>
               <w:rPr>
@@ -2617,7 +2631,7 @@
               <w:lang w:eastAsia="en-GB"/>
             </w:rPr>
           </w:pPr>
-          <w:hyperlink w:anchor="_Toc224032109" w:history="1">
+          <w:hyperlink w:anchor="_Toc224299684" w:history="1">
             <w:r>
               <w:rPr>
                 <w:rStyle w:val="Hyperlink"/>
@@ -2646,7 +2660,7 @@
                 <w:noProof/>
                 <w:webHidden/>
               </w:rPr>
-              <w:instrText xml:space="preserve"> PAGEREF _Toc224032109 \h </w:instrText>
+              <w:instrText xml:space="preserve"> PAGEREF _Toc224299684 \h </w:instrText>
             </w:r>
             <w:r>
               <w:rPr>
@@ -2666,7 +2680,217 @@
                 <w:noProof/>
                 <w:webHidden/>
               </w:rPr>
-              <w:t>15</w:t>
+              <w:t>13</w:t>
+            </w:r>
+            <w:r>
+              <w:rPr>
+                <w:noProof/>
+                <w:webHidden/>
+              </w:rPr>
+              <w:fldChar w:fldCharType="end"/>
+            </w:r>
+          </w:hyperlink>
+        </w:p>
+        <w:p>
+          <w:pPr>
+            <w:pStyle w:val="TOC3"/>
+            <w:tabs>
+              <w:tab w:val="right" w:leader="dot" w:pos="9016"/>
+            </w:tabs>
+            <w:rPr>
+              <w:rFonts w:eastAsiaTheme="minorEastAsia"/>
+              <w:noProof/>
+              <w:lang w:eastAsia="en-GB"/>
+            </w:rPr>
+          </w:pPr>
+          <w:hyperlink w:anchor="_Toc224299685" w:history="1">
+            <w:r>
+              <w:rPr>
+                <w:rStyle w:val="Hyperlink"/>
+                <w:noProof/>
+              </w:rPr>
+              <w:t>Project Risks (PR)</w:t>
+            </w:r>
+            <w:r>
+              <w:rPr>
+                <w:noProof/>
+                <w:webHidden/>
+              </w:rPr>
+              <w:tab/>
+            </w:r>
+            <w:r>
+              <w:rPr>
+                <w:noProof/>
+                <w:webHidden/>
+              </w:rPr>
+              <w:fldChar w:fldCharType="begin"/>
+            </w:r>
+            <w:r>
+              <w:rPr>
+                <w:noProof/>
+                <w:webHidden/>
+              </w:rPr>
+              <w:instrText xml:space="preserve"> PAGEREF _Toc224299685 \h </w:instrText>
+            </w:r>
+            <w:r>
+              <w:rPr>
+                <w:noProof/>
+                <w:webHidden/>
+              </w:rPr>
+            </w:r>
+            <w:r>
+              <w:rPr>
+                <w:noProof/>
+                <w:webHidden/>
+              </w:rPr>
+              <w:fldChar w:fldCharType="separate"/>
+            </w:r>
+            <w:r>
+              <w:rPr>
+                <w:noProof/>
+                <w:webHidden/>
+              </w:rPr>
+              <w:t>13</w:t>
+            </w:r>
+            <w:r>
+              <w:rPr>
+                <w:noProof/>
+                <w:webHidden/>
+              </w:rPr>
+              <w:fldChar w:fldCharType="end"/>
+            </w:r>
+          </w:hyperlink>
+        </w:p>
+        <w:p>
+          <w:pPr>
+            <w:pStyle w:val="TOC3"/>
+            <w:tabs>
+              <w:tab w:val="right" w:leader="dot" w:pos="9016"/>
+            </w:tabs>
+            <w:rPr>
+              <w:rFonts w:eastAsiaTheme="minorEastAsia"/>
+              <w:noProof/>
+              <w:lang w:eastAsia="en-GB"/>
+            </w:rPr>
+          </w:pPr>
+          <w:hyperlink w:anchor="_Toc224299686" w:history="1">
+            <w:r>
+              <w:rPr>
+                <w:rStyle w:val="Hyperlink"/>
+                <w:noProof/>
+              </w:rPr>
+              <w:t>Technical Risks (TR)</w:t>
+            </w:r>
+            <w:r>
+              <w:rPr>
+                <w:noProof/>
+                <w:webHidden/>
+              </w:rPr>
+              <w:tab/>
+            </w:r>
+            <w:r>
+              <w:rPr>
+                <w:noProof/>
+                <w:webHidden/>
+              </w:rPr>
+              <w:fldChar w:fldCharType="begin"/>
+            </w:r>
+            <w:r>
+              <w:rPr>
+                <w:noProof/>
+                <w:webHidden/>
+              </w:rPr>
+              <w:instrText xml:space="preserve"> PAGEREF _Toc224299686 \h </w:instrText>
+            </w:r>
+            <w:r>
+              <w:rPr>
+                <w:noProof/>
+                <w:webHidden/>
+              </w:rPr>
+            </w:r>
+            <w:r>
+              <w:rPr>
+                <w:noProof/>
+                <w:webHidden/>
+              </w:rPr>
+              <w:fldChar w:fldCharType="separate"/>
+            </w:r>
+            <w:r>
+              <w:rPr>
+                <w:noProof/>
+                <w:webHidden/>
+              </w:rPr>
+              <w:t>13</w:t>
+            </w:r>
+            <w:r>
+              <w:rPr>
+                <w:noProof/>
+                <w:webHidden/>
+              </w:rPr>
+              <w:fldChar w:fldCharType="end"/>
+            </w:r>
+          </w:hyperlink>
+        </w:p>
+        <w:p>
+          <w:pPr>
+            <w:pStyle w:val="TOC2"/>
+            <w:tabs>
+              <w:tab w:val="right" w:leader="dot" w:pos="9016"/>
+            </w:tabs>
+            <w:rPr>
+              <w:rFonts w:eastAsiaTheme="minorEastAsia"/>
+              <w:noProof/>
+              <w:lang w:eastAsia="en-GB"/>
+            </w:rPr>
+          </w:pPr>
+          <w:hyperlink w:anchor="_Toc224299687" w:history="1">
+            <w:r>
+              <w:rPr>
+                <w:rStyle w:val="Hyperlink"/>
+                <w:noProof/>
+              </w:rPr>
+              <w:t>Business Risks (BR)</w:t>
+            </w:r>
+            <w:r>
+              <w:rPr>
+                <w:noProof/>
+                <w:webHidden/>
+              </w:rPr>
+              <w:tab/>
+            </w:r>
+            <w:r>
+              <w:rPr>
+                <w:noProof/>
+                <w:webHidden/>
+              </w:rPr>
+              <w:fldChar w:fldCharType="begin"/>
+            </w:r>
+            <w:r>
+              <w:rPr>
+                <w:noProof/>
+                <w:webHidden/>
+              </w:rPr>
+              <w:instrText xml:space="preserve"> PAGEREF _Toc224299687 \h </w:instrText>
+            </w:r>
+            <w:r>
+              <w:rPr>
+                <w:noProof/>
+                <w:webHidden/>
+              </w:rPr>
+            </w:r>
+            <w:r>
+              <w:rPr>
+                <w:noProof/>
+                <w:webHidden/>
+              </w:rPr>
+              <w:fldChar w:fldCharType="separate"/>
+            </w:r>
+            <w:r>
+              <w:rPr>
+                <w:noProof/>
+                <w:webHidden/>
+              </w:rPr>
+              <w:t>13</w:t>
             </w:r>
             <w:r>
               <w:rPr>
@@ -2689,7 +2913,7 @@
               <w:lang w:eastAsia="en-GB"/>
             </w:rPr>
           </w:pPr>
-          <w:hyperlink w:anchor="_Toc224032110" w:history="1">
+          <w:hyperlink w:anchor="_Toc224299688" w:history="1">
             <w:r>
               <w:rPr>
                 <w:rStyle w:val="Hyperlink"/>
@@ -2718,7 +2942,7 @@
                 <w:noProof/>
                 <w:webHidden/>
               </w:rPr>
-              <w:instrText xml:space="preserve"> PAGEREF _Toc224032110 \h </w:instrText>
+              <w:instrText xml:space="preserve"> PAGEREF _Toc224299688 \h </w:instrText>
             </w:r>
             <w:r>
               <w:rPr>
@@ -2738,7 +2962,7 @@
                 <w:noProof/>
                 <w:webHidden/>
               </w:rPr>
-              <w:t>15</w:t>
+              <w:t>13</w:t>
             </w:r>
             <w:r>
               <w:rPr>
@@ -2761,7 +2985,7 @@
               <w:lang w:eastAsia="en-GB"/>
             </w:rPr>
           </w:pPr>
-          <w:hyperlink w:anchor="_Toc224032111" w:history="1">
+          <w:hyperlink w:anchor="_Toc224299689" w:history="1">
             <w:r>
               <w:rPr>
                 <w:rStyle w:val="Hyperlink"/>
@@ -2790,7 +3014,7 @@
                 <w:noProof/>
                 <w:webHidden/>
               </w:rPr>
-              <w:instrText xml:space="preserve"> PAGEREF _Toc224032111 \h </w:instrText>
+              <w:instrText xml:space="preserve"> PAGEREF _Toc224299689 \h </w:instrText>
             </w:r>
             <w:r>
               <w:rPr>
@@ -2810,7 +3034,7 @@
                 <w:noProof/>
                 <w:webHidden/>
               </w:rPr>
-              <w:t>15</w:t>
+              <w:t>14</w:t>
             </w:r>
             <w:r>
               <w:rPr>
@@ -2833,7 +3057,7 @@
               <w:lang w:eastAsia="en-GB"/>
             </w:rPr>
           </w:pPr>
-          <w:hyperlink w:anchor="_Toc224032112" w:history="1">
+          <w:hyperlink w:anchor="_Toc224299690" w:history="1">
             <w:r>
               <w:rPr>
                 <w:rStyle w:val="Hyperlink"/>
@@ -2862,7 +3086,7 @@
                 <w:noProof/>
                 <w:webHidden/>
               </w:rPr>
-              <w:instrText xml:space="preserve"> PAGEREF _Toc224032112 \h </w:instrText>
+              <w:instrText xml:space="preserve"> PAGEREF _Toc224299690 \h </w:instrText>
             </w:r>
             <w:r>
               <w:rPr>
@@ -2882,7 +3106,7 @@
                 <w:noProof/>
                 <w:webHidden/>
               </w:rPr>
-              <w:t>15</w:t>
+              <w:t>17</w:t>
             </w:r>
             <w:r>
               <w:rPr>
@@ -2905,7 +3129,7 @@
               <w:lang w:eastAsia="en-GB"/>
             </w:rPr>
           </w:pPr>
-          <w:hyperlink w:anchor="_Toc224032113" w:history="1">
+          <w:hyperlink w:anchor="_Toc224299691" w:history="1">
             <w:r>
               <w:rPr>
                 <w:rStyle w:val="Hyperlink"/>
@@ -2934,7 +3158,7 @@
                 <w:noProof/>
                 <w:webHidden/>
               </w:rPr>
-              <w:instrText xml:space="preserve"> PAGEREF _Toc224032113 \h </w:instrText>
+              <w:instrText xml:space="preserve"> PAGEREF _Toc224299691 \h </w:instrText>
             </w:r>
             <w:r>
               <w:rPr>
@@ -2954,7 +3178,7 @@
                 <w:noProof/>
                 <w:webHidden/>
               </w:rPr>
-              <w:t>15</w:t>
+              <w:t>19</w:t>
             </w:r>
             <w:r>
               <w:rPr>
@@ -2976,66 +3200,6 @@
         </w:p>
       </w:sdtContent>
     </w:sdt>
-    <w:p>
-      <w:pPr>
-        <w:pStyle w:val="Heading1"/>
-        <w:rPr>
-          <w:b/>
-          <w:bCs/>
-          <w:sz w:val="30"/>
-          <w:szCs w:val="30"/>
-        </w:rPr>
-      </w:pPr>
-    </w:p>
-    <w:p>
-      <w:pPr>
-        <w:pStyle w:val="Heading1"/>
-        <w:rPr>
-          <w:b/>
-          <w:bCs/>
-          <w:sz w:val="30"/>
-          <w:szCs w:val="30"/>
-        </w:rPr>
-      </w:pPr>
-    </w:p>
-    <w:p>
-      <w:pPr>
-        <w:pStyle w:val="Heading1"/>
-        <w:rPr>
-          <w:b/>
-          <w:bCs/>
-          <w:sz w:val="30"/>
-          <w:szCs w:val="30"/>
-        </w:rPr>
-      </w:pPr>
-    </w:p>
-    <w:p>
-      <w:pPr>
-        <w:pStyle w:val="Heading1"/>
-        <w:rPr>
-          <w:b/>
-          <w:bCs/>
-          <w:sz w:val="30"/>
-          <w:szCs w:val="30"/>
-        </w:rPr>
-      </w:pPr>
-    </w:p>
-    <w:p>
-      <w:pPr>
-        <w:pStyle w:val="Heading1"/>
-        <w:rPr>
-          <w:b/>
-          <w:bCs/>
-          <w:sz w:val="30"/>
-          <w:szCs w:val="30"/>
-        </w:rPr>
-      </w:pPr>
-    </w:p>
-    <w:p/>
-    <w:p/>
-    <w:p/>
-    <w:p/>
-    <w:p/>
     <w:p/>
     <w:p/>
     <w:p>
@@ -3048,7 +3212,7 @@
           <w:szCs w:val="30"/>
         </w:rPr>
       </w:pPr>
-      <w:bookmarkStart w:id="0" w:name="_Toc224032086"/>
+      <w:bookmarkStart w:id="0" w:name="_Toc224299661"/>
       <w:r>
         <w:rPr>
           <w:b/>
@@ -3056,6 +3220,7 @@
           <w:sz w:val="30"/>
           <w:szCs w:val="30"/>
         </w:rPr>
+        <w:lastRenderedPageBreak/>
         <w:t>BUSINESS CONTEXT</w:t>
       </w:r>
       <w:bookmarkEnd w:id="0"/>
@@ -3073,9 +3238,15 @@
     <w:p>
       <w:pPr>
         <w:pStyle w:val="Heading2"/>
+        <w:rPr>
+          <w:rFonts w:asciiTheme="minorHAnsi" w:hAnsiTheme="minorHAnsi"/>
+        </w:rPr>
       </w:pPr>
-      <w:bookmarkStart w:id="1" w:name="_Toc224032087"/>
+      <w:bookmarkStart w:id="1" w:name="_Toc224299662"/>
       <w:r>
+        <w:rPr>
+          <w:rFonts w:asciiTheme="minorHAnsi" w:hAnsiTheme="minorHAnsi"/>
+        </w:rPr>
         <w:t>Order Management</w:t>
       </w:r>
       <w:bookmarkEnd w:id="1"/>
@@ -3386,16 +3557,28 @@
     <w:p>
       <w:pPr>
         <w:pStyle w:val="Heading2"/>
+        <w:rPr>
+          <w:rFonts w:asciiTheme="minorHAnsi" w:hAnsiTheme="minorHAnsi"/>
+        </w:rPr>
       </w:pPr>
-      <w:bookmarkStart w:id="2" w:name="_Toc224032088"/>
+      <w:bookmarkStart w:id="2" w:name="_Toc224299663"/>
       <w:r>
+        <w:rPr>
+          <w:rFonts w:asciiTheme="minorHAnsi" w:hAnsiTheme="minorHAnsi"/>
+        </w:rPr>
         <w:t xml:space="preserve">Scheduling </w:t>
       </w:r>
       <w:r>
+        <w:rPr>
+          <w:rFonts w:asciiTheme="minorHAnsi" w:hAnsiTheme="minorHAnsi"/>
+        </w:rPr>
         <w:t>Features</w:t>
       </w:r>
       <w:bookmarkEnd w:id="2"/>
       <w:r>
+        <w:rPr>
+          <w:rFonts w:asciiTheme="minorHAnsi" w:hAnsiTheme="minorHAnsi"/>
+        </w:rPr>
         <w:t xml:space="preserve"> </w:t>
       </w:r>
     </w:p>
@@ -3437,11 +3620,7 @@
         <w:t>date</w:t>
       </w:r>
       <w:r>
-        <w:t xml:space="preserve">. Creating this system prevents customer inconvenience and dissatisfaction. It reduces </w:t>
-      </w:r>
-      <w:r>
-        <w:lastRenderedPageBreak/>
-        <w:t>uncertainty and improves customer services as they would know when and where to expect their order. Equally, this allows the business to manage and plan orders since they know when the orders are to be shipped. This prevents potential</w:t>
+        <w:t>. Creating this system prevents customer inconvenience and dissatisfaction. It reduces uncertainty and improves customer services as they would know when and where to expect their order. Equally, this allows the business to manage and plan orders since they know when the orders are to be shipped. This prevents potential</w:t>
       </w:r>
       <w:r>
         <w:t xml:space="preserve"> product wastage and</w:t>
@@ -3457,13 +3636,22 @@
     <w:p>
       <w:pPr>
         <w:pStyle w:val="Heading2"/>
+        <w:rPr>
+          <w:rFonts w:asciiTheme="minorHAnsi" w:hAnsiTheme="minorHAnsi"/>
+        </w:rPr>
       </w:pPr>
-      <w:bookmarkStart w:id="3" w:name="_Toc224032089"/>
+      <w:bookmarkStart w:id="3" w:name="_Toc224299664"/>
       <w:r>
+        <w:rPr>
+          <w:rFonts w:asciiTheme="minorHAnsi" w:hAnsiTheme="minorHAnsi"/>
+        </w:rPr>
         <w:t>Tracking Features</w:t>
       </w:r>
       <w:bookmarkEnd w:id="3"/>
       <w:r>
+        <w:rPr>
+          <w:rFonts w:asciiTheme="minorHAnsi" w:hAnsiTheme="minorHAnsi"/>
+        </w:rPr>
         <w:t xml:space="preserve"> </w:t>
       </w:r>
     </w:p>
@@ -3520,9 +3708,16 @@
     <w:p>
       <w:pPr>
         <w:pStyle w:val="Heading2"/>
+        <w:rPr>
+          <w:rFonts w:asciiTheme="minorHAnsi" w:hAnsiTheme="minorHAnsi"/>
+        </w:rPr>
       </w:pPr>
-      <w:bookmarkStart w:id="4" w:name="_Toc224032090"/>
+      <w:bookmarkStart w:id="4" w:name="_Toc224299665"/>
       <w:r>
+        <w:rPr>
+          <w:rFonts w:asciiTheme="minorHAnsi" w:hAnsiTheme="minorHAnsi"/>
+        </w:rPr>
+        <w:lastRenderedPageBreak/>
         <w:t>Producer Dashboard</w:t>
       </w:r>
       <w:bookmarkEnd w:id="4"/>
@@ -3770,13 +3965,22 @@
     <w:p>
       <w:pPr>
         <w:pStyle w:val="Heading2"/>
+        <w:rPr>
+          <w:rFonts w:asciiTheme="minorHAnsi" w:hAnsiTheme="minorHAnsi"/>
+        </w:rPr>
       </w:pPr>
-      <w:bookmarkStart w:id="5" w:name="_Toc224032091"/>
+      <w:bookmarkStart w:id="5" w:name="_Toc224299666"/>
       <w:r>
+        <w:rPr>
+          <w:rFonts w:asciiTheme="minorHAnsi" w:hAnsiTheme="minorHAnsi"/>
+        </w:rPr>
         <w:t>Customer Loyalty Program</w:t>
       </w:r>
       <w:bookmarkEnd w:id="5"/>
       <w:r>
+        <w:rPr>
+          <w:rFonts w:asciiTheme="minorHAnsi" w:hAnsiTheme="minorHAnsi"/>
+        </w:rPr>
         <w:t xml:space="preserve"> </w:t>
       </w:r>
     </w:p>
@@ -3925,15 +4129,7 @@
           <w:sz w:val="24"/>
           <w:szCs w:val="24"/>
         </w:rPr>
-        <w:t xml:space="preserve"> strengthening customer loyalty and overall customer service. It also serves as a window of opportunity to gain new customers as the Loyalty system present entices them and increases the likelihood of them becoming regulars. The overall loyal customer base increases the reputation of the business by word of the mouth as well </w:t>
-      </w:r>
-      <w:r>
-        <w:rPr>
-          <w:sz w:val="24"/>
-          <w:szCs w:val="24"/>
-        </w:rPr>
-        <w:lastRenderedPageBreak/>
-        <w:t xml:space="preserve">as </w:t>
+        <w:t xml:space="preserve"> strengthening customer loyalty and overall customer service. It also serves as a window of opportunity to gain new customers as the Loyalty system present entices them and increases the likelihood of them becoming regulars. The overall loyal customer base increases the reputation of the business by word of the mouth as well as </w:t>
       </w:r>
       <w:r>
         <w:rPr>
@@ -3961,9 +4157,15 @@
     <w:p>
       <w:pPr>
         <w:pStyle w:val="Heading2"/>
+        <w:rPr>
+          <w:rFonts w:asciiTheme="minorHAnsi" w:hAnsiTheme="minorHAnsi"/>
+        </w:rPr>
       </w:pPr>
-      <w:bookmarkStart w:id="6" w:name="_Toc224032092"/>
+      <w:bookmarkStart w:id="6" w:name="_Toc224299667"/>
       <w:r>
+        <w:rPr>
+          <w:rFonts w:asciiTheme="minorHAnsi" w:hAnsiTheme="minorHAnsi"/>
+        </w:rPr>
         <w:t>Accessibility Features</w:t>
       </w:r>
       <w:bookmarkEnd w:id="6"/>
@@ -4059,7 +4261,7 @@
           <w:szCs w:val="30"/>
         </w:rPr>
       </w:pPr>
-      <w:bookmarkStart w:id="7" w:name="_Toc224032093"/>
+      <w:bookmarkStart w:id="7" w:name="_Toc224299668"/>
       <w:r>
         <w:rPr>
           <w:b/>
@@ -4067,6 +4269,7 @@
           <w:sz w:val="30"/>
           <w:szCs w:val="30"/>
         </w:rPr>
+        <w:lastRenderedPageBreak/>
         <w:t>Project Aim</w:t>
       </w:r>
       <w:bookmarkEnd w:id="7"/>
@@ -4291,7 +4494,7 @@
           <w:szCs w:val="30"/>
         </w:rPr>
       </w:pPr>
-      <w:bookmarkStart w:id="8" w:name="_Toc224032094"/>
+      <w:bookmarkStart w:id="8" w:name="_Toc224299669"/>
       <w:r>
         <w:rPr>
           <w:b/>
@@ -4423,7 +4626,6 @@
           <w:sz w:val="24"/>
           <w:szCs w:val="24"/>
         </w:rPr>
-        <w:lastRenderedPageBreak/>
         <w:t>Charles (Customer)- A new</w:t>
       </w:r>
       <w:r>
@@ -4465,7 +4667,7 @@
           <w:szCs w:val="30"/>
         </w:rPr>
       </w:pPr>
-      <w:bookmarkStart w:id="9" w:name="_Toc224032095"/>
+      <w:bookmarkStart w:id="9" w:name="_Toc224299670"/>
       <w:r>
         <w:rPr>
           <w:b/>
@@ -4508,13 +4710,22 @@
             <w:pPr>
               <w:pStyle w:val="Heading2"/>
               <w:outlineLvl w:val="1"/>
-            </w:pPr>
-            <w:bookmarkStart w:id="10" w:name="_Toc224032096"/>
-            <w:r>
+              <w:rPr>
+                <w:rFonts w:asciiTheme="minorHAnsi" w:hAnsiTheme="minorHAnsi"/>
+              </w:rPr>
+            </w:pPr>
+            <w:bookmarkStart w:id="10" w:name="_Toc224299671"/>
+            <w:r>
+              <w:rPr>
+                <w:rFonts w:asciiTheme="minorHAnsi" w:hAnsiTheme="minorHAnsi"/>
+              </w:rPr>
               <w:t>Functional Requirement</w:t>
             </w:r>
             <w:bookmarkEnd w:id="10"/>
             <w:r>
+              <w:rPr>
+                <w:rFonts w:asciiTheme="minorHAnsi" w:hAnsiTheme="minorHAnsi"/>
+              </w:rPr>
               <w:t xml:space="preserve"> </w:t>
             </w:r>
           </w:p>
@@ -4527,13 +4738,22 @@
             <w:pPr>
               <w:pStyle w:val="Heading2"/>
               <w:outlineLvl w:val="1"/>
-            </w:pPr>
-            <w:bookmarkStart w:id="11" w:name="_Toc224032097"/>
-            <w:r>
+              <w:rPr>
+                <w:rFonts w:asciiTheme="minorHAnsi" w:hAnsiTheme="minorHAnsi"/>
+              </w:rPr>
+            </w:pPr>
+            <w:bookmarkStart w:id="11" w:name="_Toc224299672"/>
+            <w:r>
+              <w:rPr>
+                <w:rFonts w:asciiTheme="minorHAnsi" w:hAnsiTheme="minorHAnsi"/>
+              </w:rPr>
               <w:t>User Story</w:t>
             </w:r>
             <w:bookmarkEnd w:id="11"/>
             <w:r>
+              <w:rPr>
+                <w:rFonts w:asciiTheme="minorHAnsi" w:hAnsiTheme="minorHAnsi"/>
+              </w:rPr>
               <w:t xml:space="preserve"> </w:t>
             </w:r>
           </w:p>
@@ -4546,13 +4766,22 @@
             <w:pPr>
               <w:pStyle w:val="Heading2"/>
               <w:outlineLvl w:val="1"/>
-            </w:pPr>
-            <w:bookmarkStart w:id="12" w:name="_Toc224032098"/>
-            <w:r>
+              <w:rPr>
+                <w:rFonts w:asciiTheme="minorHAnsi" w:hAnsiTheme="minorHAnsi"/>
+              </w:rPr>
+            </w:pPr>
+            <w:bookmarkStart w:id="12" w:name="_Toc224299673"/>
+            <w:r>
+              <w:rPr>
+                <w:rFonts w:asciiTheme="minorHAnsi" w:hAnsiTheme="minorHAnsi"/>
+              </w:rPr>
               <w:t>User Acceptance Criteria</w:t>
             </w:r>
             <w:bookmarkEnd w:id="12"/>
             <w:r>
+              <w:rPr>
+                <w:rFonts w:asciiTheme="minorHAnsi" w:hAnsiTheme="minorHAnsi"/>
+              </w:rPr>
               <w:t xml:space="preserve"> </w:t>
             </w:r>
           </w:p>
@@ -4565,13 +4794,22 @@
             <w:pPr>
               <w:pStyle w:val="Heading2"/>
               <w:outlineLvl w:val="1"/>
-            </w:pPr>
-            <w:bookmarkStart w:id="13" w:name="_Toc224032099"/>
-            <w:r>
+              <w:rPr>
+                <w:rFonts w:asciiTheme="minorHAnsi" w:hAnsiTheme="minorHAnsi"/>
+              </w:rPr>
+            </w:pPr>
+            <w:bookmarkStart w:id="13" w:name="_Toc224299674"/>
+            <w:r>
+              <w:rPr>
+                <w:rFonts w:asciiTheme="minorHAnsi" w:hAnsiTheme="minorHAnsi"/>
+              </w:rPr>
               <w:t>Justification</w:t>
             </w:r>
             <w:bookmarkEnd w:id="13"/>
             <w:r>
+              <w:rPr>
+                <w:rFonts w:asciiTheme="minorHAnsi" w:hAnsiTheme="minorHAnsi"/>
+              </w:rPr>
               <w:t xml:space="preserve"> </w:t>
             </w:r>
           </w:p>
@@ -4738,6 +4976,7 @@
               <w:rPr>
                 <w:rFonts w:asciiTheme="minorHAnsi" w:hAnsiTheme="minorHAnsi" w:cstheme="minorHAnsi"/>
               </w:rPr>
+              <w:lastRenderedPageBreak/>
               <w:t xml:space="preserve">user receives clear error messages for invalid or incomplete inputs </w:t>
             </w:r>
           </w:p>
@@ -4805,6 +5044,7 @@
                 <w:sz w:val="24"/>
                 <w:szCs w:val="24"/>
               </w:rPr>
+              <w:lastRenderedPageBreak/>
               <w:t xml:space="preserve">Account registration is the gateway to accessing all the features offered by GLH. </w:t>
             </w:r>
             <w:r>
@@ -4884,7 +5124,6 @@
                 <w:sz w:val="24"/>
                 <w:szCs w:val="24"/>
               </w:rPr>
-              <w:lastRenderedPageBreak/>
               <w:t>As a registered producer (Daniel) I want to be able to Log in to my account and view my dashboard with which I can use to track inventory and manage orders made.</w:t>
             </w:r>
           </w:p>
@@ -4913,7 +5152,6 @@
                 <w:sz w:val="24"/>
                 <w:szCs w:val="24"/>
               </w:rPr>
-              <w:lastRenderedPageBreak/>
               <w:t xml:space="preserve">The user should be able to interact with the Login button </w:t>
             </w:r>
           </w:p>
@@ -4960,16 +5198,7 @@
                 <w:sz w:val="24"/>
                 <w:szCs w:val="24"/>
               </w:rPr>
-              <w:t xml:space="preserve">It must prevent access with incorrect credentials as well as </w:t>
-            </w:r>
-            <w:r>
-              <w:rPr>
-                <w:rFonts w:cstheme="minorHAnsi"/>
-                <w:sz w:val="24"/>
-                <w:szCs w:val="24"/>
-              </w:rPr>
-              <w:lastRenderedPageBreak/>
-              <w:t xml:space="preserve">display an error message.  </w:t>
+              <w:t xml:space="preserve">It must prevent access with incorrect credentials as well as display an error message.  </w:t>
             </w:r>
           </w:p>
           <w:p>
@@ -5083,7 +5312,6 @@
                 <w:sz w:val="24"/>
                 <w:szCs w:val="24"/>
               </w:rPr>
-              <w:lastRenderedPageBreak/>
               <w:t>A secure and reliable login system is essential in creating that uniqueness between the profiles of different customers. It grants them access to a system with personalised features which are tailor made just for them.</w:t>
             </w:r>
           </w:p>
@@ -5138,7 +5366,16 @@
                 <w:sz w:val="24"/>
                 <w:szCs w:val="24"/>
               </w:rPr>
-              <w:t>As a customer whether new or returning (James &amp; Charles) I want to be able to create, edit or delete the orders I create</w:t>
+              <w:t xml:space="preserve">As a customer whether new or returning (James &amp; Charles) I want to be able to create, edit or delete </w:t>
+            </w:r>
+            <w:r>
+              <w:rPr>
+                <w:rFonts w:cstheme="minorHAnsi"/>
+                <w:sz w:val="24"/>
+                <w:szCs w:val="24"/>
+              </w:rPr>
+              <w:lastRenderedPageBreak/>
+              <w:t>the orders I create</w:t>
             </w:r>
             <w:r>
               <w:rPr>
@@ -5173,6 +5410,7 @@
                 <w:sz w:val="24"/>
                 <w:szCs w:val="24"/>
               </w:rPr>
+              <w:lastRenderedPageBreak/>
               <w:t>The User should be able to create an order after clicking on the products they wish to buy</w:t>
             </w:r>
           </w:p>
@@ -5195,6 +5433,7 @@
                 <w:sz w:val="24"/>
                 <w:szCs w:val="24"/>
               </w:rPr>
+              <w:lastRenderedPageBreak/>
               <w:t>They should be able to access their orders page within 2 clicks from any page on the website</w:t>
             </w:r>
           </w:p>
@@ -5291,7 +5530,17 @@
                 <w:sz w:val="24"/>
                 <w:szCs w:val="24"/>
               </w:rPr>
-              <w:t>An easily navigable order history empowers customers by giving them control and transparency over their purchases. It reduces the need for them to contact support for simple inquiries like "What did I order last month?" or "Has my order shipped yet?". This self-service capability improves customer satisfaction and reduces operational overhead for the business.</w:t>
+              <w:lastRenderedPageBreak/>
+              <w:t xml:space="preserve">An easily navigable order history empowers customers by giving them control and transparency over their purchases. It </w:t>
+            </w:r>
+            <w:r>
+              <w:rPr>
+                <w:rFonts w:cstheme="minorHAnsi"/>
+                <w:sz w:val="24"/>
+                <w:szCs w:val="24"/>
+              </w:rPr>
+              <w:lastRenderedPageBreak/>
+              <w:t>reduces the need for them to contact support for simple inquiries like "What did I order last month?" or "Has my order shipped yet?". This self-service capability improves customer satisfaction and reduces operational overhead for the business.</w:t>
             </w:r>
           </w:p>
         </w:tc>
@@ -5315,6 +5564,7 @@
                 <w:sz w:val="24"/>
                 <w:szCs w:val="24"/>
               </w:rPr>
+              <w:lastRenderedPageBreak/>
               <w:t>There should be a section which provides information about producers, their methods and benefits of purchasing locally</w:t>
             </w:r>
           </w:p>
@@ -5354,7 +5604,6 @@
                 <w:sz w:val="24"/>
                 <w:szCs w:val="24"/>
               </w:rPr>
-              <w:lastRenderedPageBreak/>
               <w:t>As a new customer (Charles) I want the application to give me relevant information on why it is beneficial to purchase locally made products as well as inform me on new products which I have no knowledge on.</w:t>
             </w:r>
           </w:p>
@@ -5384,7 +5633,6 @@
                 <w:szCs w:val="24"/>
                 <w:shd w:val="clear" w:color="auto" w:fill="FFFFFF"/>
               </w:rPr>
-              <w:lastRenderedPageBreak/>
               <w:t>The website must have a dedicated "Our Producers" or "Meet the Farmers" page accessible from the main navigation menu.</w:t>
             </w:r>
           </w:p>
@@ -5409,18 +5657,7 @@
                 <w:szCs w:val="24"/>
                 <w:shd w:val="clear" w:color="auto" w:fill="FFFFFF"/>
               </w:rPr>
-              <w:t xml:space="preserve">Each producer profile must contain a photo, and a description of their farming methods </w:t>
-            </w:r>
-            <w:r>
-              <w:rPr>
-                <w:rFonts w:cstheme="minorHAnsi"/>
-                <w:color w:val="0F1115"/>
-                <w:sz w:val="24"/>
-                <w:szCs w:val="24"/>
-                <w:shd w:val="clear" w:color="auto" w:fill="FFFFFF"/>
-              </w:rPr>
-              <w:lastRenderedPageBreak/>
-              <w:t>(e.g., Organic, Free-Range or what part of farming they expertise in).</w:t>
+              <w:t>Each producer profile must contain a photo, and a description of their farming methods (e.g., Organic, Free-Range or what part of farming they expertise in).</w:t>
             </w:r>
           </w:p>
           <w:p>
@@ -5486,7 +5723,14 @@
               <w:rPr>
                 <w:rFonts w:asciiTheme="minorHAnsi" w:hAnsiTheme="minorHAnsi" w:cstheme="minorHAnsi"/>
               </w:rPr>
-              <w:t>The page must comply with the Web Accessibility Guidelines (WCAG), e.g., Contrast, Text Size, Text-to-speech.</w:t>
+              <w:t xml:space="preserve">The page must comply with the Web Accessibility Guidelines (WCAG), e.g., Contrast, </w:t>
+            </w:r>
+            <w:r>
+              <w:rPr>
+                <w:rFonts w:asciiTheme="minorHAnsi" w:hAnsiTheme="minorHAnsi" w:cstheme="minorHAnsi"/>
+              </w:rPr>
+              <w:lastRenderedPageBreak/>
+              <w:t>Text Size, Text-to-speech.</w:t>
             </w:r>
           </w:p>
         </w:tc>
@@ -5509,16 +5753,7 @@
                 <w:szCs w:val="24"/>
               </w:rPr>
               <w:lastRenderedPageBreak/>
-              <w:t xml:space="preserve">In the local food market, the story and trust behind the product are key selling points. This transparency differentiates Greenfield Local Hub from supermarket giants. By highlighting producers and their methods, the platform builds an emotional </w:t>
-            </w:r>
-            <w:r>
-              <w:rPr>
-                <w:rFonts w:cstheme="minorHAnsi"/>
-                <w:sz w:val="24"/>
-                <w:szCs w:val="24"/>
-              </w:rPr>
-              <w:lastRenderedPageBreak/>
-              <w:t>connection and trust with the customer, justifying price points and reinforcing the value of supporting the local economy.</w:t>
+              <w:t>In the local food market, the story and trust behind the product are key selling points. This transparency differentiates Greenfield Local Hub from supermarket giants. By highlighting producers and their methods, the platform builds an emotional connection and trust with the customer, justifying price points and reinforcing the value of supporting the local economy.</w:t>
             </w:r>
           </w:p>
         </w:tc>
@@ -5673,18 +5908,7 @@
                 <w:szCs w:val="24"/>
                 <w:shd w:val="clear" w:color="auto" w:fill="FFFFFF"/>
               </w:rPr>
-              <w:t xml:space="preserve">The dashboard must provide a simple interface to mark orders as “Confirmed,” “Packed,” or </w:t>
-            </w:r>
-            <w:r>
-              <w:rPr>
-                <w:rFonts w:cstheme="minorHAnsi"/>
-                <w:color w:val="0F1115"/>
-                <w:sz w:val="24"/>
-                <w:szCs w:val="24"/>
-                <w:shd w:val="clear" w:color="auto" w:fill="FFFFFF"/>
-              </w:rPr>
-              <w:lastRenderedPageBreak/>
-              <w:t>“Shipped,” which updates the tracking status for the customer.</w:t>
+              <w:t>The dashboard must provide a simple interface to mark orders as “Confirmed,” “Packed,” or “Shipped,” which updates the tracking status for the customer.</w:t>
             </w:r>
           </w:p>
           <w:p>
@@ -5724,7 +5948,6 @@
                 <w:sz w:val="24"/>
                 <w:szCs w:val="24"/>
               </w:rPr>
-              <w:lastRenderedPageBreak/>
               <w:t>A dedicated producer dashboard streamlines the process at which producers supply their products to customers. It gives producers the ability to manage their own inventory. This real time synchronisation prevents overselling and ensures that the customer has accurate information, improving operational efficiency.</w:t>
             </w:r>
           </w:p>
@@ -5842,7 +6065,16 @@
                 <w:sz w:val="24"/>
                 <w:szCs w:val="24"/>
               </w:rPr>
-              <w:t>After selecting a date, the estimated delivery date must be displayed next to the order on the order page.</w:t>
+              <w:t xml:space="preserve">After selecting a date, the estimated delivery </w:t>
+            </w:r>
+            <w:r>
+              <w:rPr>
+                <w:rFonts w:cstheme="minorHAnsi"/>
+                <w:sz w:val="24"/>
+                <w:szCs w:val="24"/>
+              </w:rPr>
+              <w:lastRenderedPageBreak/>
+              <w:t>date must be displayed next to the order on the order page.</w:t>
             </w:r>
           </w:p>
           <w:p>
@@ -5912,7 +6144,35 @@
                 <w:sz w:val="24"/>
                 <w:szCs w:val="24"/>
               </w:rPr>
-              <w:t>Flexibility in scheduling and delivery is what transforms a browsing customer into a regular customer. This feature ensures that users are at home and are convenient in receiving their products. This is key especially for perishable items. It is also crucial for producers as it ca help them manage logistics and prevent them from over shipping</w:t>
+              <w:lastRenderedPageBreak/>
+              <w:t xml:space="preserve">Flexibility in scheduling and delivery is what transforms a browsing customer into a regular customer. This feature ensures that users are at home and are convenient in receiving their products. This is key especially for perishable items. It is also crucial for </w:t>
+            </w:r>
+            <w:r>
+              <w:rPr>
+                <w:rFonts w:cstheme="minorHAnsi"/>
+                <w:sz w:val="24"/>
+                <w:szCs w:val="24"/>
+              </w:rPr>
+              <w:lastRenderedPageBreak/>
+              <w:t xml:space="preserve">producers as </w:t>
+            </w:r>
+            <w:proofErr w:type="gramStart"/>
+            <w:r>
+              <w:rPr>
+                <w:rFonts w:cstheme="minorHAnsi"/>
+                <w:sz w:val="24"/>
+                <w:szCs w:val="24"/>
+              </w:rPr>
+              <w:t>it</w:t>
+            </w:r>
+            <w:proofErr w:type="gramEnd"/>
+            <w:r>
+              <w:rPr>
+                <w:rFonts w:cstheme="minorHAnsi"/>
+                <w:sz w:val="24"/>
+                <w:szCs w:val="24"/>
+              </w:rPr>
+              <w:t xml:space="preserve"> ca help them manage logistics and prevent them from over shipping</w:t>
             </w:r>
             <w:r>
               <w:rPr>
@@ -5944,6 +6204,7 @@
                 <w:sz w:val="24"/>
                 <w:szCs w:val="24"/>
               </w:rPr>
+              <w:lastRenderedPageBreak/>
               <w:t xml:space="preserve">The User should be able to track the status of their order </w:t>
             </w:r>
           </w:p>
@@ -6077,16 +6338,7 @@
                 <w:sz w:val="24"/>
                 <w:szCs w:val="24"/>
               </w:rPr>
-              <w:t xml:space="preserve">The tracking status must be consistent across the customer </w:t>
-            </w:r>
-            <w:r>
-              <w:rPr>
-                <w:rFonts w:cstheme="minorHAnsi"/>
-                <w:sz w:val="24"/>
-                <w:szCs w:val="24"/>
-              </w:rPr>
-              <w:lastRenderedPageBreak/>
-              <w:t>view, the producer dashboard and the manager view.</w:t>
+              <w:t>The tracking status must be consistent across the customer view, the producer dashboard and the manager view.</w:t>
             </w:r>
           </w:p>
           <w:p>
@@ -6130,7 +6382,6 @@
                 <w:sz w:val="24"/>
                 <w:szCs w:val="24"/>
               </w:rPr>
-              <w:lastRenderedPageBreak/>
               <w:t xml:space="preserve">Transparency during the delivery process builds trust and reduces customer anxiety. This reduces the rate of pointless enquiries made at customer support services. Sending in notifications about their order demonstrates a form of communication between the business and the customer which is crucial as well as commonly practiced in the industry  </w:t>
             </w:r>
           </w:p>
@@ -6310,7 +6561,16 @@
                 <w:sz w:val="24"/>
                 <w:szCs w:val="24"/>
               </w:rPr>
-              <w:t>The rewards / checkout page must show what applicable discount they can get with their accumulated points.</w:t>
+              <w:t xml:space="preserve">The rewards / checkout page must show what </w:t>
+            </w:r>
+            <w:r>
+              <w:rPr>
+                <w:rFonts w:cstheme="minorHAnsi"/>
+                <w:sz w:val="24"/>
+                <w:szCs w:val="24"/>
+              </w:rPr>
+              <w:lastRenderedPageBreak/>
+              <w:t>applicable discount they can get with their accumulated points.</w:t>
             </w:r>
           </w:p>
           <w:p>
@@ -6354,6 +6614,7 @@
                 <w:sz w:val="24"/>
                 <w:szCs w:val="24"/>
               </w:rPr>
+              <w:lastRenderedPageBreak/>
               <w:t xml:space="preserve">Customer Loyalty programs are proven to increase a customer’s overall purchasing value over time, meaning they’re more likely to become loyal customers from regular customers just by </w:t>
             </w:r>
             <w:r>
@@ -6362,7 +6623,16 @@
                 <w:sz w:val="24"/>
                 <w:szCs w:val="24"/>
               </w:rPr>
-              <w:t>showing them rewards. This encourages repeat purchases and at the same time foster an emotional bond between GLH and their customers.</w:t>
+              <w:t xml:space="preserve">showing them rewards. This encourages repeat purchases and at the same </w:t>
+            </w:r>
+            <w:r>
+              <w:rPr>
+                <w:rFonts w:cstheme="minorHAnsi"/>
+                <w:sz w:val="24"/>
+                <w:szCs w:val="24"/>
+              </w:rPr>
+              <w:lastRenderedPageBreak/>
+              <w:t>time foster an emotional bond between GLH and their customers.</w:t>
             </w:r>
           </w:p>
         </w:tc>
@@ -6386,6 +6656,7 @@
                 <w:sz w:val="24"/>
                 <w:szCs w:val="24"/>
               </w:rPr>
+              <w:lastRenderedPageBreak/>
               <w:t>There should be basic accessibility features available</w:t>
             </w:r>
           </w:p>
@@ -6605,7 +6876,6 @@
                 <w:sz w:val="24"/>
                 <w:szCs w:val="24"/>
               </w:rPr>
-              <w:lastRenderedPageBreak/>
               <w:t>The page must comply with the Web Accessibility Guidelines (WCAG)</w:t>
             </w:r>
           </w:p>
@@ -6628,7 +6898,6 @@
                 <w:sz w:val="24"/>
                 <w:szCs w:val="24"/>
               </w:rPr>
-              <w:lastRenderedPageBreak/>
               <w:t>By Including accessibility features</w:t>
             </w:r>
             <w:r>
@@ -6669,7 +6938,6 @@
           <w:szCs w:val="30"/>
         </w:rPr>
       </w:pPr>
-      <w:bookmarkStart w:id="14" w:name="_Toc224032100"/>
     </w:p>
     <w:p>
       <w:pPr>
@@ -6681,6 +6949,7 @@
           <w:szCs w:val="30"/>
         </w:rPr>
       </w:pPr>
+      <w:bookmarkStart w:id="14" w:name="_Toc224299675"/>
       <w:r>
         <w:rPr>
           <w:b/>
@@ -6736,7 +7005,7 @@
                 <w:bCs/>
               </w:rPr>
             </w:pPr>
-            <w:bookmarkStart w:id="15" w:name="_Toc224032101"/>
+            <w:bookmarkStart w:id="15" w:name="_Toc224299676"/>
             <w:r>
               <w:rPr>
                 <w:b/>
@@ -6984,6 +7253,7 @@
                 <w:sz w:val="24"/>
                 <w:szCs w:val="24"/>
               </w:rPr>
+              <w:lastRenderedPageBreak/>
               <w:t xml:space="preserve">The system should be able to withstand a high frequency of users simultaneously. </w:t>
             </w:r>
           </w:p>
@@ -7091,7 +7361,7 @@
                 <w:bCs/>
               </w:rPr>
             </w:pPr>
-            <w:bookmarkStart w:id="16" w:name="_Toc224032102"/>
+            <w:bookmarkStart w:id="16" w:name="_Toc224299677"/>
             <w:r>
               <w:rPr>
                 <w:b/>
@@ -7316,7 +7586,6 @@
                 <w:sz w:val="24"/>
                 <w:szCs w:val="24"/>
               </w:rPr>
-              <w:lastRenderedPageBreak/>
               <w:t xml:space="preserve">The website must enforce HTTPS across all pages.  </w:t>
             </w:r>
           </w:p>
@@ -7583,7 +7852,7 @@
                 <w:bCs/>
               </w:rPr>
             </w:pPr>
-            <w:bookmarkStart w:id="17" w:name="_Toc224032103"/>
+            <w:bookmarkStart w:id="17" w:name="_Toc224299678"/>
             <w:r>
               <w:rPr>
                 <w:b/>
@@ -7911,6 +8180,7 @@
                 <w:sz w:val="24"/>
                 <w:szCs w:val="24"/>
               </w:rPr>
+              <w:lastRenderedPageBreak/>
               <w:t>Database design must allow for easy addition of new features</w:t>
             </w:r>
             <w:r>
@@ -8146,7 +8416,7 @@
                 <w:bCs/>
               </w:rPr>
             </w:pPr>
-            <w:bookmarkStart w:id="18" w:name="_Toc224032104"/>
+            <w:bookmarkStart w:id="18" w:name="_Toc224299679"/>
             <w:r>
               <w:rPr>
                 <w:b/>
@@ -8514,7 +8784,6 @@
                 <w:sz w:val="24"/>
                 <w:szCs w:val="24"/>
               </w:rPr>
-              <w:lastRenderedPageBreak/>
               <w:t xml:space="preserve">The system must handle at least 10,000 customer accounts </w:t>
             </w:r>
           </w:p>
@@ -8643,7 +8912,7 @@
                 <w:bCs/>
               </w:rPr>
             </w:pPr>
-            <w:bookmarkStart w:id="19" w:name="_Toc224032105"/>
+            <w:bookmarkStart w:id="19" w:name="_Toc224299680"/>
             <w:r>
               <w:rPr>
                 <w:b/>
@@ -9035,6 +9304,7 @@
                 <w:sz w:val="24"/>
                 <w:szCs w:val="24"/>
               </w:rPr>
+              <w:lastRenderedPageBreak/>
               <w:t>Real-time synchronisation between producer dashboard and customer view.</w:t>
             </w:r>
           </w:p>
@@ -9120,7 +9390,7 @@
                 <w:bCs/>
               </w:rPr>
             </w:pPr>
-            <w:bookmarkStart w:id="20" w:name="_Toc224032106"/>
+            <w:bookmarkStart w:id="20" w:name="_Toc224299681"/>
             <w:r>
               <w:rPr>
                 <w:b/>
@@ -9621,13 +9891,12 @@
                 <w:bCs/>
               </w:rPr>
             </w:pPr>
-            <w:bookmarkStart w:id="21" w:name="_Toc224032107"/>
+            <w:bookmarkStart w:id="21" w:name="_Toc224299682"/>
             <w:r>
               <w:rPr>
                 <w:b/>
                 <w:bCs/>
               </w:rPr>
-              <w:lastRenderedPageBreak/>
               <w:t>Accessibility</w:t>
             </w:r>
             <w:bookmarkEnd w:id="21"/>
@@ -10084,7 +10353,7 @@
           <w:szCs w:val="30"/>
         </w:rPr>
       </w:pPr>
-      <w:bookmarkStart w:id="22" w:name="_Toc224032108"/>
+      <w:bookmarkStart w:id="22" w:name="_Toc224299683"/>
       <w:r>
         <w:rPr>
           <w:b/>
@@ -10092,6 +10361,7 @@
           <w:sz w:val="30"/>
           <w:szCs w:val="30"/>
         </w:rPr>
+        <w:lastRenderedPageBreak/>
         <w:t>Hierarchical Diagram</w:t>
       </w:r>
       <w:bookmarkEnd w:id="22"/>
@@ -10135,7 +10405,7 @@
           <w:szCs w:val="30"/>
         </w:rPr>
       </w:pPr>
-      <w:bookmarkStart w:id="23" w:name="_Toc224032109"/>
+      <w:bookmarkStart w:id="23" w:name="_Toc224299684"/>
       <w:r>
         <w:rPr>
           <w:b/>
@@ -10161,9 +10431,23 @@
         <w:pStyle w:val="Heading3"/>
         <w:spacing w:after="102"/>
         <w:ind w:left="-5"/>
+        <w:rPr>
+          <w:rFonts w:asciiTheme="minorHAnsi" w:hAnsiTheme="minorHAnsi"/>
+        </w:rPr>
       </w:pPr>
+      <w:bookmarkStart w:id="24" w:name="_Toc224299685"/>
       <w:r>
-        <w:t xml:space="preserve">Project Risks (PR) </w:t>
+        <w:rPr>
+          <w:rFonts w:asciiTheme="minorHAnsi" w:hAnsiTheme="minorHAnsi"/>
+        </w:rPr>
+        <w:t>Project Risks (PR)</w:t>
+      </w:r>
+      <w:bookmarkEnd w:id="24"/>
+      <w:r>
+        <w:rPr>
+          <w:rFonts w:asciiTheme="minorHAnsi" w:hAnsiTheme="minorHAnsi"/>
+        </w:rPr>
+        <w:t xml:space="preserve"> </w:t>
       </w:r>
     </w:p>
     <w:p>
@@ -10247,7 +10531,6 @@
           <w:sz w:val="24"/>
           <w:szCs w:val="24"/>
         </w:rPr>
-        <w:lastRenderedPageBreak/>
         <w:t xml:space="preserve">Budget Overruns </w:t>
       </w:r>
     </w:p>
@@ -10256,9 +10539,23 @@
         <w:pStyle w:val="Heading3"/>
         <w:spacing w:after="103"/>
         <w:ind w:left="-5"/>
+        <w:rPr>
+          <w:rFonts w:asciiTheme="minorHAnsi" w:hAnsiTheme="minorHAnsi"/>
+        </w:rPr>
       </w:pPr>
+      <w:bookmarkStart w:id="25" w:name="_Toc224299686"/>
       <w:r>
-        <w:t xml:space="preserve">Technical Risks (TR) </w:t>
+        <w:rPr>
+          <w:rFonts w:asciiTheme="minorHAnsi" w:hAnsiTheme="minorHAnsi"/>
+        </w:rPr>
+        <w:t>Technical Risks (TR)</w:t>
+      </w:r>
+      <w:bookmarkEnd w:id="25"/>
+      <w:r>
+        <w:rPr>
+          <w:rFonts w:asciiTheme="minorHAnsi" w:hAnsiTheme="minorHAnsi"/>
+        </w:rPr>
+        <w:t xml:space="preserve"> </w:t>
       </w:r>
     </w:p>
     <w:p>
@@ -10370,17 +10667,21 @@
       <w:pPr>
         <w:pStyle w:val="Heading2"/>
         <w:rPr>
+          <w:rFonts w:asciiTheme="minorHAnsi" w:hAnsiTheme="minorHAnsi"/>
           <w:sz w:val="24"/>
           <w:szCs w:val="24"/>
         </w:rPr>
       </w:pPr>
+      <w:bookmarkStart w:id="26" w:name="_Toc224299687"/>
       <w:r>
         <w:rPr>
+          <w:rFonts w:asciiTheme="minorHAnsi" w:hAnsiTheme="minorHAnsi"/>
           <w:sz w:val="24"/>
           <w:szCs w:val="24"/>
         </w:rPr>
         <w:t>Business Risks (BR)</w:t>
       </w:r>
+      <w:bookmarkEnd w:id="26"/>
     </w:p>
     <w:p>
       <w:pPr>
@@ -10498,7 +10799,7 @@
           <w:szCs w:val="30"/>
         </w:rPr>
       </w:pPr>
-      <w:bookmarkStart w:id="24" w:name="_Toc224032110"/>
+      <w:bookmarkStart w:id="27" w:name="_Toc224299688"/>
       <w:r>
         <w:rPr>
           <w:b/>
@@ -10508,7 +10809,7 @@
         </w:rPr>
         <w:t>Risk Matrix</w:t>
       </w:r>
-      <w:bookmarkEnd w:id="24"/>
+      <w:bookmarkEnd w:id="27"/>
       <w:r>
         <w:rPr>
           <w:b/>
@@ -10522,8 +10823,16 @@
     <w:p>
       <w:pPr>
         <w:spacing w:after="172" w:line="268" w:lineRule="auto"/>
+        <w:rPr>
+          <w:sz w:val="24"/>
+          <w:szCs w:val="24"/>
+        </w:rPr>
       </w:pPr>
       <w:r>
+        <w:rPr>
+          <w:sz w:val="24"/>
+          <w:szCs w:val="24"/>
+        </w:rPr>
         <w:t xml:space="preserve">KEY – Red Cells = High priority  </w:t>
       </w:r>
     </w:p>
@@ -10533,6 +10842,7 @@
         <w:ind w:left="360"/>
       </w:pPr>
       <w:r>
+        <w:lastRenderedPageBreak/>
         <w:t xml:space="preserve"> </w:t>
       </w:r>
     </w:p>
@@ -10548,14 +10858,14 @@
       </w:tblPr>
       <w:tblGrid>
         <w:gridCol w:w="1448"/>
-        <w:gridCol w:w="1136"/>
-        <w:gridCol w:w="854"/>
-        <w:gridCol w:w="1252"/>
-        <w:gridCol w:w="1148"/>
-        <w:gridCol w:w="53"/>
+        <w:gridCol w:w="1167"/>
+        <w:gridCol w:w="777"/>
+        <w:gridCol w:w="1274"/>
+        <w:gridCol w:w="1150"/>
+        <w:gridCol w:w="43"/>
         <w:gridCol w:w="382"/>
         <w:gridCol w:w="541"/>
-        <w:gridCol w:w="411"/>
+        <w:gridCol w:w="443"/>
       </w:tblGrid>
       <w:tr>
         <w:trPr>
@@ -10787,8 +11097,16 @@
             <w:pPr>
               <w:spacing w:line="256" w:lineRule="auto"/>
               <w:ind w:left="108"/>
-            </w:pPr>
-            <w:r>
+              <w:rPr>
+                <w:sz w:val="24"/>
+                <w:szCs w:val="24"/>
+              </w:rPr>
+            </w:pPr>
+            <w:r>
+              <w:rPr>
+                <w:sz w:val="24"/>
+                <w:szCs w:val="24"/>
+              </w:rPr>
               <w:t xml:space="preserve">High </w:t>
             </w:r>
           </w:p>
@@ -10809,8 +11127,16 @@
             <w:pPr>
               <w:spacing w:line="256" w:lineRule="auto"/>
               <w:ind w:left="109"/>
-            </w:pPr>
-            <w:r>
+              <w:rPr>
+                <w:sz w:val="24"/>
+                <w:szCs w:val="24"/>
+              </w:rPr>
+            </w:pPr>
+            <w:r>
+              <w:rPr>
+                <w:sz w:val="24"/>
+                <w:szCs w:val="24"/>
+              </w:rPr>
               <w:t xml:space="preserve"> </w:t>
             </w:r>
           </w:p>
@@ -10832,8 +11158,16 @@
             <w:pPr>
               <w:spacing w:line="256" w:lineRule="auto"/>
               <w:ind w:left="107"/>
-            </w:pPr>
-            <w:r>
+              <w:rPr>
+                <w:sz w:val="24"/>
+                <w:szCs w:val="24"/>
+              </w:rPr>
+            </w:pPr>
+            <w:r>
+              <w:rPr>
+                <w:sz w:val="24"/>
+                <w:szCs w:val="24"/>
+              </w:rPr>
               <w:t xml:space="preserve"> </w:t>
             </w:r>
           </w:p>
@@ -10855,8 +11189,16 @@
             <w:pPr>
               <w:spacing w:line="256" w:lineRule="auto"/>
               <w:ind w:left="108"/>
-            </w:pPr>
-            <w:r>
+              <w:rPr>
+                <w:sz w:val="24"/>
+                <w:szCs w:val="24"/>
+              </w:rPr>
+            </w:pPr>
+            <w:r>
+              <w:rPr>
+                <w:sz w:val="24"/>
+                <w:szCs w:val="24"/>
+              </w:rPr>
               <w:t xml:space="preserve"> </w:t>
             </w:r>
           </w:p>
@@ -10876,6 +11218,10 @@
           <w:p>
             <w:pPr>
               <w:spacing w:after="160" w:line="256" w:lineRule="auto"/>
+              <w:rPr>
+                <w:sz w:val="24"/>
+                <w:szCs w:val="24"/>
+              </w:rPr>
             </w:pPr>
           </w:p>
         </w:tc>
@@ -10895,6 +11241,10 @@
             <w:pPr>
               <w:spacing w:line="256" w:lineRule="auto"/>
               <w:ind w:left="-7504" w:right="2"/>
+              <w:rPr>
+                <w:sz w:val="24"/>
+                <w:szCs w:val="24"/>
+              </w:rPr>
             </w:pPr>
           </w:p>
           <w:tbl>
@@ -10925,8 +11275,16 @@
                   <w:pPr>
                     <w:spacing w:line="256" w:lineRule="auto"/>
                     <w:jc w:val="both"/>
+                    <w:rPr>
+                      <w:sz w:val="24"/>
+                      <w:szCs w:val="24"/>
+                    </w:rPr>
                   </w:pPr>
                   <w:r>
+                    <w:rPr>
+                      <w:sz w:val="24"/>
+                      <w:szCs w:val="24"/>
+                    </w:rPr>
                     <w:t>PR4, TR4,</w:t>
                   </w:r>
                 </w:p>
@@ -10940,6 +11298,7 @@
                 <w:rFonts w:ascii="Calibri" w:eastAsia="Calibri" w:hAnsi="Calibri"/>
                 <w:color w:val="000000"/>
                 <w:sz w:val="24"/>
+                <w:szCs w:val="24"/>
               </w:rPr>
             </w:pPr>
           </w:p>
@@ -10961,8 +11320,16 @@
             <w:pPr>
               <w:spacing w:line="256" w:lineRule="auto"/>
               <w:ind w:left="-4"/>
-            </w:pPr>
-            <w:r>
+              <w:rPr>
+                <w:sz w:val="24"/>
+                <w:szCs w:val="24"/>
+              </w:rPr>
+            </w:pPr>
+            <w:r>
+              <w:rPr>
+                <w:sz w:val="24"/>
+                <w:szCs w:val="24"/>
+              </w:rPr>
               <w:t xml:space="preserve"> </w:t>
             </w:r>
           </w:p>
@@ -11014,6 +11381,7 @@
                 <w:rFonts w:ascii="Calibri" w:eastAsia="Calibri" w:hAnsi="Calibri"/>
                 <w:color w:val="000000"/>
                 <w:sz w:val="24"/>
+                <w:szCs w:val="24"/>
               </w:rPr>
             </w:pPr>
           </w:p>
@@ -11037,6 +11405,7 @@
                 <w:rFonts w:ascii="Calibri" w:eastAsia="Calibri" w:hAnsi="Calibri"/>
                 <w:color w:val="000000"/>
                 <w:sz w:val="24"/>
+                <w:szCs w:val="24"/>
               </w:rPr>
             </w:pPr>
           </w:p>
@@ -11060,6 +11429,7 @@
                 <w:rFonts w:ascii="Calibri" w:eastAsia="Calibri" w:hAnsi="Calibri"/>
                 <w:color w:val="000000"/>
                 <w:sz w:val="24"/>
+                <w:szCs w:val="24"/>
               </w:rPr>
             </w:pPr>
           </w:p>
@@ -11083,6 +11453,7 @@
                 <w:rFonts w:ascii="Calibri" w:eastAsia="Calibri" w:hAnsi="Calibri"/>
                 <w:color w:val="000000"/>
                 <w:sz w:val="24"/>
+                <w:szCs w:val="24"/>
               </w:rPr>
             </w:pPr>
           </w:p>
@@ -11106,6 +11477,7 @@
                 <w:rFonts w:ascii="Calibri" w:eastAsia="Calibri" w:hAnsi="Calibri"/>
                 <w:color w:val="000000"/>
                 <w:sz w:val="24"/>
+                <w:szCs w:val="24"/>
               </w:rPr>
             </w:pPr>
           </w:p>
@@ -11126,6 +11498,10 @@
             <w:pPr>
               <w:spacing w:line="256" w:lineRule="auto"/>
               <w:jc w:val="both"/>
+              <w:rPr>
+                <w:sz w:val="24"/>
+                <w:szCs w:val="24"/>
+              </w:rPr>
             </w:pPr>
           </w:p>
         </w:tc>
@@ -11144,6 +11520,10 @@
           <w:p>
             <w:pPr>
               <w:spacing w:line="256" w:lineRule="auto"/>
+              <w:rPr>
+                <w:sz w:val="24"/>
+                <w:szCs w:val="24"/>
+              </w:rPr>
             </w:pPr>
           </w:p>
         </w:tc>
@@ -11166,6 +11546,7 @@
                 <w:rFonts w:ascii="Calibri" w:eastAsia="Calibri" w:hAnsi="Calibri"/>
                 <w:color w:val="000000"/>
                 <w:sz w:val="24"/>
+                <w:szCs w:val="24"/>
               </w:rPr>
             </w:pPr>
           </w:p>
@@ -11214,8 +11595,16 @@
             <w:pPr>
               <w:spacing w:line="256" w:lineRule="auto"/>
               <w:ind w:left="108"/>
-            </w:pPr>
-            <w:r>
+              <w:rPr>
+                <w:sz w:val="24"/>
+                <w:szCs w:val="24"/>
+              </w:rPr>
+            </w:pPr>
+            <w:r>
+              <w:rPr>
+                <w:sz w:val="24"/>
+                <w:szCs w:val="24"/>
+              </w:rPr>
               <w:t xml:space="preserve">Significant </w:t>
             </w:r>
           </w:p>
@@ -11236,8 +11625,16 @@
             <w:pPr>
               <w:spacing w:line="256" w:lineRule="auto"/>
               <w:ind w:left="109"/>
-            </w:pPr>
-            <w:r>
+              <w:rPr>
+                <w:sz w:val="24"/>
+                <w:szCs w:val="24"/>
+              </w:rPr>
+            </w:pPr>
+            <w:r>
+              <w:rPr>
+                <w:sz w:val="24"/>
+                <w:szCs w:val="24"/>
+              </w:rPr>
               <w:t>BR2</w:t>
             </w:r>
           </w:p>
@@ -11258,14 +11655,30 @@
             <w:pPr>
               <w:spacing w:line="256" w:lineRule="auto"/>
               <w:ind w:left="107"/>
-            </w:pPr>
-            <w:r>
+              <w:rPr>
+                <w:sz w:val="24"/>
+                <w:szCs w:val="24"/>
+              </w:rPr>
+            </w:pPr>
+            <w:r>
+              <w:rPr>
+                <w:sz w:val="24"/>
+                <w:szCs w:val="24"/>
+              </w:rPr>
               <w:t>TR1, TR2,</w:t>
             </w:r>
             <w:r>
+              <w:rPr>
+                <w:sz w:val="24"/>
+                <w:szCs w:val="24"/>
+              </w:rPr>
               <w:t xml:space="preserve"> BR4</w:t>
             </w:r>
             <w:r>
+              <w:rPr>
+                <w:sz w:val="24"/>
+                <w:szCs w:val="24"/>
+              </w:rPr>
               <w:t xml:space="preserve"> </w:t>
             </w:r>
           </w:p>
@@ -11286,11 +11699,23 @@
             <w:pPr>
               <w:spacing w:line="256" w:lineRule="auto"/>
               <w:ind w:left="108"/>
-            </w:pPr>
-            <w:r>
+              <w:rPr>
+                <w:sz w:val="24"/>
+                <w:szCs w:val="24"/>
+              </w:rPr>
+            </w:pPr>
+            <w:r>
+              <w:rPr>
+                <w:sz w:val="24"/>
+                <w:szCs w:val="24"/>
+              </w:rPr>
               <w:t xml:space="preserve">PR3, TR5, TR3, </w:t>
             </w:r>
             <w:r>
+              <w:rPr>
+                <w:sz w:val="24"/>
+                <w:szCs w:val="24"/>
+              </w:rPr>
               <w:t>BR1</w:t>
             </w:r>
           </w:p>
@@ -11310,6 +11735,10 @@
           <w:p>
             <w:pPr>
               <w:spacing w:after="160" w:line="256" w:lineRule="auto"/>
+              <w:rPr>
+                <w:sz w:val="24"/>
+                <w:szCs w:val="24"/>
+              </w:rPr>
             </w:pPr>
           </w:p>
         </w:tc>
@@ -11331,14 +11760,30 @@
               <w:spacing w:line="256" w:lineRule="auto"/>
               <w:ind w:right="-4"/>
               <w:jc w:val="both"/>
-            </w:pPr>
-            <w:r>
+              <w:rPr>
+                <w:sz w:val="24"/>
+                <w:szCs w:val="24"/>
+              </w:rPr>
+            </w:pPr>
+            <w:r>
+              <w:rPr>
+                <w:sz w:val="24"/>
+                <w:szCs w:val="24"/>
+              </w:rPr>
               <w:t>PR1, PR2,</w:t>
             </w:r>
             <w:r>
+              <w:rPr>
+                <w:sz w:val="24"/>
+                <w:szCs w:val="24"/>
+              </w:rPr>
               <w:t xml:space="preserve"> </w:t>
             </w:r>
             <w:r>
+              <w:rPr>
+                <w:sz w:val="24"/>
+                <w:szCs w:val="24"/>
+              </w:rPr>
               <w:t xml:space="preserve"> </w:t>
             </w:r>
           </w:p>
@@ -11360,8 +11805,16 @@
             <w:pPr>
               <w:spacing w:line="256" w:lineRule="auto"/>
               <w:ind w:left="55"/>
-            </w:pPr>
-            <w:r>
+              <w:rPr>
+                <w:sz w:val="24"/>
+                <w:szCs w:val="24"/>
+              </w:rPr>
+            </w:pPr>
+            <w:r>
+              <w:rPr>
+                <w:sz w:val="24"/>
+                <w:szCs w:val="24"/>
+              </w:rPr>
               <w:t>BR3</w:t>
             </w:r>
           </w:p>
@@ -11413,6 +11866,7 @@
                 <w:rFonts w:ascii="Calibri" w:eastAsia="Calibri" w:hAnsi="Calibri"/>
                 <w:color w:val="000000"/>
                 <w:sz w:val="24"/>
+                <w:szCs w:val="24"/>
               </w:rPr>
             </w:pPr>
           </w:p>
@@ -11436,6 +11890,7 @@
                 <w:rFonts w:ascii="Calibri" w:eastAsia="Calibri" w:hAnsi="Calibri"/>
                 <w:color w:val="000000"/>
                 <w:sz w:val="24"/>
+                <w:szCs w:val="24"/>
               </w:rPr>
             </w:pPr>
           </w:p>
@@ -11459,6 +11914,7 @@
                 <w:rFonts w:ascii="Calibri" w:eastAsia="Calibri" w:hAnsi="Calibri"/>
                 <w:color w:val="000000"/>
                 <w:sz w:val="24"/>
+                <w:szCs w:val="24"/>
               </w:rPr>
             </w:pPr>
           </w:p>
@@ -11482,6 +11938,7 @@
                 <w:rFonts w:ascii="Calibri" w:eastAsia="Calibri" w:hAnsi="Calibri"/>
                 <w:color w:val="000000"/>
                 <w:sz w:val="24"/>
+                <w:szCs w:val="24"/>
               </w:rPr>
             </w:pPr>
           </w:p>
@@ -11505,6 +11962,7 @@
                 <w:rFonts w:ascii="Calibri" w:eastAsia="Calibri" w:hAnsi="Calibri"/>
                 <w:color w:val="000000"/>
                 <w:sz w:val="24"/>
+                <w:szCs w:val="24"/>
               </w:rPr>
             </w:pPr>
           </w:p>
@@ -11524,6 +11982,10 @@
           <w:p>
             <w:pPr>
               <w:spacing w:after="160" w:line="256" w:lineRule="auto"/>
+              <w:rPr>
+                <w:sz w:val="24"/>
+                <w:szCs w:val="24"/>
+              </w:rPr>
             </w:pPr>
           </w:p>
         </w:tc>
@@ -11546,6 +12008,7 @@
                 <w:rFonts w:ascii="Calibri" w:eastAsia="Calibri" w:hAnsi="Calibri"/>
                 <w:color w:val="000000"/>
                 <w:sz w:val="24"/>
+                <w:szCs w:val="24"/>
               </w:rPr>
             </w:pPr>
           </w:p>
@@ -11593,8 +12056,16 @@
             <w:pPr>
               <w:spacing w:line="256" w:lineRule="auto"/>
               <w:ind w:left="108"/>
-            </w:pPr>
-            <w:r>
+              <w:rPr>
+                <w:sz w:val="24"/>
+                <w:szCs w:val="24"/>
+              </w:rPr>
+            </w:pPr>
+            <w:r>
+              <w:rPr>
+                <w:sz w:val="24"/>
+                <w:szCs w:val="24"/>
+              </w:rPr>
               <w:t xml:space="preserve">Moderate </w:t>
             </w:r>
           </w:p>
@@ -11614,8 +12085,16 @@
             <w:pPr>
               <w:spacing w:line="256" w:lineRule="auto"/>
               <w:ind w:left="109"/>
-            </w:pPr>
-            <w:r>
+              <w:rPr>
+                <w:sz w:val="24"/>
+                <w:szCs w:val="24"/>
+              </w:rPr>
+            </w:pPr>
+            <w:r>
+              <w:rPr>
+                <w:sz w:val="24"/>
+                <w:szCs w:val="24"/>
+              </w:rPr>
               <w:t xml:space="preserve"> </w:t>
             </w:r>
           </w:p>
@@ -11635,8 +12114,16 @@
             <w:pPr>
               <w:spacing w:line="256" w:lineRule="auto"/>
               <w:ind w:left="107"/>
-            </w:pPr>
-            <w:r>
+              <w:rPr>
+                <w:sz w:val="24"/>
+                <w:szCs w:val="24"/>
+              </w:rPr>
+            </w:pPr>
+            <w:r>
+              <w:rPr>
+                <w:sz w:val="24"/>
+                <w:szCs w:val="24"/>
+              </w:rPr>
               <w:t xml:space="preserve"> </w:t>
             </w:r>
           </w:p>
@@ -11656,11 +12143,23 @@
             <w:pPr>
               <w:spacing w:line="256" w:lineRule="auto"/>
               <w:ind w:left="108"/>
-            </w:pPr>
-            <w:r>
+              <w:rPr>
+                <w:sz w:val="24"/>
+                <w:szCs w:val="24"/>
+              </w:rPr>
+            </w:pPr>
+            <w:r>
+              <w:rPr>
+                <w:sz w:val="24"/>
+                <w:szCs w:val="24"/>
+              </w:rPr>
               <w:t xml:space="preserve"> </w:t>
             </w:r>
             <w:r>
+              <w:rPr>
+                <w:sz w:val="24"/>
+                <w:szCs w:val="24"/>
+              </w:rPr>
               <w:t>BR5</w:t>
             </w:r>
           </w:p>
@@ -11681,8 +12180,16 @@
             <w:pPr>
               <w:spacing w:line="256" w:lineRule="auto"/>
               <w:ind w:left="108"/>
-            </w:pPr>
-            <w:r>
+              <w:rPr>
+                <w:sz w:val="24"/>
+                <w:szCs w:val="24"/>
+              </w:rPr>
+            </w:pPr>
+            <w:r>
+              <w:rPr>
+                <w:sz w:val="24"/>
+                <w:szCs w:val="24"/>
+              </w:rPr>
               <w:t xml:space="preserve"> </w:t>
             </w:r>
           </w:p>
@@ -11730,8 +12237,16 @@
             <w:pPr>
               <w:spacing w:line="256" w:lineRule="auto"/>
               <w:ind w:left="108"/>
-            </w:pPr>
-            <w:r>
+              <w:rPr>
+                <w:sz w:val="24"/>
+                <w:szCs w:val="24"/>
+              </w:rPr>
+            </w:pPr>
+            <w:r>
+              <w:rPr>
+                <w:sz w:val="24"/>
+                <w:szCs w:val="24"/>
+              </w:rPr>
               <w:t xml:space="preserve">Low </w:t>
             </w:r>
           </w:p>
@@ -11751,8 +12266,16 @@
             <w:pPr>
               <w:spacing w:line="256" w:lineRule="auto"/>
               <w:ind w:left="109"/>
-            </w:pPr>
-            <w:r>
+              <w:rPr>
+                <w:sz w:val="24"/>
+                <w:szCs w:val="24"/>
+              </w:rPr>
+            </w:pPr>
+            <w:r>
+              <w:rPr>
+                <w:sz w:val="24"/>
+                <w:szCs w:val="24"/>
+              </w:rPr>
               <w:t xml:space="preserve"> </w:t>
             </w:r>
           </w:p>
@@ -11772,8 +12295,16 @@
             <w:pPr>
               <w:spacing w:line="256" w:lineRule="auto"/>
               <w:ind w:left="107"/>
-            </w:pPr>
-            <w:r>
+              <w:rPr>
+                <w:sz w:val="24"/>
+                <w:szCs w:val="24"/>
+              </w:rPr>
+            </w:pPr>
+            <w:r>
+              <w:rPr>
+                <w:sz w:val="24"/>
+                <w:szCs w:val="24"/>
+              </w:rPr>
               <w:t xml:space="preserve"> </w:t>
             </w:r>
           </w:p>
@@ -11793,8 +12324,16 @@
             <w:pPr>
               <w:spacing w:line="256" w:lineRule="auto"/>
               <w:ind w:left="108"/>
-            </w:pPr>
-            <w:r>
+              <w:rPr>
+                <w:sz w:val="24"/>
+                <w:szCs w:val="24"/>
+              </w:rPr>
+            </w:pPr>
+            <w:r>
+              <w:rPr>
+                <w:sz w:val="24"/>
+                <w:szCs w:val="24"/>
+              </w:rPr>
               <w:t xml:space="preserve"> </w:t>
             </w:r>
           </w:p>
@@ -11815,8 +12354,16 @@
             <w:pPr>
               <w:spacing w:line="256" w:lineRule="auto"/>
               <w:ind w:left="108"/>
-            </w:pPr>
-            <w:r>
+              <w:rPr>
+                <w:sz w:val="24"/>
+                <w:szCs w:val="24"/>
+              </w:rPr>
+            </w:pPr>
+            <w:r>
+              <w:rPr>
+                <w:sz w:val="24"/>
+                <w:szCs w:val="24"/>
+              </w:rPr>
               <w:t xml:space="preserve"> </w:t>
             </w:r>
           </w:p>
@@ -11843,8 +12390,16 @@
             <w:pPr>
               <w:spacing w:line="256" w:lineRule="auto"/>
               <w:ind w:left="108"/>
-            </w:pPr>
-            <w:r>
+              <w:rPr>
+                <w:sz w:val="24"/>
+                <w:szCs w:val="24"/>
+              </w:rPr>
+            </w:pPr>
+            <w:r>
+              <w:rPr>
+                <w:sz w:val="24"/>
+                <w:szCs w:val="24"/>
+              </w:rPr>
               <w:t xml:space="preserve"> </w:t>
             </w:r>
           </w:p>
@@ -11865,8 +12420,16 @@
               <w:spacing w:line="256" w:lineRule="auto"/>
               <w:ind w:right="4"/>
               <w:jc w:val="center"/>
-            </w:pPr>
-            <w:r>
+              <w:rPr>
+                <w:sz w:val="24"/>
+                <w:szCs w:val="24"/>
+              </w:rPr>
+            </w:pPr>
+            <w:r>
+              <w:rPr>
+                <w:sz w:val="24"/>
+                <w:szCs w:val="24"/>
+              </w:rPr>
               <w:t xml:space="preserve">Low </w:t>
             </w:r>
           </w:p>
@@ -11886,8 +12449,16 @@
             <w:pPr>
               <w:spacing w:line="256" w:lineRule="auto"/>
               <w:ind w:left="222"/>
-            </w:pPr>
-            <w:r>
+              <w:rPr>
+                <w:sz w:val="24"/>
+                <w:szCs w:val="24"/>
+              </w:rPr>
+            </w:pPr>
+            <w:r>
+              <w:rPr>
+                <w:sz w:val="24"/>
+                <w:szCs w:val="24"/>
+              </w:rPr>
               <w:t xml:space="preserve">Moderate </w:t>
             </w:r>
           </w:p>
@@ -11908,8 +12479,16 @@
               <w:spacing w:line="256" w:lineRule="auto"/>
               <w:ind w:left="1"/>
               <w:jc w:val="center"/>
-            </w:pPr>
-            <w:r>
+              <w:rPr>
+                <w:sz w:val="24"/>
+                <w:szCs w:val="24"/>
+              </w:rPr>
+            </w:pPr>
+            <w:r>
+              <w:rPr>
+                <w:sz w:val="24"/>
+                <w:szCs w:val="24"/>
+              </w:rPr>
               <w:t xml:space="preserve">Significant </w:t>
             </w:r>
           </w:p>
@@ -11930,8 +12509,16 @@
             <w:pPr>
               <w:spacing w:line="256" w:lineRule="auto"/>
               <w:jc w:val="center"/>
-            </w:pPr>
-            <w:r>
+              <w:rPr>
+                <w:sz w:val="24"/>
+                <w:szCs w:val="24"/>
+              </w:rPr>
+            </w:pPr>
+            <w:r>
+              <w:rPr>
+                <w:sz w:val="24"/>
+                <w:szCs w:val="24"/>
+              </w:rPr>
               <w:t xml:space="preserve">High </w:t>
             </w:r>
           </w:p>
@@ -12044,7 +12631,7 @@
           <w:szCs w:val="30"/>
         </w:rPr>
       </w:pPr>
-      <w:bookmarkStart w:id="25" w:name="_Toc224032111"/>
+      <w:bookmarkStart w:id="28" w:name="_Toc224299689"/>
       <w:r>
         <w:rPr>
           <w:b/>
@@ -12054,7 +12641,7 @@
         </w:rPr>
         <w:t>Risk Mitigation Strategies</w:t>
       </w:r>
-      <w:bookmarkEnd w:id="25"/>
+      <w:bookmarkEnd w:id="28"/>
       <w:r>
         <w:rPr>
           <w:b/>
@@ -12101,10 +12688,16 @@
           <w:p>
             <w:pPr>
               <w:spacing w:line="256" w:lineRule="auto"/>
+              <w:rPr>
+                <w:sz w:val="24"/>
+                <w:szCs w:val="24"/>
+              </w:rPr>
             </w:pPr>
             <w:r>
               <w:rPr>
                 <w:b/>
+                <w:sz w:val="24"/>
+                <w:szCs w:val="24"/>
               </w:rPr>
               <w:t xml:space="preserve">Risk Description </w:t>
             </w:r>
@@ -12124,10 +12717,16 @@
           <w:p>
             <w:pPr>
               <w:spacing w:line="256" w:lineRule="auto"/>
+              <w:rPr>
+                <w:sz w:val="24"/>
+                <w:szCs w:val="24"/>
+              </w:rPr>
             </w:pPr>
             <w:r>
               <w:rPr>
                 <w:b/>
+                <w:sz w:val="24"/>
+                <w:szCs w:val="24"/>
               </w:rPr>
               <w:t xml:space="preserve">Probability </w:t>
             </w:r>
@@ -12147,10 +12746,16 @@
           <w:p>
             <w:pPr>
               <w:spacing w:line="256" w:lineRule="auto"/>
+              <w:rPr>
+                <w:sz w:val="24"/>
+                <w:szCs w:val="24"/>
+              </w:rPr>
             </w:pPr>
             <w:r>
               <w:rPr>
                 <w:b/>
+                <w:sz w:val="24"/>
+                <w:szCs w:val="24"/>
               </w:rPr>
               <w:t xml:space="preserve">Impact </w:t>
             </w:r>
@@ -12170,10 +12775,16 @@
           <w:p>
             <w:pPr>
               <w:spacing w:line="256" w:lineRule="auto"/>
+              <w:rPr>
+                <w:sz w:val="24"/>
+                <w:szCs w:val="24"/>
+              </w:rPr>
             </w:pPr>
             <w:r>
               <w:rPr>
                 <w:b/>
+                <w:sz w:val="24"/>
+                <w:szCs w:val="24"/>
               </w:rPr>
               <w:t xml:space="preserve">Mitigation Strategy </w:t>
             </w:r>
@@ -12199,6 +12810,8 @@
               <w:spacing w:line="256" w:lineRule="auto"/>
               <w:rPr>
                 <w:b/>
+                <w:sz w:val="24"/>
+                <w:szCs w:val="24"/>
               </w:rPr>
             </w:pPr>
             <w:r>
@@ -12225,9 +12838,15 @@
               <w:spacing w:line="256" w:lineRule="auto"/>
               <w:rPr>
                 <w:b/>
-              </w:rPr>
-            </w:pPr>
-            <w:r>
+                <w:sz w:val="24"/>
+                <w:szCs w:val="24"/>
+              </w:rPr>
+            </w:pPr>
+            <w:r>
+              <w:rPr>
+                <w:sz w:val="24"/>
+                <w:szCs w:val="24"/>
+              </w:rPr>
               <w:t xml:space="preserve">High </w:t>
             </w:r>
           </w:p>
@@ -12247,9 +12866,15 @@
               <w:spacing w:line="256" w:lineRule="auto"/>
               <w:rPr>
                 <w:b/>
-              </w:rPr>
-            </w:pPr>
-            <w:r>
+                <w:sz w:val="24"/>
+                <w:szCs w:val="24"/>
+              </w:rPr>
+            </w:pPr>
+            <w:r>
+              <w:rPr>
+                <w:sz w:val="24"/>
+                <w:szCs w:val="24"/>
+              </w:rPr>
               <w:t xml:space="preserve">Significant </w:t>
             </w:r>
           </w:p>
@@ -12270,18 +12895,24 @@
               <w:ind w:right="18"/>
               <w:rPr>
                 <w:rFonts w:eastAsiaTheme="minorHAnsi"/>
+                <w:sz w:val="24"/>
+                <w:szCs w:val="24"/>
                 <w:lang w:eastAsia="en-US"/>
               </w:rPr>
             </w:pPr>
             <w:r>
+              <w:rPr>
+                <w:sz w:val="24"/>
+                <w:szCs w:val="24"/>
+              </w:rPr>
               <w:t xml:space="preserve">Project must be clearly defined at the beginning of the project setting forth a clear plan of structure. Any other additional features after this point must be assessed on how much it would impact the project as a whole.  </w:t>
             </w:r>
             <w:r>
-              <w:t xml:space="preserve">It would go through a formal </w:t>
-            </w:r>
-            <w:r>
-              <w:lastRenderedPageBreak/>
-              <w:t>change control process assessing impact on budget, resources etc</w:t>
+              <w:rPr>
+                <w:sz w:val="24"/>
+                <w:szCs w:val="24"/>
+              </w:rPr>
+              <w:t>It would go through a formal change control process assessing impact on budget, resources etc</w:t>
             </w:r>
           </w:p>
           <w:p>
@@ -12289,6 +12920,8 @@
               <w:spacing w:line="256" w:lineRule="auto"/>
               <w:rPr>
                 <w:b/>
+                <w:sz w:val="24"/>
+                <w:szCs w:val="24"/>
               </w:rPr>
             </w:pPr>
           </w:p>
@@ -12313,14 +12946,15 @@
               <w:spacing w:line="256" w:lineRule="auto"/>
               <w:rPr>
                 <w:b/>
-              </w:rPr>
-            </w:pPr>
-            <w:r>
-              <w:rPr>
-                <w:sz w:val="24"/>
-                <w:szCs w:val="24"/>
-              </w:rPr>
-              <w:lastRenderedPageBreak/>
+                <w:sz w:val="24"/>
+                <w:szCs w:val="24"/>
+              </w:rPr>
+            </w:pPr>
+            <w:r>
+              <w:rPr>
+                <w:sz w:val="24"/>
+                <w:szCs w:val="24"/>
+              </w:rPr>
               <w:t xml:space="preserve">Schedule Delays </w:t>
             </w:r>
           </w:p>
@@ -12340,9 +12974,15 @@
               <w:spacing w:line="256" w:lineRule="auto"/>
               <w:rPr>
                 <w:b/>
-              </w:rPr>
-            </w:pPr>
-            <w:r>
+                <w:sz w:val="24"/>
+                <w:szCs w:val="24"/>
+              </w:rPr>
+            </w:pPr>
+            <w:r>
+              <w:rPr>
+                <w:sz w:val="24"/>
+                <w:szCs w:val="24"/>
+              </w:rPr>
               <w:t xml:space="preserve">High </w:t>
             </w:r>
           </w:p>
@@ -12362,9 +13002,15 @@
               <w:spacing w:line="256" w:lineRule="auto"/>
               <w:rPr>
                 <w:b/>
-              </w:rPr>
-            </w:pPr>
-            <w:r>
+                <w:sz w:val="24"/>
+                <w:szCs w:val="24"/>
+              </w:rPr>
+            </w:pPr>
+            <w:r>
+              <w:rPr>
+                <w:sz w:val="24"/>
+                <w:szCs w:val="24"/>
+              </w:rPr>
               <w:t xml:space="preserve">Significant </w:t>
             </w:r>
           </w:p>
@@ -12384,19 +13030,37 @@
               <w:spacing w:line="256" w:lineRule="auto"/>
               <w:rPr>
                 <w:rFonts w:eastAsiaTheme="minorHAnsi"/>
+                <w:sz w:val="24"/>
+                <w:szCs w:val="24"/>
                 <w:lang w:eastAsia="en-US"/>
               </w:rPr>
             </w:pPr>
             <w:r>
+              <w:rPr>
+                <w:sz w:val="24"/>
+                <w:szCs w:val="24"/>
+              </w:rPr>
               <w:t xml:space="preserve">A </w:t>
             </w:r>
             <w:r>
+              <w:rPr>
+                <w:sz w:val="24"/>
+                <w:szCs w:val="24"/>
+              </w:rPr>
               <w:t xml:space="preserve">detailed </w:t>
             </w:r>
             <w:r>
+              <w:rPr>
+                <w:sz w:val="24"/>
+                <w:szCs w:val="24"/>
+              </w:rPr>
               <w:t xml:space="preserve">project timeline must be created so as to establish milestones and targets, buffer time would equally be added for significant or high-risk </w:t>
             </w:r>
             <w:r>
+              <w:rPr>
+                <w:sz w:val="24"/>
+                <w:szCs w:val="24"/>
+              </w:rPr>
               <w:t>tasks so as to account for future delays and re-allocate resources if needed.</w:t>
             </w:r>
           </w:p>
@@ -12405,6 +13069,8 @@
               <w:spacing w:line="256" w:lineRule="auto"/>
               <w:rPr>
                 <w:b/>
+                <w:sz w:val="24"/>
+                <w:szCs w:val="24"/>
               </w:rPr>
             </w:pPr>
           </w:p>
@@ -12429,6 +13095,8 @@
               <w:spacing w:line="256" w:lineRule="auto"/>
               <w:rPr>
                 <w:b/>
+                <w:sz w:val="24"/>
+                <w:szCs w:val="24"/>
               </w:rPr>
             </w:pPr>
             <w:r>
@@ -12455,9 +13123,15 @@
               <w:spacing w:line="256" w:lineRule="auto"/>
               <w:rPr>
                 <w:b/>
-              </w:rPr>
-            </w:pPr>
-            <w:r>
+                <w:sz w:val="24"/>
+                <w:szCs w:val="24"/>
+              </w:rPr>
+            </w:pPr>
+            <w:r>
+              <w:rPr>
+                <w:sz w:val="24"/>
+                <w:szCs w:val="24"/>
+              </w:rPr>
               <w:t xml:space="preserve">Significant </w:t>
             </w:r>
           </w:p>
@@ -12477,9 +13151,15 @@
               <w:spacing w:line="256" w:lineRule="auto"/>
               <w:rPr>
                 <w:b/>
-              </w:rPr>
-            </w:pPr>
-            <w:r>
+                <w:sz w:val="24"/>
+                <w:szCs w:val="24"/>
+              </w:rPr>
+            </w:pPr>
+            <w:r>
+              <w:rPr>
+                <w:sz w:val="24"/>
+                <w:szCs w:val="24"/>
+              </w:rPr>
               <w:t xml:space="preserve">Significant </w:t>
             </w:r>
           </w:p>
@@ -12497,9 +13177,25 @@
           <w:p>
             <w:pPr>
               <w:ind w:right="37"/>
-            </w:pPr>
-            <w:r>
-              <w:t xml:space="preserve">Widely used frameworks should be utilised from early stages of production creating a stable foundation on which the application is built. Along the lines of development, compatibility testing should be conducted at every </w:t>
+              <w:rPr>
+                <w:sz w:val="24"/>
+                <w:szCs w:val="24"/>
+              </w:rPr>
+            </w:pPr>
+            <w:r>
+              <w:rPr>
+                <w:sz w:val="24"/>
+                <w:szCs w:val="24"/>
+              </w:rPr>
+              <w:t xml:space="preserve">Widely used frameworks should be utilised from early stages of production creating a stable foundation on which the application is built. Along </w:t>
+            </w:r>
+            <w:r>
+              <w:rPr>
+                <w:sz w:val="24"/>
+                <w:szCs w:val="24"/>
+              </w:rPr>
+              <w:lastRenderedPageBreak/>
+              <w:t xml:space="preserve">the lines of development, compatibility testing should be conducted at every </w:t>
             </w:r>
           </w:p>
           <w:p>
@@ -12507,9 +13203,15 @@
               <w:spacing w:line="256" w:lineRule="auto"/>
               <w:rPr>
                 <w:b/>
-              </w:rPr>
-            </w:pPr>
-            <w:r>
+                <w:sz w:val="24"/>
+                <w:szCs w:val="24"/>
+              </w:rPr>
+            </w:pPr>
+            <w:r>
+              <w:rPr>
+                <w:sz w:val="24"/>
+                <w:szCs w:val="24"/>
+              </w:rPr>
               <w:t>significant point. Equally, modular code should be used so that components or features can be updated easily.</w:t>
             </w:r>
           </w:p>
@@ -12534,13 +13236,16 @@
               <w:spacing w:line="256" w:lineRule="auto"/>
               <w:rPr>
                 <w:b/>
-              </w:rPr>
-            </w:pPr>
-            <w:r>
-              <w:rPr>
-                <w:sz w:val="24"/>
-                <w:szCs w:val="24"/>
-              </w:rPr>
+                <w:sz w:val="24"/>
+                <w:szCs w:val="24"/>
+              </w:rPr>
+            </w:pPr>
+            <w:r>
+              <w:rPr>
+                <w:sz w:val="24"/>
+                <w:szCs w:val="24"/>
+              </w:rPr>
+              <w:lastRenderedPageBreak/>
               <w:t xml:space="preserve">Budget Overruns </w:t>
             </w:r>
           </w:p>
@@ -12560,9 +13265,15 @@
               <w:spacing w:line="256" w:lineRule="auto"/>
               <w:rPr>
                 <w:b/>
-              </w:rPr>
-            </w:pPr>
-            <w:r>
+                <w:sz w:val="24"/>
+                <w:szCs w:val="24"/>
+              </w:rPr>
+            </w:pPr>
+            <w:r>
+              <w:rPr>
+                <w:sz w:val="24"/>
+                <w:szCs w:val="24"/>
+              </w:rPr>
               <w:t xml:space="preserve">High  </w:t>
             </w:r>
           </w:p>
@@ -12582,9 +13293,15 @@
               <w:spacing w:line="256" w:lineRule="auto"/>
               <w:rPr>
                 <w:b/>
-              </w:rPr>
-            </w:pPr>
-            <w:r>
+                <w:sz w:val="24"/>
+                <w:szCs w:val="24"/>
+              </w:rPr>
+            </w:pPr>
+            <w:r>
+              <w:rPr>
+                <w:sz w:val="24"/>
+                <w:szCs w:val="24"/>
+              </w:rPr>
               <w:t xml:space="preserve">High </w:t>
             </w:r>
           </w:p>
@@ -12604,9 +13321,15 @@
               <w:spacing w:line="256" w:lineRule="auto"/>
               <w:rPr>
                 <w:b/>
-              </w:rPr>
-            </w:pPr>
-            <w:r>
+                <w:sz w:val="24"/>
+                <w:szCs w:val="24"/>
+              </w:rPr>
+            </w:pPr>
+            <w:r>
+              <w:rPr>
+                <w:sz w:val="24"/>
+                <w:szCs w:val="24"/>
+              </w:rPr>
               <w:t>Core system features should be prioritised and at the same time, emergency funds should be kept for unexpected situations. If the budget is over-run, non-essential features can be sacrificed or postponed.</w:t>
             </w:r>
           </w:p>
@@ -12632,6 +13355,8 @@
               <w:spacing w:line="256" w:lineRule="auto"/>
               <w:rPr>
                 <w:b/>
+                <w:sz w:val="24"/>
+                <w:szCs w:val="24"/>
               </w:rPr>
             </w:pPr>
           </w:p>
@@ -12656,6 +13381,8 @@
               <w:spacing w:line="256" w:lineRule="auto"/>
               <w:rPr>
                 <w:b/>
+                <w:sz w:val="24"/>
+                <w:szCs w:val="24"/>
               </w:rPr>
             </w:pPr>
             <w:r>
@@ -12682,9 +13409,15 @@
               <w:spacing w:line="256" w:lineRule="auto"/>
               <w:rPr>
                 <w:b/>
-              </w:rPr>
-            </w:pPr>
-            <w:r>
+                <w:sz w:val="24"/>
+                <w:szCs w:val="24"/>
+              </w:rPr>
+            </w:pPr>
+            <w:r>
+              <w:rPr>
+                <w:sz w:val="24"/>
+                <w:szCs w:val="24"/>
+              </w:rPr>
               <w:t xml:space="preserve">Moderate </w:t>
             </w:r>
           </w:p>
@@ -12704,9 +13437,15 @@
               <w:spacing w:line="256" w:lineRule="auto"/>
               <w:rPr>
                 <w:b/>
-              </w:rPr>
-            </w:pPr>
-            <w:r>
+                <w:sz w:val="24"/>
+                <w:szCs w:val="24"/>
+              </w:rPr>
+            </w:pPr>
+            <w:r>
+              <w:rPr>
+                <w:sz w:val="24"/>
+                <w:szCs w:val="24"/>
+              </w:rPr>
               <w:t xml:space="preserve">Significant </w:t>
             </w:r>
           </w:p>
@@ -12722,19 +13461,45 @@
             </w:tcBorders>
           </w:tcPr>
           <w:p>
-            <w:r>
+            <w:pPr>
+              <w:rPr>
+                <w:sz w:val="24"/>
+                <w:szCs w:val="24"/>
+              </w:rPr>
+            </w:pPr>
+            <w:r>
+              <w:rPr>
+                <w:sz w:val="24"/>
+                <w:szCs w:val="24"/>
+              </w:rPr>
               <w:t>This failure can be prevented by utilising standard</w:t>
             </w:r>
             <w:r>
+              <w:rPr>
+                <w:sz w:val="24"/>
+                <w:szCs w:val="24"/>
+              </w:rPr>
               <w:t>ised</w:t>
             </w:r>
             <w:r>
+              <w:rPr>
+                <w:sz w:val="24"/>
+                <w:szCs w:val="24"/>
+              </w:rPr>
               <w:t xml:space="preserve"> APIs</w:t>
             </w:r>
             <w:r>
+              <w:rPr>
+                <w:sz w:val="24"/>
+                <w:szCs w:val="24"/>
+              </w:rPr>
               <w:t xml:space="preserve"> with comprehensive documentation</w:t>
             </w:r>
             <w:r>
+              <w:rPr>
+                <w:sz w:val="24"/>
+                <w:szCs w:val="24"/>
+              </w:rPr>
               <w:t xml:space="preserve"> so as to establish a relatively smooth relationship between system components. </w:t>
             </w:r>
           </w:p>
@@ -12743,15 +13508,29 @@
               <w:spacing w:line="256" w:lineRule="auto"/>
               <w:rPr>
                 <w:b/>
-              </w:rPr>
-            </w:pPr>
-            <w:r>
+                <w:sz w:val="24"/>
+                <w:szCs w:val="24"/>
+              </w:rPr>
+            </w:pPr>
+            <w:r>
+              <w:rPr>
+                <w:sz w:val="24"/>
+                <w:szCs w:val="24"/>
+              </w:rPr>
               <w:t>Integration testing must be carried out regularly through</w:t>
             </w:r>
             <w:r>
+              <w:rPr>
+                <w:sz w:val="24"/>
+                <w:szCs w:val="24"/>
+              </w:rPr>
               <w:t xml:space="preserve"> each project</w:t>
             </w:r>
             <w:r>
+              <w:rPr>
+                <w:sz w:val="24"/>
+                <w:szCs w:val="24"/>
+              </w:rPr>
               <w:t xml:space="preserve"> stages of development.</w:t>
             </w:r>
           </w:p>
@@ -12776,6 +13555,8 @@
               <w:spacing w:line="256" w:lineRule="auto"/>
               <w:rPr>
                 <w:b/>
+                <w:sz w:val="24"/>
+                <w:szCs w:val="24"/>
               </w:rPr>
             </w:pPr>
             <w:r>
@@ -12802,9 +13583,15 @@
               <w:spacing w:line="256" w:lineRule="auto"/>
               <w:rPr>
                 <w:b/>
-              </w:rPr>
-            </w:pPr>
-            <w:r>
+                <w:sz w:val="24"/>
+                <w:szCs w:val="24"/>
+              </w:rPr>
+            </w:pPr>
+            <w:r>
+              <w:rPr>
+                <w:sz w:val="24"/>
+                <w:szCs w:val="24"/>
+              </w:rPr>
               <w:t xml:space="preserve">Moderate </w:t>
             </w:r>
           </w:p>
@@ -12824,9 +13611,15 @@
               <w:spacing w:line="256" w:lineRule="auto"/>
               <w:rPr>
                 <w:b/>
-              </w:rPr>
-            </w:pPr>
-            <w:r>
+                <w:sz w:val="24"/>
+                <w:szCs w:val="24"/>
+              </w:rPr>
+            </w:pPr>
+            <w:r>
+              <w:rPr>
+                <w:sz w:val="24"/>
+                <w:szCs w:val="24"/>
+              </w:rPr>
               <w:t xml:space="preserve">Significant </w:t>
             </w:r>
           </w:p>
@@ -12846,10 +13639,16 @@
               <w:spacing w:line="256" w:lineRule="auto"/>
               <w:rPr>
                 <w:rFonts w:eastAsiaTheme="minorHAnsi"/>
+                <w:sz w:val="24"/>
+                <w:szCs w:val="24"/>
                 <w:lang w:eastAsia="en-US"/>
               </w:rPr>
             </w:pPr>
             <w:r>
+              <w:rPr>
+                <w:sz w:val="24"/>
+                <w:szCs w:val="24"/>
+              </w:rPr>
               <w:t xml:space="preserve">Host the system on reliable cloud infrastructure with inbuilt redundancy as well as tools which would help in monitoring the system. </w:t>
             </w:r>
           </w:p>
@@ -12858,6 +13657,8 @@
               <w:spacing w:line="256" w:lineRule="auto"/>
               <w:rPr>
                 <w:b/>
+                <w:sz w:val="24"/>
+                <w:szCs w:val="24"/>
               </w:rPr>
             </w:pPr>
           </w:p>
@@ -12882,14 +13683,15 @@
               <w:spacing w:line="256" w:lineRule="auto"/>
               <w:rPr>
                 <w:b/>
-              </w:rPr>
-            </w:pPr>
-            <w:r>
-              <w:rPr>
-                <w:sz w:val="24"/>
-                <w:szCs w:val="24"/>
-              </w:rPr>
-              <w:lastRenderedPageBreak/>
+                <w:sz w:val="24"/>
+                <w:szCs w:val="24"/>
+              </w:rPr>
+            </w:pPr>
+            <w:r>
+              <w:rPr>
+                <w:sz w:val="24"/>
+                <w:szCs w:val="24"/>
+              </w:rPr>
               <w:t xml:space="preserve">Data Loss or Corruption </w:t>
             </w:r>
           </w:p>
@@ -12909,9 +13711,15 @@
               <w:spacing w:line="256" w:lineRule="auto"/>
               <w:rPr>
                 <w:b/>
-              </w:rPr>
-            </w:pPr>
-            <w:r>
+                <w:sz w:val="24"/>
+                <w:szCs w:val="24"/>
+              </w:rPr>
+            </w:pPr>
+            <w:r>
+              <w:rPr>
+                <w:sz w:val="24"/>
+                <w:szCs w:val="24"/>
+              </w:rPr>
               <w:t xml:space="preserve">Significant </w:t>
             </w:r>
           </w:p>
@@ -12931,9 +13739,15 @@
               <w:spacing w:line="256" w:lineRule="auto"/>
               <w:rPr>
                 <w:b/>
-              </w:rPr>
-            </w:pPr>
-            <w:r>
+                <w:sz w:val="24"/>
+                <w:szCs w:val="24"/>
+              </w:rPr>
+            </w:pPr>
+            <w:r>
+              <w:rPr>
+                <w:sz w:val="24"/>
+                <w:szCs w:val="24"/>
+              </w:rPr>
               <w:t xml:space="preserve">Significant </w:t>
             </w:r>
           </w:p>
@@ -12953,34 +13767,72 @@
               <w:spacing w:line="256" w:lineRule="auto"/>
               <w:rPr>
                 <w:rFonts w:eastAsiaTheme="minorHAnsi"/>
+                <w:sz w:val="24"/>
+                <w:szCs w:val="24"/>
                 <w:lang w:eastAsia="en-US"/>
               </w:rPr>
             </w:pPr>
             <w:r>
+              <w:rPr>
+                <w:sz w:val="24"/>
+                <w:szCs w:val="24"/>
+              </w:rPr>
               <w:t>This can be mitigated through the i</w:t>
             </w:r>
             <w:r>
+              <w:rPr>
+                <w:sz w:val="24"/>
+                <w:szCs w:val="24"/>
+              </w:rPr>
               <w:t>mplementation o</w:t>
             </w:r>
             <w:r>
+              <w:rPr>
+                <w:sz w:val="24"/>
+                <w:szCs w:val="24"/>
+              </w:rPr>
               <w:t>f automated daily</w:t>
             </w:r>
             <w:r>
+              <w:rPr>
+                <w:sz w:val="24"/>
+                <w:szCs w:val="24"/>
+              </w:rPr>
               <w:t xml:space="preserve"> backup</w:t>
             </w:r>
             <w:r>
+              <w:rPr>
+                <w:sz w:val="24"/>
+                <w:szCs w:val="24"/>
+              </w:rPr>
               <w:t>. This</w:t>
             </w:r>
             <w:r>
+              <w:rPr>
+                <w:sz w:val="24"/>
+                <w:szCs w:val="24"/>
+              </w:rPr>
               <w:t xml:space="preserve"> prevent</w:t>
             </w:r>
             <w:r>
+              <w:rPr>
+                <w:sz w:val="24"/>
+                <w:szCs w:val="24"/>
+              </w:rPr>
               <w:t>s</w:t>
             </w:r>
             <w:r>
+              <w:rPr>
+                <w:sz w:val="24"/>
+                <w:szCs w:val="24"/>
+              </w:rPr>
               <w:t xml:space="preserve"> damage in the situation of data loss. Database restriction to unauthorised personnel will also be put in place. </w:t>
             </w:r>
             <w:r>
+              <w:rPr>
+                <w:sz w:val="24"/>
+                <w:szCs w:val="24"/>
+              </w:rPr>
               <w:t>There should also be regular restore testing</w:t>
             </w:r>
           </w:p>
@@ -13005,13 +13857,16 @@
               <w:spacing w:line="256" w:lineRule="auto"/>
               <w:rPr>
                 <w:b/>
-              </w:rPr>
-            </w:pPr>
-            <w:r>
-              <w:rPr>
-                <w:sz w:val="24"/>
-                <w:szCs w:val="24"/>
-              </w:rPr>
+                <w:sz w:val="24"/>
+                <w:szCs w:val="24"/>
+              </w:rPr>
+            </w:pPr>
+            <w:r>
+              <w:rPr>
+                <w:sz w:val="24"/>
+                <w:szCs w:val="24"/>
+              </w:rPr>
+              <w:lastRenderedPageBreak/>
               <w:t xml:space="preserve">Security Breach </w:t>
             </w:r>
           </w:p>
@@ -13031,9 +13886,15 @@
               <w:spacing w:line="256" w:lineRule="auto"/>
               <w:rPr>
                 <w:b/>
-              </w:rPr>
-            </w:pPr>
-            <w:r>
+                <w:sz w:val="24"/>
+                <w:szCs w:val="24"/>
+              </w:rPr>
+            </w:pPr>
+            <w:r>
+              <w:rPr>
+                <w:sz w:val="24"/>
+                <w:szCs w:val="24"/>
+              </w:rPr>
               <w:t xml:space="preserve">High </w:t>
             </w:r>
           </w:p>
@@ -13053,9 +13914,15 @@
               <w:spacing w:line="256" w:lineRule="auto"/>
               <w:rPr>
                 <w:b/>
-              </w:rPr>
-            </w:pPr>
-            <w:r>
+                <w:sz w:val="24"/>
+                <w:szCs w:val="24"/>
+              </w:rPr>
+            </w:pPr>
+            <w:r>
+              <w:rPr>
+                <w:sz w:val="24"/>
+                <w:szCs w:val="24"/>
+              </w:rPr>
               <w:t xml:space="preserve">High </w:t>
             </w:r>
           </w:p>
@@ -13075,16 +13942,30 @@
               <w:spacing w:line="256" w:lineRule="auto"/>
               <w:rPr>
                 <w:rFonts w:eastAsiaTheme="minorHAnsi"/>
+                <w:sz w:val="24"/>
+                <w:szCs w:val="24"/>
                 <w:lang w:eastAsia="en-US"/>
               </w:rPr>
             </w:pPr>
             <w:r>
+              <w:rPr>
+                <w:sz w:val="24"/>
+                <w:szCs w:val="24"/>
+              </w:rPr>
               <w:t>Enforce HTTPS across all pages of the application, Role based access</w:t>
             </w:r>
             <w:r>
+              <w:rPr>
+                <w:sz w:val="24"/>
+                <w:szCs w:val="24"/>
+              </w:rPr>
               <w:t xml:space="preserve"> control</w:t>
             </w:r>
             <w:r>
+              <w:rPr>
+                <w:sz w:val="24"/>
+                <w:szCs w:val="24"/>
+              </w:rPr>
               <w:t xml:space="preserve"> would also be </w:t>
             </w:r>
           </w:p>
@@ -13093,19 +13974,37 @@
               <w:spacing w:line="256" w:lineRule="auto"/>
               <w:rPr>
                 <w:rFonts w:eastAsiaTheme="minorHAnsi"/>
+                <w:sz w:val="24"/>
+                <w:szCs w:val="24"/>
                 <w:lang w:eastAsia="en-US"/>
               </w:rPr>
             </w:pPr>
             <w:r>
+              <w:rPr>
+                <w:sz w:val="24"/>
+                <w:szCs w:val="24"/>
+              </w:rPr>
               <w:t xml:space="preserve">implemented so as to limit the access of </w:t>
             </w:r>
             <w:r>
+              <w:rPr>
+                <w:sz w:val="24"/>
+                <w:szCs w:val="24"/>
+              </w:rPr>
               <w:t>producer</w:t>
             </w:r>
             <w:r>
+              <w:rPr>
+                <w:sz w:val="24"/>
+                <w:szCs w:val="24"/>
+              </w:rPr>
               <w:t xml:space="preserve"> only features to </w:t>
             </w:r>
             <w:r>
+              <w:rPr>
+                <w:sz w:val="24"/>
+                <w:szCs w:val="24"/>
+              </w:rPr>
               <w:t>producers. Regular penetration testing and vulnerability scanning should be carried out as well so as to identify potential weak points with the system.</w:t>
             </w:r>
           </w:p>
@@ -13114,6 +14013,8 @@
               <w:spacing w:line="256" w:lineRule="auto"/>
               <w:rPr>
                 <w:rFonts w:eastAsiaTheme="minorHAnsi"/>
+                <w:sz w:val="24"/>
+                <w:szCs w:val="24"/>
                 <w:lang w:eastAsia="en-US"/>
               </w:rPr>
             </w:pPr>
@@ -13123,6 +14024,8 @@
               <w:spacing w:line="256" w:lineRule="auto"/>
               <w:rPr>
                 <w:b/>
+                <w:sz w:val="24"/>
+                <w:szCs w:val="24"/>
               </w:rPr>
             </w:pPr>
           </w:p>
@@ -13147,6 +14050,8 @@
               <w:spacing w:line="256" w:lineRule="auto"/>
               <w:rPr>
                 <w:b/>
+                <w:sz w:val="24"/>
+                <w:szCs w:val="24"/>
               </w:rPr>
             </w:pPr>
             <w:r>
@@ -13173,9 +14078,15 @@
               <w:spacing w:line="256" w:lineRule="auto"/>
               <w:rPr>
                 <w:b/>
-              </w:rPr>
-            </w:pPr>
-            <w:r>
+                <w:sz w:val="24"/>
+                <w:szCs w:val="24"/>
+              </w:rPr>
+            </w:pPr>
+            <w:r>
+              <w:rPr>
+                <w:sz w:val="24"/>
+                <w:szCs w:val="24"/>
+              </w:rPr>
               <w:t xml:space="preserve">Significant </w:t>
             </w:r>
           </w:p>
@@ -13195,9 +14106,15 @@
               <w:spacing w:line="256" w:lineRule="auto"/>
               <w:rPr>
                 <w:b/>
-              </w:rPr>
-            </w:pPr>
-            <w:r>
+                <w:sz w:val="24"/>
+                <w:szCs w:val="24"/>
+              </w:rPr>
+            </w:pPr>
+            <w:r>
+              <w:rPr>
+                <w:sz w:val="24"/>
+                <w:szCs w:val="24"/>
+              </w:rPr>
               <w:t xml:space="preserve">Significant  </w:t>
             </w:r>
           </w:p>
@@ -13217,13 +14134,23 @@
               <w:spacing w:line="256" w:lineRule="auto"/>
               <w:rPr>
                 <w:rFonts w:eastAsiaTheme="minorHAnsi"/>
+                <w:sz w:val="24"/>
+                <w:szCs w:val="24"/>
                 <w:lang w:eastAsia="en-US"/>
               </w:rPr>
             </w:pPr>
             <w:r>
+              <w:rPr>
+                <w:sz w:val="24"/>
+                <w:szCs w:val="24"/>
+              </w:rPr>
               <w:t>scalable cloud Infrastructure will be used so as to accommodate for increasing web traffic, system optimisation should be carried out regularly so as to account for updating technology, Load testing should also be carried out before deployment so as to Identify bottle necks</w:t>
             </w:r>
             <w:r>
+              <w:rPr>
+                <w:sz w:val="24"/>
+                <w:szCs w:val="24"/>
+              </w:rPr>
               <w:t>.</w:t>
             </w:r>
           </w:p>
@@ -13232,6 +14159,8 @@
               <w:spacing w:line="256" w:lineRule="auto"/>
               <w:rPr>
                 <w:b/>
+                <w:sz w:val="24"/>
+                <w:szCs w:val="24"/>
               </w:rPr>
             </w:pPr>
           </w:p>
@@ -13257,6 +14186,8 @@
               <w:spacing w:line="256" w:lineRule="auto"/>
               <w:rPr>
                 <w:b/>
+                <w:sz w:val="24"/>
+                <w:szCs w:val="24"/>
               </w:rPr>
             </w:pPr>
           </w:p>
@@ -13308,9 +14239,15 @@
               <w:spacing w:line="256" w:lineRule="auto"/>
               <w:rPr>
                 <w:b/>
-              </w:rPr>
-            </w:pPr>
-            <w:r>
+                <w:sz w:val="24"/>
+                <w:szCs w:val="24"/>
+              </w:rPr>
+            </w:pPr>
+            <w:r>
+              <w:rPr>
+                <w:sz w:val="24"/>
+                <w:szCs w:val="24"/>
+              </w:rPr>
               <w:t xml:space="preserve">Significant </w:t>
             </w:r>
           </w:p>
@@ -13330,9 +14267,15 @@
               <w:spacing w:line="256" w:lineRule="auto"/>
               <w:rPr>
                 <w:b/>
-              </w:rPr>
-            </w:pPr>
-            <w:r>
+                <w:sz w:val="24"/>
+                <w:szCs w:val="24"/>
+              </w:rPr>
+            </w:pPr>
+            <w:r>
+              <w:rPr>
+                <w:sz w:val="24"/>
+                <w:szCs w:val="24"/>
+              </w:rPr>
               <w:t xml:space="preserve">Significant  </w:t>
             </w:r>
           </w:p>
@@ -13352,22 +14295,44 @@
               <w:spacing w:line="256" w:lineRule="auto"/>
               <w:rPr>
                 <w:rFonts w:eastAsiaTheme="minorHAnsi"/>
+                <w:sz w:val="24"/>
+                <w:szCs w:val="24"/>
                 <w:lang w:eastAsia="en-US"/>
               </w:rPr>
             </w:pPr>
             <w:r>
+              <w:rPr>
+                <w:sz w:val="24"/>
+                <w:szCs w:val="24"/>
+              </w:rPr>
               <w:t>A</w:t>
             </w:r>
             <w:r>
+              <w:rPr>
+                <w:sz w:val="24"/>
+                <w:szCs w:val="24"/>
+              </w:rPr>
               <w:t xml:space="preserve"> User-centred design paired with a</w:t>
             </w:r>
             <w:r>
+              <w:rPr>
+                <w:sz w:val="24"/>
+                <w:szCs w:val="24"/>
+              </w:rPr>
               <w:t xml:space="preserve"> simple UI </w:t>
             </w:r>
             <w:r>
+              <w:rPr>
+                <w:sz w:val="24"/>
+                <w:szCs w:val="24"/>
+              </w:rPr>
               <w:t>consisting of</w:t>
             </w:r>
             <w:r>
+              <w:rPr>
+                <w:sz w:val="24"/>
+                <w:szCs w:val="24"/>
+              </w:rPr>
               <w:t xml:space="preserve"> clear buttons and navigation tools should be implemented so as to ensure good User experience, FAQ sections should be updated with more commonly asked questions based on data analysis, Accessibility features should be implemented so as to ensure inclusivity. </w:t>
             </w:r>
           </w:p>
@@ -13376,6 +14341,8 @@
               <w:spacing w:line="256" w:lineRule="auto"/>
               <w:rPr>
                 <w:b/>
+                <w:sz w:val="24"/>
+                <w:szCs w:val="24"/>
               </w:rPr>
             </w:pPr>
           </w:p>
@@ -13441,11 +14408,15 @@
               <w:spacing w:line="256" w:lineRule="auto"/>
               <w:rPr>
                 <w:bCs/>
+                <w:sz w:val="24"/>
+                <w:szCs w:val="24"/>
               </w:rPr>
             </w:pPr>
             <w:r>
               <w:rPr>
                 <w:bCs/>
+                <w:sz w:val="24"/>
+                <w:szCs w:val="24"/>
               </w:rPr>
               <w:t xml:space="preserve">Low </w:t>
             </w:r>
@@ -13466,11 +14437,15 @@
               <w:spacing w:line="256" w:lineRule="auto"/>
               <w:rPr>
                 <w:bCs/>
+                <w:sz w:val="24"/>
+                <w:szCs w:val="24"/>
               </w:rPr>
             </w:pPr>
             <w:r>
               <w:rPr>
                 <w:bCs/>
+                <w:sz w:val="24"/>
+                <w:szCs w:val="24"/>
               </w:rPr>
               <w:t>Significant</w:t>
             </w:r>
@@ -13491,30 +14466,40 @@
               <w:spacing w:line="256" w:lineRule="auto"/>
               <w:rPr>
                 <w:bCs/>
+                <w:sz w:val="24"/>
+                <w:szCs w:val="24"/>
               </w:rPr>
             </w:pPr>
             <w:r>
               <w:rPr>
                 <w:bCs/>
-              </w:rPr>
-              <w:t xml:space="preserve">Provide a simple, mobile friendly dashboard which can be easily navigated by producers. Offer </w:t>
+                <w:sz w:val="24"/>
+                <w:szCs w:val="24"/>
+              </w:rPr>
+              <w:t xml:space="preserve">Provide a simple, mobile friendly dashboard which can be easily navigated by producers. Offer training sessions with famers and </w:t>
             </w:r>
             <w:r>
               <w:rPr>
                 <w:bCs/>
+                <w:sz w:val="24"/>
+                <w:szCs w:val="24"/>
               </w:rPr>
               <w:lastRenderedPageBreak/>
-              <w:t xml:space="preserve">training sessions with famers and provide tutorials on features either online or in-person and </w:t>
+              <w:t xml:space="preserve">provide tutorials on features either online or in-person and </w:t>
             </w:r>
             <w:r>
               <w:rPr>
                 <w:bCs/>
+                <w:sz w:val="24"/>
+                <w:szCs w:val="24"/>
               </w:rPr>
               <w:t xml:space="preserve">provide </w:t>
             </w:r>
             <w:r>
               <w:rPr>
                 <w:bCs/>
+                <w:sz w:val="24"/>
+                <w:szCs w:val="24"/>
               </w:rPr>
               <w:t>quick reference guides they can use.</w:t>
             </w:r>
@@ -13568,9 +14553,15 @@
               <w:spacing w:line="256" w:lineRule="auto"/>
               <w:rPr>
                 <w:bCs/>
-              </w:rPr>
-            </w:pPr>
-            <w:r>
+                <w:sz w:val="24"/>
+                <w:szCs w:val="24"/>
+              </w:rPr>
+            </w:pPr>
+            <w:r>
+              <w:rPr>
+                <w:sz w:val="24"/>
+                <w:szCs w:val="24"/>
+              </w:rPr>
               <w:t xml:space="preserve">High </w:t>
             </w:r>
           </w:p>
@@ -13590,9 +14581,15 @@
               <w:spacing w:line="256" w:lineRule="auto"/>
               <w:rPr>
                 <w:bCs/>
-              </w:rPr>
-            </w:pPr>
-            <w:r>
+                <w:sz w:val="24"/>
+                <w:szCs w:val="24"/>
+              </w:rPr>
+            </w:pPr>
+            <w:r>
+              <w:rPr>
+                <w:sz w:val="24"/>
+                <w:szCs w:val="24"/>
+              </w:rPr>
               <w:t xml:space="preserve">Significant </w:t>
             </w:r>
           </w:p>
@@ -13611,9 +14608,19 @@
             <w:pPr>
               <w:spacing w:line="256" w:lineRule="auto"/>
               <w:rPr>
-                <w:b/>
-              </w:rPr>
-            </w:pPr>
+                <w:bCs/>
+                <w:sz w:val="24"/>
+                <w:szCs w:val="24"/>
+              </w:rPr>
+            </w:pPr>
+            <w:r>
+              <w:rPr>
+                <w:bCs/>
+                <w:sz w:val="24"/>
+                <w:szCs w:val="24"/>
+              </w:rPr>
+              <w:t>Proactive customer service with clear communication channels is what must be done in order to mitigate this risk. It serves as a guide and a roadmap which shows GLH’s commitment to improvement. There must also be transparency when dealing with delays or issues. This builds trust and a community bond between producers and customers.</w:t>
+            </w:r>
           </w:p>
         </w:tc>
       </w:tr>
@@ -13663,9 +14670,15 @@
               <w:spacing w:line="256" w:lineRule="auto"/>
               <w:rPr>
                 <w:bCs/>
-              </w:rPr>
-            </w:pPr>
-            <w:r>
+                <w:sz w:val="24"/>
+                <w:szCs w:val="24"/>
+              </w:rPr>
+            </w:pPr>
+            <w:r>
+              <w:rPr>
+                <w:sz w:val="24"/>
+                <w:szCs w:val="24"/>
+              </w:rPr>
               <w:t xml:space="preserve">Moderate </w:t>
             </w:r>
           </w:p>
@@ -13685,9 +14698,15 @@
               <w:spacing w:line="256" w:lineRule="auto"/>
               <w:rPr>
                 <w:bCs/>
-              </w:rPr>
-            </w:pPr>
-            <w:r>
+                <w:sz w:val="24"/>
+                <w:szCs w:val="24"/>
+              </w:rPr>
+            </w:pPr>
+            <w:r>
+              <w:rPr>
+                <w:sz w:val="24"/>
+                <w:szCs w:val="24"/>
+              </w:rPr>
               <w:t xml:space="preserve">Significant </w:t>
             </w:r>
           </w:p>
@@ -13706,9 +14725,19 @@
             <w:pPr>
               <w:spacing w:line="256" w:lineRule="auto"/>
               <w:rPr>
-                <w:b/>
-              </w:rPr>
-            </w:pPr>
+                <w:bCs/>
+                <w:sz w:val="24"/>
+                <w:szCs w:val="24"/>
+              </w:rPr>
+            </w:pPr>
+            <w:r>
+              <w:rPr>
+                <w:bCs/>
+                <w:sz w:val="24"/>
+                <w:szCs w:val="24"/>
+              </w:rPr>
+              <w:t>Engage legal counsel early for GDPR, consumer rights, food safety regulations compliance etc. Cookie consent implementation, clear terms and conditions, privacy policy, and returns/refunds policy should also be made clear. Regular compliance reviews as regulations evolve.</w:t>
+            </w:r>
           </w:p>
         </w:tc>
       </w:tr>
@@ -13758,9 +14787,15 @@
               <w:spacing w:line="256" w:lineRule="auto"/>
               <w:rPr>
                 <w:bCs/>
-              </w:rPr>
-            </w:pPr>
-            <w:r>
+                <w:sz w:val="24"/>
+                <w:szCs w:val="24"/>
+              </w:rPr>
+            </w:pPr>
+            <w:r>
+              <w:rPr>
+                <w:sz w:val="24"/>
+                <w:szCs w:val="24"/>
+              </w:rPr>
               <w:t xml:space="preserve">Significant </w:t>
             </w:r>
           </w:p>
@@ -13780,9 +14815,15 @@
               <w:spacing w:line="256" w:lineRule="auto"/>
               <w:rPr>
                 <w:bCs/>
-              </w:rPr>
-            </w:pPr>
-            <w:r>
+                <w:sz w:val="24"/>
+                <w:szCs w:val="24"/>
+              </w:rPr>
+            </w:pPr>
+            <w:r>
+              <w:rPr>
+                <w:sz w:val="24"/>
+                <w:szCs w:val="24"/>
+              </w:rPr>
               <w:t>Moderate</w:t>
             </w:r>
           </w:p>
@@ -13801,9 +14842,59 @@
             <w:pPr>
               <w:spacing w:line="256" w:lineRule="auto"/>
               <w:rPr>
-                <w:b/>
-              </w:rPr>
-            </w:pPr>
+                <w:bCs/>
+                <w:sz w:val="24"/>
+                <w:szCs w:val="24"/>
+              </w:rPr>
+            </w:pPr>
+            <w:r>
+              <w:rPr>
+                <w:bCs/>
+                <w:sz w:val="24"/>
+                <w:szCs w:val="24"/>
+              </w:rPr>
+              <w:t xml:space="preserve">The key to mitigating this risk is to focus on unique selling points such as Local producer journeys and stories, community demand </w:t>
+            </w:r>
+            <w:r>
+              <w:rPr>
+                <w:bCs/>
+                <w:sz w:val="24"/>
+                <w:szCs w:val="24"/>
+              </w:rPr>
+              <w:t>etc. Build</w:t>
+            </w:r>
+            <w:r>
+              <w:rPr>
+                <w:bCs/>
+                <w:sz w:val="24"/>
+                <w:szCs w:val="24"/>
+              </w:rPr>
+              <w:t xml:space="preserve"> and develop a beneficial customer loyalty program to not only retain </w:t>
+            </w:r>
+            <w:r>
+              <w:rPr>
+                <w:bCs/>
+                <w:sz w:val="24"/>
+                <w:szCs w:val="24"/>
+              </w:rPr>
+              <w:t>loyal</w:t>
+            </w:r>
+            <w:r>
+              <w:rPr>
+                <w:bCs/>
+                <w:sz w:val="24"/>
+                <w:szCs w:val="24"/>
+              </w:rPr>
+              <w:t xml:space="preserve"> customers but to attract new on</w:t>
+            </w:r>
+            <w:r>
+              <w:rPr>
+                <w:bCs/>
+                <w:sz w:val="24"/>
+                <w:szCs w:val="24"/>
+              </w:rPr>
+              <w:t>es.</w:t>
+            </w:r>
           </w:p>
         </w:tc>
       </w:tr>
@@ -13820,7 +14911,7 @@
           <w:szCs w:val="30"/>
         </w:rPr>
       </w:pPr>
-      <w:bookmarkStart w:id="26" w:name="_Toc224032112"/>
+      <w:bookmarkStart w:id="29" w:name="_Toc224299690"/>
       <w:r>
         <w:rPr>
           <w:b/>
@@ -13830,7 +14921,7 @@
         </w:rPr>
         <w:t>Legal Considerations and Regulatory Requirements</w:t>
       </w:r>
-      <w:bookmarkEnd w:id="26"/>
+      <w:bookmarkEnd w:id="29"/>
       <w:r>
         <w:rPr>
           <w:b/>
@@ -13841,6 +14932,458 @@
         <w:t xml:space="preserve"> </w:t>
       </w:r>
     </w:p>
+    <w:tbl>
+      <w:tblPr>
+        <w:tblStyle w:val="TableGrid"/>
+        <w:tblW w:w="0" w:type="auto"/>
+        <w:tblLook w:val="04A0" w:firstRow="1" w:lastRow="0" w:firstColumn="1" w:lastColumn="0" w:noHBand="0" w:noVBand="1"/>
+      </w:tblPr>
+      <w:tblGrid>
+        <w:gridCol w:w="4508"/>
+        <w:gridCol w:w="4508"/>
+      </w:tblGrid>
+      <w:tr>
+        <w:tc>
+          <w:tcPr>
+            <w:tcW w:w="4508" w:type="dxa"/>
+          </w:tcPr>
+          <w:p>
+            <w:pPr>
+              <w:rPr>
+                <w:b/>
+                <w:bCs/>
+                <w:i/>
+                <w:iCs/>
+                <w:sz w:val="24"/>
+                <w:szCs w:val="24"/>
+              </w:rPr>
+            </w:pPr>
+            <w:r>
+              <w:rPr>
+                <w:b/>
+                <w:bCs/>
+                <w:i/>
+                <w:iCs/>
+                <w:sz w:val="24"/>
+                <w:szCs w:val="24"/>
+              </w:rPr>
+              <w:t>Legal Guideline Consideration</w:t>
+            </w:r>
+          </w:p>
+        </w:tc>
+        <w:tc>
+          <w:tcPr>
+            <w:tcW w:w="4508" w:type="dxa"/>
+          </w:tcPr>
+          <w:p>
+            <w:pPr>
+              <w:rPr>
+                <w:b/>
+                <w:bCs/>
+                <w:i/>
+                <w:iCs/>
+                <w:sz w:val="24"/>
+                <w:szCs w:val="24"/>
+              </w:rPr>
+            </w:pPr>
+            <w:r>
+              <w:rPr>
+                <w:b/>
+                <w:bCs/>
+                <w:i/>
+                <w:iCs/>
+                <w:sz w:val="24"/>
+                <w:szCs w:val="24"/>
+              </w:rPr>
+              <w:t xml:space="preserve">Application </w:t>
+            </w:r>
+          </w:p>
+        </w:tc>
+      </w:tr>
+      <w:tr>
+        <w:tc>
+          <w:tcPr>
+            <w:tcW w:w="4508" w:type="dxa"/>
+          </w:tcPr>
+          <w:p>
+            <w:pPr>
+              <w:rPr>
+                <w:sz w:val="24"/>
+                <w:szCs w:val="24"/>
+              </w:rPr>
+            </w:pPr>
+            <w:r>
+              <w:rPr>
+                <w:sz w:val="24"/>
+                <w:szCs w:val="24"/>
+              </w:rPr>
+              <w:t>General Data Protection Regulation (GDPR)</w:t>
+            </w:r>
+          </w:p>
+        </w:tc>
+        <w:tc>
+          <w:tcPr>
+            <w:tcW w:w="4508" w:type="dxa"/>
+          </w:tcPr>
+          <w:p>
+            <w:pPr>
+              <w:rPr>
+                <w:sz w:val="24"/>
+                <w:szCs w:val="24"/>
+              </w:rPr>
+            </w:pPr>
+            <w:r>
+              <w:rPr>
+                <w:sz w:val="24"/>
+                <w:szCs w:val="24"/>
+              </w:rPr>
+              <w:t xml:space="preserve">This focuses on how personal data is processed. </w:t>
+            </w:r>
+            <w:r>
+              <w:rPr>
+                <w:sz w:val="24"/>
+                <w:szCs w:val="24"/>
+              </w:rPr>
+              <w:t xml:space="preserve">To comply with this, Greenfield </w:t>
+            </w:r>
+            <w:r>
+              <w:rPr>
+                <w:sz w:val="24"/>
+                <w:szCs w:val="24"/>
+              </w:rPr>
+              <w:lastRenderedPageBreak/>
+              <w:t xml:space="preserve">Local </w:t>
+            </w:r>
+            <w:r>
+              <w:rPr>
+                <w:sz w:val="24"/>
+                <w:szCs w:val="24"/>
+              </w:rPr>
+              <w:t>Hub must ensure that user consent is obtained before collecting personal data</w:t>
+            </w:r>
+            <w:r>
+              <w:rPr>
+                <w:sz w:val="24"/>
+                <w:szCs w:val="24"/>
+              </w:rPr>
+              <w:t xml:space="preserve"> i.e., via the use of cookie consent banners</w:t>
+            </w:r>
+            <w:r>
+              <w:rPr>
+                <w:sz w:val="24"/>
+                <w:szCs w:val="24"/>
+              </w:rPr>
+              <w:t xml:space="preserve"> and a </w:t>
+            </w:r>
+            <w:r>
+              <w:rPr>
+                <w:b/>
+                <w:bCs/>
+                <w:sz w:val="24"/>
+                <w:szCs w:val="24"/>
+              </w:rPr>
+              <w:t>CLEAR PRIVACY</w:t>
+            </w:r>
+            <w:r>
+              <w:rPr>
+                <w:sz w:val="24"/>
+                <w:szCs w:val="24"/>
+              </w:rPr>
+              <w:t xml:space="preserve"> </w:t>
+            </w:r>
+            <w:r>
+              <w:rPr>
+                <w:b/>
+                <w:bCs/>
+                <w:sz w:val="24"/>
+                <w:szCs w:val="24"/>
+              </w:rPr>
+              <w:t xml:space="preserve">POLICY </w:t>
+            </w:r>
+            <w:r>
+              <w:rPr>
+                <w:sz w:val="24"/>
+                <w:szCs w:val="24"/>
+              </w:rPr>
+              <w:t xml:space="preserve">page is provided which explains how their data is used. They must also ensure that </w:t>
+            </w:r>
+            <w:r>
+              <w:rPr>
+                <w:sz w:val="24"/>
+                <w:szCs w:val="24"/>
+              </w:rPr>
+              <w:t>personal data is stored securely and only for necessary periods as well as inform users on their user rights.</w:t>
+            </w:r>
+          </w:p>
+        </w:tc>
+      </w:tr>
+      <w:tr>
+        <w:tc>
+          <w:tcPr>
+            <w:tcW w:w="4508" w:type="dxa"/>
+          </w:tcPr>
+          <w:p>
+            <w:pPr>
+              <w:rPr>
+                <w:sz w:val="24"/>
+                <w:szCs w:val="24"/>
+              </w:rPr>
+            </w:pPr>
+            <w:r>
+              <w:rPr>
+                <w:sz w:val="24"/>
+                <w:szCs w:val="24"/>
+              </w:rPr>
+              <w:lastRenderedPageBreak/>
+              <w:t>Computer Misuse Act 1990</w:t>
+            </w:r>
+          </w:p>
+        </w:tc>
+        <w:tc>
+          <w:tcPr>
+            <w:tcW w:w="4508" w:type="dxa"/>
+          </w:tcPr>
+          <w:p>
+            <w:pPr>
+              <w:rPr>
+                <w:sz w:val="24"/>
+                <w:szCs w:val="24"/>
+              </w:rPr>
+            </w:pPr>
+            <w:r>
+              <w:rPr>
+                <w:sz w:val="24"/>
+                <w:szCs w:val="24"/>
+              </w:rPr>
+              <w:t xml:space="preserve">This law protects systems from unauthorised access, hacking and cybercrime. To comply with this law, GLH would have to implement security measures which would prevent issues like Unauthorised access, Data theft, System sabotage and misuse etc. </w:t>
+            </w:r>
+            <w:r>
+              <w:rPr>
+                <w:sz w:val="24"/>
+                <w:szCs w:val="24"/>
+              </w:rPr>
+              <w:t>Security</w:t>
+            </w:r>
+            <w:r>
+              <w:rPr>
+                <w:sz w:val="24"/>
+                <w:szCs w:val="24"/>
+              </w:rPr>
+              <w:t xml:space="preserve"> measures such as passwords </w:t>
+            </w:r>
+            <w:r>
+              <w:rPr>
+                <w:sz w:val="24"/>
+                <w:szCs w:val="24"/>
+              </w:rPr>
+              <w:t>hashing, Role-based access and HTTPS encryption can be put in place.</w:t>
+            </w:r>
+          </w:p>
+        </w:tc>
+      </w:tr>
+      <w:tr>
+        <w:tc>
+          <w:tcPr>
+            <w:tcW w:w="4508" w:type="dxa"/>
+          </w:tcPr>
+          <w:p>
+            <w:pPr>
+              <w:rPr>
+                <w:sz w:val="24"/>
+                <w:szCs w:val="24"/>
+              </w:rPr>
+            </w:pPr>
+            <w:r>
+              <w:rPr>
+                <w:sz w:val="24"/>
+                <w:szCs w:val="24"/>
+              </w:rPr>
+              <w:t>Food Safety Act</w:t>
+            </w:r>
+            <w:r>
+              <w:rPr>
+                <w:sz w:val="24"/>
+                <w:szCs w:val="24"/>
+              </w:rPr>
+              <w:t xml:space="preserve"> 1990</w:t>
+            </w:r>
+          </w:p>
+        </w:tc>
+        <w:tc>
+          <w:tcPr>
+            <w:tcW w:w="4508" w:type="dxa"/>
+          </w:tcPr>
+          <w:p>
+            <w:pPr>
+              <w:rPr>
+                <w:sz w:val="24"/>
+                <w:szCs w:val="24"/>
+              </w:rPr>
+            </w:pPr>
+            <w:r>
+              <w:rPr>
+                <w:sz w:val="24"/>
+                <w:szCs w:val="24"/>
+              </w:rPr>
+              <w:t xml:space="preserve">This ensures that food sold to customers is safe to eat and accurately described as advertised. To comply with this regulation, GLH producers must make sure that </w:t>
+            </w:r>
+            <w:r>
+              <w:rPr>
+                <w:b/>
+                <w:bCs/>
+                <w:sz w:val="24"/>
+                <w:szCs w:val="24"/>
+              </w:rPr>
+              <w:t>ALL</w:t>
+            </w:r>
+            <w:r>
+              <w:rPr>
+                <w:sz w:val="24"/>
+                <w:szCs w:val="24"/>
+              </w:rPr>
+              <w:t xml:space="preserve"> food products are safe for consumption, food products which are rotten, spoiled or unfit for human consumption are not distributed, and product descriptions must accurately represent the food being sold </w:t>
+            </w:r>
+          </w:p>
+        </w:tc>
+      </w:tr>
+      <w:tr>
+        <w:tc>
+          <w:tcPr>
+            <w:tcW w:w="4508" w:type="dxa"/>
+          </w:tcPr>
+          <w:p>
+            <w:pPr>
+              <w:rPr>
+                <w:sz w:val="24"/>
+                <w:szCs w:val="24"/>
+              </w:rPr>
+            </w:pPr>
+            <w:r>
+              <w:rPr>
+                <w:sz w:val="24"/>
+                <w:szCs w:val="24"/>
+              </w:rPr>
+              <w:t>Data Protection Act (DPA)2018</w:t>
+            </w:r>
+          </w:p>
+        </w:tc>
+        <w:tc>
+          <w:tcPr>
+            <w:tcW w:w="4508" w:type="dxa"/>
+          </w:tcPr>
+          <w:p>
+            <w:pPr>
+              <w:rPr>
+                <w:sz w:val="24"/>
+                <w:szCs w:val="24"/>
+              </w:rPr>
+            </w:pPr>
+            <w:r>
+              <w:rPr>
+                <w:sz w:val="24"/>
+                <w:szCs w:val="24"/>
+              </w:rPr>
+              <w:t xml:space="preserve">Greenfield Local Hub collects and stores personal information such as Email, Delivery address, Names and so on. To comply with this regulation, GLH must; Only collect data that is necessary for the service, store personal data securely, allow users access, edit or delete their personal information, and most certainly </w:t>
+            </w:r>
+            <w:r>
+              <w:rPr>
+                <w:b/>
+                <w:bCs/>
+                <w:sz w:val="24"/>
+                <w:szCs w:val="24"/>
+              </w:rPr>
+              <w:t>NOT</w:t>
+            </w:r>
+            <w:r>
+              <w:rPr>
+                <w:sz w:val="24"/>
+                <w:szCs w:val="24"/>
+              </w:rPr>
+              <w:t xml:space="preserve"> share personal data with any third parties without consent. Failure to do so results in significant financial penalties </w:t>
+            </w:r>
+            <w:r>
+              <w:rPr>
+                <w:sz w:val="24"/>
+                <w:szCs w:val="24"/>
+              </w:rPr>
+              <w:t>and reputation damage.</w:t>
+            </w:r>
+          </w:p>
+        </w:tc>
+      </w:tr>
+      <w:tr>
+        <w:tc>
+          <w:tcPr>
+            <w:tcW w:w="4508" w:type="dxa"/>
+          </w:tcPr>
+          <w:p>
+            <w:pPr>
+              <w:rPr>
+                <w:sz w:val="24"/>
+                <w:szCs w:val="24"/>
+              </w:rPr>
+            </w:pPr>
+            <w:r>
+              <w:rPr>
+                <w:sz w:val="24"/>
+                <w:szCs w:val="24"/>
+              </w:rPr>
+              <w:t>Equality Act 2010</w:t>
+            </w:r>
+          </w:p>
+        </w:tc>
+        <w:tc>
+          <w:tcPr>
+            <w:tcW w:w="4508" w:type="dxa"/>
+          </w:tcPr>
+          <w:p>
+            <w:pPr>
+              <w:rPr>
+                <w:sz w:val="24"/>
+                <w:szCs w:val="24"/>
+              </w:rPr>
+            </w:pPr>
+            <w:r>
+              <w:rPr>
+                <w:sz w:val="24"/>
+                <w:szCs w:val="24"/>
+              </w:rPr>
+              <w:t xml:space="preserve">This Act ensures that organisations create systems and offers services which are accessible to all and non-discriminatory. GLH’s system must consider users with disabilities and create features which assist them in using the system. Features like adjustable text sizes, Text-to-speech, High </w:t>
+            </w:r>
+            <w:r>
+              <w:rPr>
+                <w:sz w:val="24"/>
+                <w:szCs w:val="24"/>
+              </w:rPr>
+              <w:lastRenderedPageBreak/>
+              <w:t xml:space="preserve">Contrast settings, keyboard navigation etc. All these features align with the </w:t>
+            </w:r>
+            <w:r>
+              <w:rPr>
+                <w:sz w:val="24"/>
+                <w:szCs w:val="24"/>
+              </w:rPr>
+              <w:t>WCAG 2.1 Level AA standards</w:t>
+            </w:r>
+            <w:r>
+              <w:rPr>
+                <w:sz w:val="24"/>
+                <w:szCs w:val="24"/>
+              </w:rPr>
+              <w:t xml:space="preserve"> </w:t>
+            </w:r>
+            <w:r>
+              <w:rPr>
+                <w:sz w:val="24"/>
+                <w:szCs w:val="24"/>
+              </w:rPr>
+              <w:t>ensuring equal access to the platform.</w:t>
+            </w:r>
+          </w:p>
+        </w:tc>
+      </w:tr>
+    </w:tbl>
+    <w:p/>
     <w:p>
       <w:pPr>
         <w:pStyle w:val="Heading1"/>
@@ -13851,7 +15394,7 @@
           <w:szCs w:val="30"/>
         </w:rPr>
       </w:pPr>
-      <w:bookmarkStart w:id="27" w:name="_Toc224032113"/>
+      <w:bookmarkStart w:id="30" w:name="_Toc224299691"/>
       <w:r>
         <w:rPr>
           <w:b/>
@@ -13861,7 +15404,7 @@
         </w:rPr>
         <w:t>UI Considerations</w:t>
       </w:r>
-      <w:bookmarkEnd w:id="27"/>
+      <w:bookmarkEnd w:id="30"/>
       <w:r>
         <w:rPr>
           <w:b/>
@@ -13870,6 +15413,63 @@
           <w:szCs w:val="30"/>
         </w:rPr>
         <w:t xml:space="preserve">  </w:t>
+      </w:r>
+    </w:p>
+    <w:p>
+      <w:pPr>
+        <w:rPr>
+          <w:sz w:val="24"/>
+          <w:szCs w:val="24"/>
+        </w:rPr>
+      </w:pPr>
+      <w:r>
+        <w:rPr>
+          <w:sz w:val="24"/>
+          <w:szCs w:val="24"/>
+        </w:rPr>
+        <w:t xml:space="preserve">The user interface of Greenfield Local Hub (GLH)’s system should be designed to ensure that users from all background, age, technological capability, etc are able to easily navigate the platform and perform tasks like browsing products, placing orders, managing stock etc.  Clear navigation menus and a structured layout should be implemented so that users can have quick access to all available pages e.g., Products &gt;Shopping Cart&gt;Account </w:t>
+      </w:r>
+      <w:r>
+        <w:rPr>
+          <w:sz w:val="24"/>
+          <w:szCs w:val="24"/>
+        </w:rPr>
+        <w:t>Dashboard</w:t>
+      </w:r>
+      <w:r>
+        <w:rPr>
+          <w:sz w:val="24"/>
+          <w:szCs w:val="24"/>
+        </w:rPr>
+        <w:t>&gt;</w:t>
+      </w:r>
+      <w:r>
+        <w:rPr>
+          <w:sz w:val="24"/>
+          <w:szCs w:val="24"/>
+        </w:rPr>
+        <w:t>Loyalty Rewards. The system would also adapt standard UI elements e.g., buttons, forms, drop down menus etc. There should also be a consistent use of fonts, colours, icons and button styles so as to make the system professional looking as well as ensure ease of use since users can easily recognise functions. The interface should include accessibility features so that the platform can be used by a large range of users and it should also adapt a responsive design which would be appealing to users</w:t>
+      </w:r>
+      <w:r>
+        <w:rPr>
+          <w:sz w:val="24"/>
+          <w:szCs w:val="24"/>
+        </w:rPr>
+        <w:t xml:space="preserve">, </w:t>
+      </w:r>
+      <w:r>
+        <w:rPr>
+          <w:sz w:val="24"/>
+          <w:szCs w:val="24"/>
+        </w:rPr>
+        <w:t>easy on the eyes</w:t>
+      </w:r>
+      <w:r>
+        <w:rPr>
+          <w:sz w:val="24"/>
+          <w:szCs w:val="24"/>
+        </w:rPr>
+        <w:t xml:space="preserve"> and adaptable to any device either mobile or desktop.</w:t>
       </w:r>
     </w:p>
     <w:sectPr>
@@ -16370,6 +17970,19 @@
       <w:sz w:val="24"/>
       <w:szCs w:val="24"/>
     </w:rPr>
+  </w:style>
+  <w:style w:type="paragraph" w:styleId="TOC3">
+    <w:name w:val="toc 3"/>
+    <w:basedOn w:val="Normal"/>
+    <w:next w:val="Normal"/>
+    <w:autoRedefine/>
+    <w:uiPriority w:val="39"/>
+    <w:unhideWhenUsed/>
+    <w:rsid w:val="00882349"/>
+    <w:pPr>
+      <w:spacing w:after="100"/>
+      <w:ind w:left="440"/>
+    </w:pPr>
   </w:style>
 </w:styles>
 </file>

</xml_diff>